<commit_message>
docs: add ML evaluation evidence figures to Chapter 5
- Figure 5.2: real terminal output of show_model_results.py (proves the
  accuracy 0.9968 / macro-F1 0.9941 / per-class report / confusion matrix
  come from a genuine held-out evaluation run)
- Figure 5.3: per-class precision/recall/F1 bar chart
- Figure 5.4: confusion-matrix heatmap
All generated from the real ml_data/models/model_meta.json; rebuilt .docx.
</commit_message>
<xml_diff>
--- a/docs/Chapter_5_Result_and_Discussion.docx
+++ b/docs/Chapter_5_Result_and_Discussion.docx
@@ -2,7 +2,7 @@
 <file path=word/document.xml><?xml version="1.0" encoding="utf-8"?>
 <w:document xmlns:w="http://schemas.openxmlformats.org/wordprocessingml/2006/main" xmlns:m="http://schemas.openxmlformats.org/officeDocument/2006/math" xmlns:r="http://schemas.openxmlformats.org/officeDocument/2006/relationships" xmlns:o="urn:schemas-microsoft-com:office:office" xmlns:v="urn:schemas-microsoft-com:vml" xmlns:w10="urn:schemas-microsoft-com:office:word" xmlns:a="http://schemas.openxmlformats.org/drawingml/2006/main" xmlns:pic="http://schemas.openxmlformats.org/drawingml/2006/picture" xmlns:wp="http://schemas.openxmlformats.org/drawingml/2006/wordprocessingDrawing">
   <w:body>
-    <w:bookmarkStart w:id="39" w:name="chapter-5-result-and-discussion"/>
+    <w:bookmarkStart w:id="48" w:name="chapter-5-result-and-discussion"/>
     <w:p>
       <w:pPr>
         <w:pStyle w:val="Heading1"/>
@@ -3184,7 +3184,7 @@
     <w:bookmarkEnd w:id="17"/>
     <w:bookmarkEnd w:id="18"/>
     <w:bookmarkEnd w:id="19"/>
-    <w:bookmarkStart w:id="37" w:name="Xdf8304cc98c46e7ba29fa90a2df6e3c66112698"/>
+    <w:bookmarkStart w:id="46" w:name="Xdf8304cc98c46e7ba29fa90a2df6e3c66112698"/>
     <w:p>
       <w:pPr>
         <w:pStyle w:val="Heading2"/>
@@ -3193,7 +3193,7 @@
         <w:t xml:space="preserve">5.3 System Testing and Discussion</w:t>
       </w:r>
     </w:p>
-    <w:bookmarkStart w:id="34" w:name="Xb0ff592cf76b56e6bfcd93a7bb3d4b0b056114d"/>
+    <w:bookmarkStart w:id="43" w:name="Xb0ff592cf76b56e6bfcd93a7bb3d4b0b056114d"/>
     <w:p>
       <w:pPr>
         <w:pStyle w:val="Heading3"/>
@@ -11639,7 +11639,7 @@
       </w:r>
     </w:p>
     <w:bookmarkEnd w:id="32"/>
-    <w:bookmarkStart w:id="33" w:name="component-14--data-management"/>
+    <w:bookmarkStart w:id="42" w:name="component-14--data-management"/>
     <w:p>
       <w:pPr>
         <w:pStyle w:val="Heading4"/>
@@ -11951,7 +11951,112 @@
         <w:t xml:space="preserve">macro-averaged F1 of 0.9941</w:t>
       </w:r>
       <w:r>
-        <w:t xml:space="preserve">. Table 5.17 gives the per-class report and Table 5.18 the confusion matrix. Only 70 of 21,697 predictions were wrong, and — importantly — every error is a single severity band off (e.g. a Critical predicted as High), never a gross misclassification such as Critical-to-Low.</w:t>
+        <w:t xml:space="preserve">. These figures are produced directly by the project's evaluation script (</w:t>
+      </w:r>
+      <w:r>
+        <w:rPr>
+          <w:rStyle w:val="VerbatimChar"/>
+        </w:rPr>
+        <w:t xml:space="preserve">backend/scripts/show_model_results.py</w:t>
+      </w:r>
+      <w:r>
+        <w:t xml:space="preserve">), which reads the saved model metadata; its output is shown in Figure 5.2 as evidence that the numbers reported in Tables 5.17 and 5.18 come from a genuine evaluation run. Only 70 of 21,697 predictions were wrong, and — importantly — every error is a single severity band off (e.g. a Critical predicted as High), never a gross misclassification such as Critical-to-Low.</w:t>
+      </w:r>
+    </w:p>
+    <w:p>
+      <w:pPr>
+        <w:pStyle w:val="BodyText"/>
+      </w:pPr>
+      <w:r>
+        <w:drawing>
+          <wp:inline>
+            <wp:extent cx="5334000" cy="5627076"/>
+            <wp:effectExtent b="0" l="0" r="0" t="0"/>
+            <wp:docPr descr="Figure 5.2: Model-evaluation script output (real run)" title="" id="34" name="Picture"/>
+            <a:graphic>
+              <a:graphicData uri="http://schemas.openxmlformats.org/drawingml/2006/picture">
+                <pic:pic>
+                  <pic:nvPicPr>
+                    <pic:cNvPr descr="images/ml-eval-terminal.png" id="35" name="Picture"/>
+                    <pic:cNvPicPr>
+                      <a:picLocks noChangeArrowheads="1" noChangeAspect="1"/>
+                    </pic:cNvPicPr>
+                  </pic:nvPicPr>
+                  <pic:blipFill>
+                    <a:blip r:embed="rId33"/>
+                    <a:stretch>
+                      <a:fillRect/>
+                    </a:stretch>
+                  </pic:blipFill>
+                  <pic:spPr bwMode="auto">
+                    <a:xfrm>
+                      <a:off x="0" y="0"/>
+                      <a:ext cx="5334000" cy="5627076"/>
+                    </a:xfrm>
+                    <a:prstGeom prst="rect">
+                      <a:avLst/>
+                    </a:prstGeom>
+                    <a:noFill/>
+                    <a:ln w="9525">
+                      <a:noFill/>
+                      <a:headEnd/>
+                      <a:tailEnd/>
+                    </a:ln>
+                  </pic:spPr>
+                </pic:pic>
+              </a:graphicData>
+            </a:graphic>
+          </wp:inline>
+        </w:drawing>
+      </w:r>
+    </w:p>
+    <w:p>
+      <w:pPr>
+        <w:pStyle w:val="BodyText"/>
+      </w:pPr>
+      <w:r>
+        <w:rPr>
+          <w:b/>
+          <w:bCs/>
+        </w:rPr>
+        <w:t xml:space="preserve">Figure 5.2: Evaluation Script Output —</w:t>
+      </w:r>
+      <w:r>
+        <w:rPr>
+          <w:b/>
+          <w:bCs/>
+        </w:rPr>
+        <w:t xml:space="preserve"> </w:t>
+      </w:r>
+      <w:r>
+        <w:rPr>
+          <w:rStyle w:val="VerbatimChar"/>
+          <w:b/>
+          <w:bCs/>
+        </w:rPr>
+        <w:t xml:space="preserve">show_model_results.py</w:t>
+      </w:r>
+      <w:r>
+        <w:rPr>
+          <w:b/>
+          <w:bCs/>
+        </w:rPr>
+        <w:t xml:space="preserve"> </w:t>
+      </w:r>
+      <w:r>
+        <w:rPr>
+          <w:b/>
+          <w:bCs/>
+        </w:rPr>
+        <w:t xml:space="preserve">(accuracy, macro-F1, per-class report, confusion matrix, and feature importances from the real held-out run)</w:t>
+      </w:r>
+    </w:p>
+    <w:p>
+      <w:pPr>
+        <w:pStyle w:val="BodyText"/>
+      </w:pPr>
+      <w:r>
+        <w:t xml:space="preserve">Table 5.17 gives the per-class report and Figure 5.3 visualises it; Table 5.18 gives the confusion matrix and Figure 5.4 visualises it as a heatmap.</w:t>
       </w:r>
     </w:p>
     <w:tbl>
@@ -12288,354 +12393,51 @@
         <w:t xml:space="preserve">Table 5.17: Random Forest Per-Class Evaluation (held-out NVD data)</w:t>
       </w:r>
     </w:p>
-    <w:tbl>
-      <w:tblPr>
-        <w:tblStyle w:val="Table"/>
-        <w:tblW w:type="auto" w:w="0"/>
-        <w:tblLook w:firstRow="1" w:lastRow="0" w:firstColumn="0" w:lastColumn="0" w:noHBand="0" w:noVBand="0" w:val="0020"/>
-      </w:tblPr>
-      <w:tblGrid>
-        <w:gridCol w:w="1584"/>
-        <w:gridCol w:w="1584"/>
-        <w:gridCol w:w="1584"/>
-        <w:gridCol w:w="1584"/>
-        <w:gridCol w:w="1584"/>
-      </w:tblGrid>
-      <w:tr>
-        <w:trPr>
-          <w:tblHeader w:val="on"/>
-        </w:trPr>
-        <w:tc>
-          <w:tcPr/>
-          <w:p>
-            <w:pPr>
-              <w:pStyle w:val="Compact"/>
-            </w:pPr>
-            <w:r>
-              <w:t xml:space="preserve">Actual ↓ / Predicted →</w:t>
-            </w:r>
-          </w:p>
-        </w:tc>
-        <w:tc>
-          <w:tcPr/>
-          <w:p>
-            <w:pPr>
-              <w:pStyle w:val="Compact"/>
-              <w:jc w:val="center"/>
-            </w:pPr>
-            <w:r>
-              <w:t xml:space="preserve">Low</w:t>
-            </w:r>
-          </w:p>
-        </w:tc>
-        <w:tc>
-          <w:tcPr/>
-          <w:p>
-            <w:pPr>
-              <w:pStyle w:val="Compact"/>
-              <w:jc w:val="center"/>
-            </w:pPr>
-            <w:r>
-              <w:t xml:space="preserve">Medium</w:t>
-            </w:r>
-          </w:p>
-        </w:tc>
-        <w:tc>
-          <w:tcPr/>
-          <w:p>
-            <w:pPr>
-              <w:pStyle w:val="Compact"/>
-              <w:jc w:val="center"/>
-            </w:pPr>
-            <w:r>
-              <w:t xml:space="preserve">High</w:t>
-            </w:r>
-          </w:p>
-        </w:tc>
-        <w:tc>
-          <w:tcPr/>
-          <w:p>
-            <w:pPr>
-              <w:pStyle w:val="Compact"/>
-              <w:jc w:val="center"/>
-            </w:pPr>
-            <w:r>
-              <w:t xml:space="preserve">Critical</w:t>
-            </w:r>
-          </w:p>
-        </w:tc>
-      </w:tr>
-      <w:tr>
-        <w:tc>
-          <w:tcPr/>
-          <w:p>
-            <w:pPr>
-              <w:pStyle w:val="Compact"/>
-            </w:pPr>
-            <w:r>
-              <w:rPr>
-                <w:b/>
-                <w:bCs/>
-              </w:rPr>
-              <w:t xml:space="preserve">Low</w:t>
-            </w:r>
-          </w:p>
-        </w:tc>
-        <w:tc>
-          <w:tcPr/>
-          <w:p>
-            <w:pPr>
-              <w:pStyle w:val="Compact"/>
-              <w:jc w:val="center"/>
-            </w:pPr>
-            <w:r>
-              <w:t xml:space="preserve">956</w:t>
-            </w:r>
-          </w:p>
-        </w:tc>
-        <w:tc>
-          <w:tcPr/>
-          <w:p>
-            <w:pPr>
-              <w:pStyle w:val="Compact"/>
-              <w:jc w:val="center"/>
-            </w:pPr>
-            <w:r>
-              <w:t xml:space="preserve">20</w:t>
-            </w:r>
-          </w:p>
-        </w:tc>
-        <w:tc>
-          <w:tcPr/>
-          <w:p>
-            <w:pPr>
-              <w:pStyle w:val="Compact"/>
-              <w:jc w:val="center"/>
-            </w:pPr>
-            <w:r>
-              <w:t xml:space="preserve">0</w:t>
-            </w:r>
-          </w:p>
-        </w:tc>
-        <w:tc>
-          <w:tcPr/>
-          <w:p>
-            <w:pPr>
-              <w:pStyle w:val="Compact"/>
-              <w:jc w:val="center"/>
-            </w:pPr>
-            <w:r>
-              <w:t xml:space="preserve">0</w:t>
-            </w:r>
-          </w:p>
-        </w:tc>
-      </w:tr>
-      <w:tr>
-        <w:tc>
-          <w:tcPr/>
-          <w:p>
-            <w:pPr>
-              <w:pStyle w:val="Compact"/>
-            </w:pPr>
-            <w:r>
-              <w:rPr>
-                <w:b/>
-                <w:bCs/>
-              </w:rPr>
-              <w:t xml:space="preserve">Medium</w:t>
-            </w:r>
-          </w:p>
-        </w:tc>
-        <w:tc>
-          <w:tcPr/>
-          <w:p>
-            <w:pPr>
-              <w:pStyle w:val="Compact"/>
-              <w:jc w:val="center"/>
-            </w:pPr>
-            <w:r>
-              <w:t xml:space="preserve">6</w:t>
-            </w:r>
-          </w:p>
-        </w:tc>
-        <w:tc>
-          <w:tcPr/>
-          <w:p>
-            <w:pPr>
-              <w:pStyle w:val="Compact"/>
-              <w:jc w:val="center"/>
-            </w:pPr>
-            <w:r>
-              <w:t xml:space="preserve">10,939</w:t>
-            </w:r>
-          </w:p>
-        </w:tc>
-        <w:tc>
-          <w:tcPr/>
-          <w:p>
-            <w:pPr>
-              <w:pStyle w:val="Compact"/>
-              <w:jc w:val="center"/>
-            </w:pPr>
-            <w:r>
-              <w:t xml:space="preserve">7</w:t>
-            </w:r>
-          </w:p>
-        </w:tc>
-        <w:tc>
-          <w:tcPr/>
-          <w:p>
-            <w:pPr>
-              <w:pStyle w:val="Compact"/>
-              <w:jc w:val="center"/>
-            </w:pPr>
-            <w:r>
-              <w:t xml:space="preserve">0</w:t>
-            </w:r>
-          </w:p>
-        </w:tc>
-      </w:tr>
-      <w:tr>
-        <w:tc>
-          <w:tcPr/>
-          <w:p>
-            <w:pPr>
-              <w:pStyle w:val="Compact"/>
-            </w:pPr>
-            <w:r>
-              <w:rPr>
-                <w:b/>
-                <w:bCs/>
-              </w:rPr>
-              <w:t xml:space="preserve">High</w:t>
-            </w:r>
-          </w:p>
-        </w:tc>
-        <w:tc>
-          <w:tcPr/>
-          <w:p>
-            <w:pPr>
-              <w:pStyle w:val="Compact"/>
-              <w:jc w:val="center"/>
-            </w:pPr>
-            <w:r>
-              <w:t xml:space="preserve">0</w:t>
-            </w:r>
-          </w:p>
-        </w:tc>
-        <w:tc>
-          <w:tcPr/>
-          <w:p>
-            <w:pPr>
-              <w:pStyle w:val="Compact"/>
-              <w:jc w:val="center"/>
-            </w:pPr>
-            <w:r>
-              <w:t xml:space="preserve">15</w:t>
-            </w:r>
-          </w:p>
-        </w:tc>
-        <w:tc>
-          <w:tcPr/>
-          <w:p>
-            <w:pPr>
-              <w:pStyle w:val="Compact"/>
-              <w:jc w:val="center"/>
-            </w:pPr>
-            <w:r>
-              <w:t xml:space="preserve">7,614</w:t>
-            </w:r>
-          </w:p>
-        </w:tc>
-        <w:tc>
-          <w:tcPr/>
-          <w:p>
-            <w:pPr>
-              <w:pStyle w:val="Compact"/>
-              <w:jc w:val="center"/>
-            </w:pPr>
-            <w:r>
-              <w:t xml:space="preserve">0</w:t>
-            </w:r>
-          </w:p>
-        </w:tc>
-      </w:tr>
-      <w:tr>
-        <w:tc>
-          <w:tcPr/>
-          <w:p>
-            <w:pPr>
-              <w:pStyle w:val="Compact"/>
-            </w:pPr>
-            <w:r>
-              <w:rPr>
-                <w:b/>
-                <w:bCs/>
-              </w:rPr>
-              <w:t xml:space="preserve">Critical</w:t>
-            </w:r>
-          </w:p>
-        </w:tc>
-        <w:tc>
-          <w:tcPr/>
-          <w:p>
-            <w:pPr>
-              <w:pStyle w:val="Compact"/>
-              <w:jc w:val="center"/>
-            </w:pPr>
-            <w:r>
-              <w:t xml:space="preserve">0</w:t>
-            </w:r>
-          </w:p>
-        </w:tc>
-        <w:tc>
-          <w:tcPr/>
-          <w:p>
-            <w:pPr>
-              <w:pStyle w:val="Compact"/>
-              <w:jc w:val="center"/>
-            </w:pPr>
-            <w:r>
-              <w:t xml:space="preserve">0</w:t>
-            </w:r>
-          </w:p>
-        </w:tc>
-        <w:tc>
-          <w:tcPr/>
-          <w:p>
-            <w:pPr>
-              <w:pStyle w:val="Compact"/>
-              <w:jc w:val="center"/>
-            </w:pPr>
-            <w:r>
-              <w:t xml:space="preserve">22</w:t>
-            </w:r>
-          </w:p>
-        </w:tc>
-        <w:tc>
-          <w:tcPr/>
-          <w:p>
-            <w:pPr>
-              <w:pStyle w:val="Compact"/>
-              <w:jc w:val="center"/>
-            </w:pPr>
-            <w:r>
-              <w:t xml:space="preserve">2,118</w:t>
-            </w:r>
-          </w:p>
-        </w:tc>
-      </w:tr>
-    </w:tbl>
     <w:p>
       <w:pPr>
         <w:pStyle w:val="BodyText"/>
       </w:pPr>
       <w:r>
-        <w:rPr>
-          <w:b/>
-          <w:bCs/>
-        </w:rPr>
-        <w:t xml:space="preserve">Table 5.18: Random Forest Confusion Matrix (21,697 held-out records)</w:t>
+        <w:drawing>
+          <wp:inline>
+            <wp:extent cx="5334000" cy="3196843"/>
+            <wp:effectExtent b="0" l="0" r="0" t="0"/>
+            <wp:docPr descr="Figure 5.3: Per-class precision, recall, and F1" title="" id="37" name="Picture"/>
+            <a:graphic>
+              <a:graphicData uri="http://schemas.openxmlformats.org/drawingml/2006/picture">
+                <pic:pic>
+                  <pic:nvPicPr>
+                    <pic:cNvPr descr="images/ml-per-class.png" id="38" name="Picture"/>
+                    <pic:cNvPicPr>
+                      <a:picLocks noChangeArrowheads="1" noChangeAspect="1"/>
+                    </pic:cNvPicPr>
+                  </pic:nvPicPr>
+                  <pic:blipFill>
+                    <a:blip r:embed="rId36"/>
+                    <a:stretch>
+                      <a:fillRect/>
+                    </a:stretch>
+                  </pic:blipFill>
+                  <pic:spPr bwMode="auto">
+                    <a:xfrm>
+                      <a:off x="0" y="0"/>
+                      <a:ext cx="5334000" cy="3196843"/>
+                    </a:xfrm>
+                    <a:prstGeom prst="rect">
+                      <a:avLst/>
+                    </a:prstGeom>
+                    <a:noFill/>
+                    <a:ln w="9525">
+                      <a:noFill/>
+                      <a:headEnd/>
+                      <a:tailEnd/>
+                    </a:ln>
+                  </pic:spPr>
+                </pic:pic>
+              </a:graphicData>
+            </a:graphic>
+          </wp:inline>
+        </w:drawing>
       </w:r>
     </w:p>
     <w:p>
@@ -12647,91 +12449,7 @@
           <w:b/>
           <w:bCs/>
         </w:rPr>
-        <w:t xml:space="preserve">Confidence Engine benchmark (real).</w:t>
-      </w:r>
-      <w:r>
-        <w:t xml:space="preserve"> </w:t>
-      </w:r>
-      <w:r>
-        <w:t xml:space="preserve">The Confidence Engine was additionally evaluated on a curated benchmark of 32 labelled scenarios (16 true positives, 16 false positives) using the</w:t>
-      </w:r>
-      <w:r>
-        <w:t xml:space="preserve"> </w:t>
-      </w:r>
-      <w:r>
-        <w:rPr>
-          <w:rStyle w:val="VerbatimChar"/>
-        </w:rPr>
-        <w:t xml:space="preserve">evaluate_confidence</w:t>
-      </w:r>
-      <w:r>
-        <w:t xml:space="preserve"> </w:t>
-      </w:r>
-      <w:r>
-        <w:t xml:space="preserve">harness. It achieved a</w:t>
-      </w:r>
-      <w:r>
-        <w:t xml:space="preserve"> </w:t>
-      </w:r>
-      <w:r>
-        <w:rPr>
-          <w:b/>
-          <w:bCs/>
-        </w:rPr>
-        <w:t xml:space="preserve">ROC-AUC of ≈ 0.82</w:t>
-      </w:r>
-      <w:r>
-        <w:t xml:space="preserve">, a</w:t>
-      </w:r>
-      <w:r>
-        <w:t xml:space="preserve"> </w:t>
-      </w:r>
-      <w:r>
-        <w:rPr>
-          <w:b/>
-          <w:bCs/>
-        </w:rPr>
-        <w:t xml:space="preserve">precision of 1.0 for the "Confirmed" classification</w:t>
-      </w:r>
-      <w:r>
-        <w:t xml:space="preserve"> </w:t>
-      </w:r>
-      <w:r>
-        <w:t xml:space="preserve">(it never wrongly confirmed a false positive), and it</w:t>
-      </w:r>
-      <w:r>
-        <w:t xml:space="preserve"> </w:t>
-      </w:r>
-      <w:r>
-        <w:rPr>
-          <w:b/>
-          <w:bCs/>
-        </w:rPr>
-        <w:t xml:space="preserve">auto-dismissed ≈ 81% of the false positives while retaining 75% of the true positives</w:t>
-      </w:r>
-      <w:r>
-        <w:t xml:space="preserve"> </w:t>
-      </w:r>
-      <w:r>
-        <w:t xml:space="preserve">for review.</w:t>
-      </w:r>
-    </w:p>
-    <w:p>
-      <w:pPr>
-        <w:pStyle w:val="BodyText"/>
-      </w:pPr>
-      <w:r>
-        <w:rPr>
-          <w:b/>
-          <w:bCs/>
-        </w:rPr>
-        <w:t xml:space="preserve">Live functional / system verification (real).</w:t>
-      </w:r>
-      <w:r>
-        <w:t xml:space="preserve"> </w:t>
-      </w:r>
-      <w:r>
-        <w:t xml:space="preserve">Beyond the unit level, the entire pipeline was verified end-to-end against a live, deliberately-vulnerable target (a local OWASP Juice Shop). Table 5.19 records the principal functional/system test cases and their outcomes.</w:t>
+        <w:t xml:space="preserve">Figure 5.3: Random Forest Per-Class Precision / Recall / F1 (held-out NVD data)</w:t>
       </w:r>
     </w:p>
     <w:tbl>
@@ -12758,40 +12476,7 @@
               <w:pStyle w:val="Compact"/>
             </w:pPr>
             <w:r>
-              <w:t xml:space="preserve">ID</w:t>
-            </w:r>
-          </w:p>
-        </w:tc>
-        <w:tc>
-          <w:tcPr/>
-          <w:p>
-            <w:pPr>
-              <w:pStyle w:val="Compact"/>
-            </w:pPr>
-            <w:r>
-              <w:t xml:space="preserve">Functional test</w:t>
-            </w:r>
-          </w:p>
-        </w:tc>
-        <w:tc>
-          <w:tcPr/>
-          <w:p>
-            <w:pPr>
-              <w:pStyle w:val="Compact"/>
-            </w:pPr>
-            <w:r>
-              <w:t xml:space="preserve">Expected</w:t>
-            </w:r>
-          </w:p>
-        </w:tc>
-        <w:tc>
-          <w:tcPr/>
-          <w:p>
-            <w:pPr>
-              <w:pStyle w:val="Compact"/>
-            </w:pPr>
-            <w:r>
-              <w:t xml:space="preserve">Actual result</w:t>
+              <w:t xml:space="preserve">Actual ↓ / Predicted →</w:t>
             </w:r>
           </w:p>
         </w:tc>
@@ -12803,53 +12488,7 @@
               <w:jc w:val="center"/>
             </w:pPr>
             <w:r>
-              <w:t xml:space="preserve">Status</w:t>
-            </w:r>
-          </w:p>
-        </w:tc>
-      </w:tr>
-      <w:tr>
-        <w:tc>
-          <w:tcPr/>
-          <w:p>
-            <w:pPr>
-              <w:pStyle w:val="Compact"/>
-            </w:pPr>
-            <w:r>
-              <w:t xml:space="preserve">FT-1</w:t>
-            </w:r>
-          </w:p>
-        </w:tc>
-        <w:tc>
-          <w:tcPr/>
-          <w:p>
-            <w:pPr>
-              <w:pStyle w:val="Compact"/>
-            </w:pPr>
-            <w:r>
-              <w:t xml:space="preserve">Full Auto Scan (ZAP then Nuclei) against Juice Shop</w:t>
-            </w:r>
-          </w:p>
-        </w:tc>
-        <w:tc>
-          <w:tcPr/>
-          <w:p>
-            <w:pPr>
-              <w:pStyle w:val="Compact"/>
-            </w:pPr>
-            <w:r>
-              <w:t xml:space="preserve">Sequential scan, no crash, findings triaged</w:t>
-            </w:r>
-          </w:p>
-        </w:tc>
-        <w:tc>
-          <w:tcPr/>
-          <w:p>
-            <w:pPr>
-              <w:pStyle w:val="Compact"/>
-            </w:pPr>
-            <w:r>
-              <w:t xml:space="preserve">16 findings ingested; no VM crash; guardrails held</w:t>
+              <w:t xml:space="preserve">Low</w:t>
             </w:r>
           </w:p>
         </w:tc>
@@ -12861,53 +12500,7 @@
               <w:jc w:val="center"/>
             </w:pPr>
             <w:r>
-              <w:t xml:space="preserve">Pass</w:t>
-            </w:r>
-          </w:p>
-        </w:tc>
-      </w:tr>
-      <w:tr>
-        <w:tc>
-          <w:tcPr/>
-          <w:p>
-            <w:pPr>
-              <w:pStyle w:val="Compact"/>
-            </w:pPr>
-            <w:r>
-              <w:t xml:space="preserve">FT-2</w:t>
-            </w:r>
-          </w:p>
-        </w:tc>
-        <w:tc>
-          <w:tcPr/>
-          <w:p>
-            <w:pPr>
-              <w:pStyle w:val="Compact"/>
-            </w:pPr>
-            <w:r>
-              <w:t xml:space="preserve">PoC confirmation of the real SQL injection</w:t>
-            </w:r>
-          </w:p>
-        </w:tc>
-        <w:tc>
-          <w:tcPr/>
-          <w:p>
-            <w:pPr>
-              <w:pStyle w:val="Compact"/>
-            </w:pPr>
-            <w:r>
-              <w:t xml:space="preserve">SQLi flips to Confirmed via PoC override</w:t>
-            </w:r>
-          </w:p>
-        </w:tc>
-        <w:tc>
-          <w:tcPr/>
-          <w:p>
-            <w:pPr>
-              <w:pStyle w:val="Compact"/>
-            </w:pPr>
-            <w:r>
-              <w:t xml:space="preserve">0→4 Confirmed incl. SQLi at confidence 81.3</w:t>
+              <w:t xml:space="preserve">Medium</w:t>
             </w:r>
           </w:p>
         </w:tc>
@@ -12919,53 +12512,7 @@
               <w:jc w:val="center"/>
             </w:pPr>
             <w:r>
-              <w:t xml:space="preserve">Pass</w:t>
-            </w:r>
-          </w:p>
-        </w:tc>
-      </w:tr>
-      <w:tr>
-        <w:tc>
-          <w:tcPr/>
-          <w:p>
-            <w:pPr>
-              <w:pStyle w:val="Compact"/>
-            </w:pPr>
-            <w:r>
-              <w:t xml:space="preserve">FT-3</w:t>
-            </w:r>
-          </w:p>
-        </w:tc>
-        <w:tc>
-          <w:tcPr/>
-          <w:p>
-            <w:pPr>
-              <w:pStyle w:val="Compact"/>
-            </w:pPr>
-            <w:r>
-              <w:t xml:space="preserve">CWE mapper coverage on common web alerts</w:t>
-            </w:r>
-          </w:p>
-        </w:tc>
-        <w:tc>
-          <w:tcPr/>
-          <w:p>
-            <w:pPr>
-              <w:pStyle w:val="Compact"/>
-            </w:pPr>
-            <w:r>
-              <w:t xml:space="preserve">Mappable alerts get correct CWEs</w:t>
-            </w:r>
-          </w:p>
-        </w:tc>
-        <w:tc>
-          <w:tcPr/>
-          <w:p>
-            <w:pPr>
-              <w:pStyle w:val="Compact"/>
-            </w:pPr>
-            <w:r>
-              <w:t xml:space="preserve">30/30 mapped (up from 4/30); RCE/cookie regressions fixed</w:t>
+              <w:t xml:space="preserve">High</w:t>
             </w:r>
           </w:p>
         </w:tc>
@@ -12977,53 +12524,24 @@
               <w:jc w:val="center"/>
             </w:pPr>
             <w:r>
-              <w:t xml:space="preserve">Pass</w:t>
-            </w:r>
-          </w:p>
-        </w:tc>
-      </w:tr>
-      <w:tr>
-        <w:tc>
-          <w:tcPr/>
-          <w:p>
-            <w:pPr>
-              <w:pStyle w:val="Compact"/>
-            </w:pPr>
-            <w:r>
-              <w:t xml:space="preserve">FT-4</w:t>
-            </w:r>
-          </w:p>
-        </w:tc>
-        <w:tc>
-          <w:tcPr/>
-          <w:p>
-            <w:pPr>
-              <w:pStyle w:val="Compact"/>
-            </w:pPr>
-            <w:r>
-              <w:t xml:space="preserve">Offline NVD enrichment of a CVE-bearing finding</w:t>
-            </w:r>
-          </w:p>
-        </w:tc>
-        <w:tc>
-          <w:tcPr/>
-          <w:p>
-            <w:pPr>
-              <w:pStyle w:val="Compact"/>
-            </w:pPr>
-            <w:r>
-              <w:t xml:space="preserve">CWE + CVSS filled from local feeds</w:t>
-            </w:r>
-          </w:p>
-        </w:tc>
-        <w:tc>
-          <w:tcPr/>
-          <w:p>
-            <w:pPr>
-              <w:pStyle w:val="Compact"/>
-            </w:pPr>
-            <w:r>
-              <w:t xml:space="preserve">CWE-1188 + full CVSS vector filled offline</w:t>
+              <w:t xml:space="preserve">Critical</w:t>
+            </w:r>
+          </w:p>
+        </w:tc>
+      </w:tr>
+      <w:tr>
+        <w:tc>
+          <w:tcPr/>
+          <w:p>
+            <w:pPr>
+              <w:pStyle w:val="Compact"/>
+            </w:pPr>
+            <w:r>
+              <w:rPr>
+                <w:b/>
+                <w:bCs/>
+              </w:rPr>
+              <w:t xml:space="preserve">Low</w:t>
             </w:r>
           </w:p>
         </w:tc>
@@ -13035,53 +12553,7 @@
               <w:jc w:val="center"/>
             </w:pPr>
             <w:r>
-              <w:t xml:space="preserve">Pass</w:t>
-            </w:r>
-          </w:p>
-        </w:tc>
-      </w:tr>
-      <w:tr>
-        <w:tc>
-          <w:tcPr/>
-          <w:p>
-            <w:pPr>
-              <w:pStyle w:val="Compact"/>
-            </w:pPr>
-            <w:r>
-              <w:t xml:space="preserve">FT-5</w:t>
-            </w:r>
-          </w:p>
-        </w:tc>
-        <w:tc>
-          <w:tcPr/>
-          <w:p>
-            <w:pPr>
-              <w:pStyle w:val="Compact"/>
-            </w:pPr>
-            <w:r>
-              <w:t xml:space="preserve">PDF report generation (with AI-Assisted Analysis)</w:t>
-            </w:r>
-          </w:p>
-        </w:tc>
-        <w:tc>
-          <w:tcPr/>
-          <w:p>
-            <w:pPr>
-              <w:pStyle w:val="Compact"/>
-            </w:pPr>
-            <w:r>
-              <w:t xml:space="preserve">Multi-page report incl. AI section</w:t>
-            </w:r>
-          </w:p>
-        </w:tc>
-        <w:tc>
-          <w:tcPr/>
-          <w:p>
-            <w:pPr>
-              <w:pStyle w:val="Compact"/>
-            </w:pPr>
-            <w:r>
-              <w:t xml:space="preserve">9-page report; AI analysis via live Gemini</w:t>
+              <w:t xml:space="preserve">956</w:t>
             </w:r>
           </w:p>
         </w:tc>
@@ -13093,53 +12565,7 @@
               <w:jc w:val="center"/>
             </w:pPr>
             <w:r>
-              <w:t xml:space="preserve">Pass</w:t>
-            </w:r>
-          </w:p>
-        </w:tc>
-      </w:tr>
-      <w:tr>
-        <w:tc>
-          <w:tcPr/>
-          <w:p>
-            <w:pPr>
-              <w:pStyle w:val="Compact"/>
-            </w:pPr>
-            <w:r>
-              <w:t xml:space="preserve">FT-6</w:t>
-            </w:r>
-          </w:p>
-        </w:tc>
-        <w:tc>
-          <w:tcPr/>
-          <w:p>
-            <w:pPr>
-              <w:pStyle w:val="Compact"/>
-            </w:pPr>
-            <w:r>
-              <w:t xml:space="preserve">Report layout (long URLs / labels; cover boxes)</w:t>
-            </w:r>
-          </w:p>
-        </w:tc>
-        <w:tc>
-          <w:tcPr/>
-          <w:p>
-            <w:pPr>
-              <w:pStyle w:val="Compact"/>
-            </w:pPr>
-            <w:r>
-              <w:t xml:space="preserve">Text wraps; severity boxes contain numbers</w:t>
-            </w:r>
-          </w:p>
-        </w:tc>
-        <w:tc>
-          <w:tcPr/>
-          <w:p>
-            <w:pPr>
-              <w:pStyle w:val="Compact"/>
-            </w:pPr>
-            <w:r>
-              <w:t xml:space="preserve">Cells wrap correctly; boxes fixed</w:t>
+              <w:t xml:space="preserve">20</w:t>
             </w:r>
           </w:p>
         </w:tc>
@@ -13151,7 +12577,214 @@
               <w:jc w:val="center"/>
             </w:pPr>
             <w:r>
-              <w:t xml:space="preserve">Pass</w:t>
+              <w:t xml:space="preserve">0</w:t>
+            </w:r>
+          </w:p>
+        </w:tc>
+        <w:tc>
+          <w:tcPr/>
+          <w:p>
+            <w:pPr>
+              <w:pStyle w:val="Compact"/>
+              <w:jc w:val="center"/>
+            </w:pPr>
+            <w:r>
+              <w:t xml:space="preserve">0</w:t>
+            </w:r>
+          </w:p>
+        </w:tc>
+      </w:tr>
+      <w:tr>
+        <w:tc>
+          <w:tcPr/>
+          <w:p>
+            <w:pPr>
+              <w:pStyle w:val="Compact"/>
+            </w:pPr>
+            <w:r>
+              <w:rPr>
+                <w:b/>
+                <w:bCs/>
+              </w:rPr>
+              <w:t xml:space="preserve">Medium</w:t>
+            </w:r>
+          </w:p>
+        </w:tc>
+        <w:tc>
+          <w:tcPr/>
+          <w:p>
+            <w:pPr>
+              <w:pStyle w:val="Compact"/>
+              <w:jc w:val="center"/>
+            </w:pPr>
+            <w:r>
+              <w:t xml:space="preserve">6</w:t>
+            </w:r>
+          </w:p>
+        </w:tc>
+        <w:tc>
+          <w:tcPr/>
+          <w:p>
+            <w:pPr>
+              <w:pStyle w:val="Compact"/>
+              <w:jc w:val="center"/>
+            </w:pPr>
+            <w:r>
+              <w:t xml:space="preserve">10,939</w:t>
+            </w:r>
+          </w:p>
+        </w:tc>
+        <w:tc>
+          <w:tcPr/>
+          <w:p>
+            <w:pPr>
+              <w:pStyle w:val="Compact"/>
+              <w:jc w:val="center"/>
+            </w:pPr>
+            <w:r>
+              <w:t xml:space="preserve">7</w:t>
+            </w:r>
+          </w:p>
+        </w:tc>
+        <w:tc>
+          <w:tcPr/>
+          <w:p>
+            <w:pPr>
+              <w:pStyle w:val="Compact"/>
+              <w:jc w:val="center"/>
+            </w:pPr>
+            <w:r>
+              <w:t xml:space="preserve">0</w:t>
+            </w:r>
+          </w:p>
+        </w:tc>
+      </w:tr>
+      <w:tr>
+        <w:tc>
+          <w:tcPr/>
+          <w:p>
+            <w:pPr>
+              <w:pStyle w:val="Compact"/>
+            </w:pPr>
+            <w:r>
+              <w:rPr>
+                <w:b/>
+                <w:bCs/>
+              </w:rPr>
+              <w:t xml:space="preserve">High</w:t>
+            </w:r>
+          </w:p>
+        </w:tc>
+        <w:tc>
+          <w:tcPr/>
+          <w:p>
+            <w:pPr>
+              <w:pStyle w:val="Compact"/>
+              <w:jc w:val="center"/>
+            </w:pPr>
+            <w:r>
+              <w:t xml:space="preserve">0</w:t>
+            </w:r>
+          </w:p>
+        </w:tc>
+        <w:tc>
+          <w:tcPr/>
+          <w:p>
+            <w:pPr>
+              <w:pStyle w:val="Compact"/>
+              <w:jc w:val="center"/>
+            </w:pPr>
+            <w:r>
+              <w:t xml:space="preserve">15</w:t>
+            </w:r>
+          </w:p>
+        </w:tc>
+        <w:tc>
+          <w:tcPr/>
+          <w:p>
+            <w:pPr>
+              <w:pStyle w:val="Compact"/>
+              <w:jc w:val="center"/>
+            </w:pPr>
+            <w:r>
+              <w:t xml:space="preserve">7,614</w:t>
+            </w:r>
+          </w:p>
+        </w:tc>
+        <w:tc>
+          <w:tcPr/>
+          <w:p>
+            <w:pPr>
+              <w:pStyle w:val="Compact"/>
+              <w:jc w:val="center"/>
+            </w:pPr>
+            <w:r>
+              <w:t xml:space="preserve">0</w:t>
+            </w:r>
+          </w:p>
+        </w:tc>
+      </w:tr>
+      <w:tr>
+        <w:tc>
+          <w:tcPr/>
+          <w:p>
+            <w:pPr>
+              <w:pStyle w:val="Compact"/>
+            </w:pPr>
+            <w:r>
+              <w:rPr>
+                <w:b/>
+                <w:bCs/>
+              </w:rPr>
+              <w:t xml:space="preserve">Critical</w:t>
+            </w:r>
+          </w:p>
+        </w:tc>
+        <w:tc>
+          <w:tcPr/>
+          <w:p>
+            <w:pPr>
+              <w:pStyle w:val="Compact"/>
+              <w:jc w:val="center"/>
+            </w:pPr>
+            <w:r>
+              <w:t xml:space="preserve">0</w:t>
+            </w:r>
+          </w:p>
+        </w:tc>
+        <w:tc>
+          <w:tcPr/>
+          <w:p>
+            <w:pPr>
+              <w:pStyle w:val="Compact"/>
+              <w:jc w:val="center"/>
+            </w:pPr>
+            <w:r>
+              <w:t xml:space="preserve">0</w:t>
+            </w:r>
+          </w:p>
+        </w:tc>
+        <w:tc>
+          <w:tcPr/>
+          <w:p>
+            <w:pPr>
+              <w:pStyle w:val="Compact"/>
+              <w:jc w:val="center"/>
+            </w:pPr>
+            <w:r>
+              <w:t xml:space="preserve">22</w:t>
+            </w:r>
+          </w:p>
+        </w:tc>
+        <w:tc>
+          <w:tcPr/>
+          <w:p>
+            <w:pPr>
+              <w:pStyle w:val="Compact"/>
+              <w:jc w:val="center"/>
+            </w:pPr>
+            <w:r>
+              <w:t xml:space="preserve">2,118</w:t>
             </w:r>
           </w:p>
         </w:tc>
@@ -13166,12 +12799,602 @@
           <w:b/>
           <w:bCs/>
         </w:rPr>
+        <w:t xml:space="preserve">Table 5.18: Random Forest Confusion Matrix (21,697 held-out records)</w:t>
+      </w:r>
+    </w:p>
+    <w:p>
+      <w:pPr>
+        <w:pStyle w:val="BodyText"/>
+      </w:pPr>
+      <w:r>
+        <w:drawing>
+          <wp:inline>
+            <wp:extent cx="5334000" cy="4455508"/>
+            <wp:effectExtent b="0" l="0" r="0" t="0"/>
+            <wp:docPr descr="Figure 5.4: Confusion matrix heatmap" title="" id="40" name="Picture"/>
+            <a:graphic>
+              <a:graphicData uri="http://schemas.openxmlformats.org/drawingml/2006/picture">
+                <pic:pic>
+                  <pic:nvPicPr>
+                    <pic:cNvPr descr="images/ml-confusion-matrix.png" id="41" name="Picture"/>
+                    <pic:cNvPicPr>
+                      <a:picLocks noChangeArrowheads="1" noChangeAspect="1"/>
+                    </pic:cNvPicPr>
+                  </pic:nvPicPr>
+                  <pic:blipFill>
+                    <a:blip r:embed="rId39"/>
+                    <a:stretch>
+                      <a:fillRect/>
+                    </a:stretch>
+                  </pic:blipFill>
+                  <pic:spPr bwMode="auto">
+                    <a:xfrm>
+                      <a:off x="0" y="0"/>
+                      <a:ext cx="5334000" cy="4455508"/>
+                    </a:xfrm>
+                    <a:prstGeom prst="rect">
+                      <a:avLst/>
+                    </a:prstGeom>
+                    <a:noFill/>
+                    <a:ln w="9525">
+                      <a:noFill/>
+                      <a:headEnd/>
+                      <a:tailEnd/>
+                    </a:ln>
+                  </pic:spPr>
+                </pic:pic>
+              </a:graphicData>
+            </a:graphic>
+          </wp:inline>
+        </w:drawing>
+      </w:r>
+    </w:p>
+    <w:p>
+      <w:pPr>
+        <w:pStyle w:val="BodyText"/>
+      </w:pPr>
+      <w:r>
+        <w:rPr>
+          <w:b/>
+          <w:bCs/>
+        </w:rPr>
+        <w:t xml:space="preserve">Figure 5.4: Random Forest Confusion Matrix Heatmap — the strong diagonal shows nearly all predictions are correct; the few off-diagonal counts are all one severity band away</w:t>
+      </w:r>
+    </w:p>
+    <w:p>
+      <w:pPr>
+        <w:pStyle w:val="BodyText"/>
+      </w:pPr>
+      <w:r>
+        <w:rPr>
+          <w:b/>
+          <w:bCs/>
+        </w:rPr>
+        <w:t xml:space="preserve">Confidence Engine benchmark (real).</w:t>
+      </w:r>
+      <w:r>
+        <w:t xml:space="preserve"> </w:t>
+      </w:r>
+      <w:r>
+        <w:t xml:space="preserve">The Confidence Engine was additionally evaluated on a curated benchmark of 32 labelled scenarios (16 true positives, 16 false positives) using the</w:t>
+      </w:r>
+      <w:r>
+        <w:t xml:space="preserve"> </w:t>
+      </w:r>
+      <w:r>
+        <w:rPr>
+          <w:rStyle w:val="VerbatimChar"/>
+        </w:rPr>
+        <w:t xml:space="preserve">evaluate_confidence</w:t>
+      </w:r>
+      <w:r>
+        <w:t xml:space="preserve"> </w:t>
+      </w:r>
+      <w:r>
+        <w:t xml:space="preserve">harness. It achieved a</w:t>
+      </w:r>
+      <w:r>
+        <w:t xml:space="preserve"> </w:t>
+      </w:r>
+      <w:r>
+        <w:rPr>
+          <w:b/>
+          <w:bCs/>
+        </w:rPr>
+        <w:t xml:space="preserve">ROC-AUC of ≈ 0.82</w:t>
+      </w:r>
+      <w:r>
+        <w:t xml:space="preserve">, a</w:t>
+      </w:r>
+      <w:r>
+        <w:t xml:space="preserve"> </w:t>
+      </w:r>
+      <w:r>
+        <w:rPr>
+          <w:b/>
+          <w:bCs/>
+        </w:rPr>
+        <w:t xml:space="preserve">precision of 1.0 for the "Confirmed" classification</w:t>
+      </w:r>
+      <w:r>
+        <w:t xml:space="preserve"> </w:t>
+      </w:r>
+      <w:r>
+        <w:t xml:space="preserve">(it never wrongly confirmed a false positive), and it</w:t>
+      </w:r>
+      <w:r>
+        <w:t xml:space="preserve"> </w:t>
+      </w:r>
+      <w:r>
+        <w:rPr>
+          <w:b/>
+          <w:bCs/>
+        </w:rPr>
+        <w:t xml:space="preserve">auto-dismissed ≈ 81% of the false positives while retaining 75% of the true positives</w:t>
+      </w:r>
+      <w:r>
+        <w:t xml:space="preserve"> </w:t>
+      </w:r>
+      <w:r>
+        <w:t xml:space="preserve">for review.</w:t>
+      </w:r>
+    </w:p>
+    <w:p>
+      <w:pPr>
+        <w:pStyle w:val="BodyText"/>
+      </w:pPr>
+      <w:r>
+        <w:rPr>
+          <w:b/>
+          <w:bCs/>
+        </w:rPr>
+        <w:t xml:space="preserve">Live functional / system verification (real).</w:t>
+      </w:r>
+      <w:r>
+        <w:t xml:space="preserve"> </w:t>
+      </w:r>
+      <w:r>
+        <w:t xml:space="preserve">Beyond the unit level, the entire pipeline was verified end-to-end against a live, deliberately-vulnerable target (a local OWASP Juice Shop). Table 5.19 records the principal functional/system test cases and their outcomes.</w:t>
+      </w:r>
+    </w:p>
+    <w:tbl>
+      <w:tblPr>
+        <w:tblStyle w:val="Table"/>
+        <w:tblW w:type="auto" w:w="0"/>
+        <w:tblLook w:firstRow="1" w:lastRow="0" w:firstColumn="0" w:lastColumn="0" w:noHBand="0" w:noVBand="0" w:val="0020"/>
+      </w:tblPr>
+      <w:tblGrid>
+        <w:gridCol w:w="1584"/>
+        <w:gridCol w:w="1584"/>
+        <w:gridCol w:w="1584"/>
+        <w:gridCol w:w="1584"/>
+        <w:gridCol w:w="1584"/>
+      </w:tblGrid>
+      <w:tr>
+        <w:trPr>
+          <w:tblHeader w:val="on"/>
+        </w:trPr>
+        <w:tc>
+          <w:tcPr/>
+          <w:p>
+            <w:pPr>
+              <w:pStyle w:val="Compact"/>
+            </w:pPr>
+            <w:r>
+              <w:t xml:space="preserve">ID</w:t>
+            </w:r>
+          </w:p>
+        </w:tc>
+        <w:tc>
+          <w:tcPr/>
+          <w:p>
+            <w:pPr>
+              <w:pStyle w:val="Compact"/>
+            </w:pPr>
+            <w:r>
+              <w:t xml:space="preserve">Functional test</w:t>
+            </w:r>
+          </w:p>
+        </w:tc>
+        <w:tc>
+          <w:tcPr/>
+          <w:p>
+            <w:pPr>
+              <w:pStyle w:val="Compact"/>
+            </w:pPr>
+            <w:r>
+              <w:t xml:space="preserve">Expected</w:t>
+            </w:r>
+          </w:p>
+        </w:tc>
+        <w:tc>
+          <w:tcPr/>
+          <w:p>
+            <w:pPr>
+              <w:pStyle w:val="Compact"/>
+            </w:pPr>
+            <w:r>
+              <w:t xml:space="preserve">Actual result</w:t>
+            </w:r>
+          </w:p>
+        </w:tc>
+        <w:tc>
+          <w:tcPr/>
+          <w:p>
+            <w:pPr>
+              <w:pStyle w:val="Compact"/>
+              <w:jc w:val="center"/>
+            </w:pPr>
+            <w:r>
+              <w:t xml:space="preserve">Status</w:t>
+            </w:r>
+          </w:p>
+        </w:tc>
+      </w:tr>
+      <w:tr>
+        <w:tc>
+          <w:tcPr/>
+          <w:p>
+            <w:pPr>
+              <w:pStyle w:val="Compact"/>
+            </w:pPr>
+            <w:r>
+              <w:t xml:space="preserve">FT-1</w:t>
+            </w:r>
+          </w:p>
+        </w:tc>
+        <w:tc>
+          <w:tcPr/>
+          <w:p>
+            <w:pPr>
+              <w:pStyle w:val="Compact"/>
+            </w:pPr>
+            <w:r>
+              <w:t xml:space="preserve">Full Auto Scan (ZAP then Nuclei) against Juice Shop</w:t>
+            </w:r>
+          </w:p>
+        </w:tc>
+        <w:tc>
+          <w:tcPr/>
+          <w:p>
+            <w:pPr>
+              <w:pStyle w:val="Compact"/>
+            </w:pPr>
+            <w:r>
+              <w:t xml:space="preserve">Sequential scan, no crash, findings triaged</w:t>
+            </w:r>
+          </w:p>
+        </w:tc>
+        <w:tc>
+          <w:tcPr/>
+          <w:p>
+            <w:pPr>
+              <w:pStyle w:val="Compact"/>
+            </w:pPr>
+            <w:r>
+              <w:t xml:space="preserve">16 findings ingested; no VM crash; guardrails held</w:t>
+            </w:r>
+          </w:p>
+        </w:tc>
+        <w:tc>
+          <w:tcPr/>
+          <w:p>
+            <w:pPr>
+              <w:pStyle w:val="Compact"/>
+              <w:jc w:val="center"/>
+            </w:pPr>
+            <w:r>
+              <w:t xml:space="preserve">Pass</w:t>
+            </w:r>
+          </w:p>
+        </w:tc>
+      </w:tr>
+      <w:tr>
+        <w:tc>
+          <w:tcPr/>
+          <w:p>
+            <w:pPr>
+              <w:pStyle w:val="Compact"/>
+            </w:pPr>
+            <w:r>
+              <w:t xml:space="preserve">FT-2</w:t>
+            </w:r>
+          </w:p>
+        </w:tc>
+        <w:tc>
+          <w:tcPr/>
+          <w:p>
+            <w:pPr>
+              <w:pStyle w:val="Compact"/>
+            </w:pPr>
+            <w:r>
+              <w:t xml:space="preserve">PoC confirmation of the real SQL injection</w:t>
+            </w:r>
+          </w:p>
+        </w:tc>
+        <w:tc>
+          <w:tcPr/>
+          <w:p>
+            <w:pPr>
+              <w:pStyle w:val="Compact"/>
+            </w:pPr>
+            <w:r>
+              <w:t xml:space="preserve">SQLi flips to Confirmed via PoC override</w:t>
+            </w:r>
+          </w:p>
+        </w:tc>
+        <w:tc>
+          <w:tcPr/>
+          <w:p>
+            <w:pPr>
+              <w:pStyle w:val="Compact"/>
+            </w:pPr>
+            <w:r>
+              <w:t xml:space="preserve">0→4 Confirmed incl. SQLi at confidence 81.3</w:t>
+            </w:r>
+          </w:p>
+        </w:tc>
+        <w:tc>
+          <w:tcPr/>
+          <w:p>
+            <w:pPr>
+              <w:pStyle w:val="Compact"/>
+              <w:jc w:val="center"/>
+            </w:pPr>
+            <w:r>
+              <w:t xml:space="preserve">Pass</w:t>
+            </w:r>
+          </w:p>
+        </w:tc>
+      </w:tr>
+      <w:tr>
+        <w:tc>
+          <w:tcPr/>
+          <w:p>
+            <w:pPr>
+              <w:pStyle w:val="Compact"/>
+            </w:pPr>
+            <w:r>
+              <w:t xml:space="preserve">FT-3</w:t>
+            </w:r>
+          </w:p>
+        </w:tc>
+        <w:tc>
+          <w:tcPr/>
+          <w:p>
+            <w:pPr>
+              <w:pStyle w:val="Compact"/>
+            </w:pPr>
+            <w:r>
+              <w:t xml:space="preserve">CWE mapper coverage on common web alerts</w:t>
+            </w:r>
+          </w:p>
+        </w:tc>
+        <w:tc>
+          <w:tcPr/>
+          <w:p>
+            <w:pPr>
+              <w:pStyle w:val="Compact"/>
+            </w:pPr>
+            <w:r>
+              <w:t xml:space="preserve">Mappable alerts get correct CWEs</w:t>
+            </w:r>
+          </w:p>
+        </w:tc>
+        <w:tc>
+          <w:tcPr/>
+          <w:p>
+            <w:pPr>
+              <w:pStyle w:val="Compact"/>
+            </w:pPr>
+            <w:r>
+              <w:t xml:space="preserve">30/30 mapped (up from 4/30); RCE/cookie regressions fixed</w:t>
+            </w:r>
+          </w:p>
+        </w:tc>
+        <w:tc>
+          <w:tcPr/>
+          <w:p>
+            <w:pPr>
+              <w:pStyle w:val="Compact"/>
+              <w:jc w:val="center"/>
+            </w:pPr>
+            <w:r>
+              <w:t xml:space="preserve">Pass</w:t>
+            </w:r>
+          </w:p>
+        </w:tc>
+      </w:tr>
+      <w:tr>
+        <w:tc>
+          <w:tcPr/>
+          <w:p>
+            <w:pPr>
+              <w:pStyle w:val="Compact"/>
+            </w:pPr>
+            <w:r>
+              <w:t xml:space="preserve">FT-4</w:t>
+            </w:r>
+          </w:p>
+        </w:tc>
+        <w:tc>
+          <w:tcPr/>
+          <w:p>
+            <w:pPr>
+              <w:pStyle w:val="Compact"/>
+            </w:pPr>
+            <w:r>
+              <w:t xml:space="preserve">Offline NVD enrichment of a CVE-bearing finding</w:t>
+            </w:r>
+          </w:p>
+        </w:tc>
+        <w:tc>
+          <w:tcPr/>
+          <w:p>
+            <w:pPr>
+              <w:pStyle w:val="Compact"/>
+            </w:pPr>
+            <w:r>
+              <w:t xml:space="preserve">CWE + CVSS filled from local feeds</w:t>
+            </w:r>
+          </w:p>
+        </w:tc>
+        <w:tc>
+          <w:tcPr/>
+          <w:p>
+            <w:pPr>
+              <w:pStyle w:val="Compact"/>
+            </w:pPr>
+            <w:r>
+              <w:t xml:space="preserve">CWE-1188 + full CVSS vector filled offline</w:t>
+            </w:r>
+          </w:p>
+        </w:tc>
+        <w:tc>
+          <w:tcPr/>
+          <w:p>
+            <w:pPr>
+              <w:pStyle w:val="Compact"/>
+              <w:jc w:val="center"/>
+            </w:pPr>
+            <w:r>
+              <w:t xml:space="preserve">Pass</w:t>
+            </w:r>
+          </w:p>
+        </w:tc>
+      </w:tr>
+      <w:tr>
+        <w:tc>
+          <w:tcPr/>
+          <w:p>
+            <w:pPr>
+              <w:pStyle w:val="Compact"/>
+            </w:pPr>
+            <w:r>
+              <w:t xml:space="preserve">FT-5</w:t>
+            </w:r>
+          </w:p>
+        </w:tc>
+        <w:tc>
+          <w:tcPr/>
+          <w:p>
+            <w:pPr>
+              <w:pStyle w:val="Compact"/>
+            </w:pPr>
+            <w:r>
+              <w:t xml:space="preserve">PDF report generation (with AI-Assisted Analysis)</w:t>
+            </w:r>
+          </w:p>
+        </w:tc>
+        <w:tc>
+          <w:tcPr/>
+          <w:p>
+            <w:pPr>
+              <w:pStyle w:val="Compact"/>
+            </w:pPr>
+            <w:r>
+              <w:t xml:space="preserve">Multi-page report incl. AI section</w:t>
+            </w:r>
+          </w:p>
+        </w:tc>
+        <w:tc>
+          <w:tcPr/>
+          <w:p>
+            <w:pPr>
+              <w:pStyle w:val="Compact"/>
+            </w:pPr>
+            <w:r>
+              <w:t xml:space="preserve">9-page report; AI analysis via live Gemini</w:t>
+            </w:r>
+          </w:p>
+        </w:tc>
+        <w:tc>
+          <w:tcPr/>
+          <w:p>
+            <w:pPr>
+              <w:pStyle w:val="Compact"/>
+              <w:jc w:val="center"/>
+            </w:pPr>
+            <w:r>
+              <w:t xml:space="preserve">Pass</w:t>
+            </w:r>
+          </w:p>
+        </w:tc>
+      </w:tr>
+      <w:tr>
+        <w:tc>
+          <w:tcPr/>
+          <w:p>
+            <w:pPr>
+              <w:pStyle w:val="Compact"/>
+            </w:pPr>
+            <w:r>
+              <w:t xml:space="preserve">FT-6</w:t>
+            </w:r>
+          </w:p>
+        </w:tc>
+        <w:tc>
+          <w:tcPr/>
+          <w:p>
+            <w:pPr>
+              <w:pStyle w:val="Compact"/>
+            </w:pPr>
+            <w:r>
+              <w:t xml:space="preserve">Report layout (long URLs / labels; cover boxes)</w:t>
+            </w:r>
+          </w:p>
+        </w:tc>
+        <w:tc>
+          <w:tcPr/>
+          <w:p>
+            <w:pPr>
+              <w:pStyle w:val="Compact"/>
+            </w:pPr>
+            <w:r>
+              <w:t xml:space="preserve">Text wraps; severity boxes contain numbers</w:t>
+            </w:r>
+          </w:p>
+        </w:tc>
+        <w:tc>
+          <w:tcPr/>
+          <w:p>
+            <w:pPr>
+              <w:pStyle w:val="Compact"/>
+            </w:pPr>
+            <w:r>
+              <w:t xml:space="preserve">Cells wrap correctly; boxes fixed</w:t>
+            </w:r>
+          </w:p>
+        </w:tc>
+        <w:tc>
+          <w:tcPr/>
+          <w:p>
+            <w:pPr>
+              <w:pStyle w:val="Compact"/>
+              <w:jc w:val="center"/>
+            </w:pPr>
+            <w:r>
+              <w:t xml:space="preserve">Pass</w:t>
+            </w:r>
+          </w:p>
+        </w:tc>
+      </w:tr>
+    </w:tbl>
+    <w:p>
+      <w:pPr>
+        <w:pStyle w:val="BodyText"/>
+      </w:pPr>
+      <w:r>
+        <w:rPr>
+          <w:b/>
+          <w:bCs/>
+        </w:rPr>
         <w:t xml:space="preserve">Table 5.19: Live Functional / System Verification Results</w:t>
       </w:r>
     </w:p>
-    <w:bookmarkEnd w:id="33"/>
-    <w:bookmarkEnd w:id="34"/>
-    <w:bookmarkStart w:id="35" w:name="X2103990b22303365d04026752791bacc2d669c8"/>
+    <w:bookmarkEnd w:id="42"/>
+    <w:bookmarkEnd w:id="43"/>
+    <w:bookmarkStart w:id="44" w:name="X2103990b22303365d04026752791bacc2d669c8"/>
     <w:p>
       <w:pPr>
         <w:pStyle w:val="Heading3"/>
@@ -14068,8 +14291,8 @@
         <w:t xml:space="preserve">Table 5.23: UAT Acceptance Summary (to be completed)</w:t>
       </w:r>
     </w:p>
-    <w:bookmarkEnd w:id="35"/>
-    <w:bookmarkStart w:id="36" w:name="Xdf6580e43cd4db41cb4f0594ac1084bceb4f354"/>
+    <w:bookmarkEnd w:id="44"/>
+    <w:bookmarkStart w:id="45" w:name="Xdf6580e43cd4db41cb4f0594ac1084bceb4f354"/>
     <w:p>
       <w:pPr>
         <w:pStyle w:val="Heading3"/>
@@ -14155,9 +14378,9 @@
         </w:pict>
       </w:r>
     </w:p>
-    <w:bookmarkEnd w:id="36"/>
-    <w:bookmarkEnd w:id="37"/>
-    <w:bookmarkStart w:id="38" w:name="X32768a294109eb22590a37edaae685c4b9e19bc"/>
+    <w:bookmarkEnd w:id="45"/>
+    <w:bookmarkEnd w:id="46"/>
+    <w:bookmarkStart w:id="47" w:name="X32768a294109eb22590a37edaae685c4b9e19bc"/>
     <w:p>
       <w:pPr>
         <w:pStyle w:val="Heading2"/>
@@ -14275,8 +14498,8 @@
         <w:t xml:space="preserve">Together the two techniques address both correctness and acceptance: the white-box results demonstrate that every component computes trustworthy, evidence-backed output, while the user acceptance testing establishes that the intended users can operate the system and accept it in practice. The following chapter concludes the project, reflecting on the objectives, the limitations noted above, and directions for future work.</w:t>
       </w:r>
     </w:p>
-    <w:bookmarkEnd w:id="38"/>
-    <w:bookmarkEnd w:id="39"/>
+    <w:bookmarkEnd w:id="47"/>
+    <w:bookmarkEnd w:id="48"/>
     <w:sectPr>
       <w:footnotePr>
         <w:numRestart w:val="eachSect"/>

</xml_diff>

<commit_message>
docs: add Confidence Engine benchmark evidence figures to Chapter 5
- Figure 5.5: real terminal output of evaluate_confidence.py (ROC-AUC 0.822,
  score separation, 'Confirmed' precision 1.0, operational triage, threshold
  sweep, weight sensitivity)
- Figure 5.6: ROC curve (AUC = 0.822)
- Figure 5.7: TP/FP confidence-score separation plot (means 61.6 vs 32.0)
Expanded the benchmark paragraph with the real operational-triage numbers.
All computed from the live ConfidenceEngine over the labelled benchmark; rebuilt .docx.
</commit_message>
<xml_diff>
--- a/docs/Chapter_5_Result_and_Discussion.docx
+++ b/docs/Chapter_5_Result_and_Discussion.docx
@@ -2,7 +2,7 @@
 <file path=word/document.xml><?xml version="1.0" encoding="utf-8"?>
 <w:document xmlns:w="http://schemas.openxmlformats.org/wordprocessingml/2006/main" xmlns:m="http://schemas.openxmlformats.org/officeDocument/2006/math" xmlns:r="http://schemas.openxmlformats.org/officeDocument/2006/relationships" xmlns:o="urn:schemas-microsoft-com:office:office" xmlns:v="urn:schemas-microsoft-com:vml" xmlns:w10="urn:schemas-microsoft-com:office:word" xmlns:a="http://schemas.openxmlformats.org/drawingml/2006/main" xmlns:pic="http://schemas.openxmlformats.org/drawingml/2006/picture" xmlns:wp="http://schemas.openxmlformats.org/drawingml/2006/wordprocessingDrawing">
   <w:body>
-    <w:bookmarkStart w:id="48" w:name="chapter-5-result-and-discussion"/>
+    <w:bookmarkStart w:id="57" w:name="chapter-5-result-and-discussion"/>
     <w:p>
       <w:pPr>
         <w:pStyle w:val="Heading1"/>
@@ -3184,7 +3184,7 @@
     <w:bookmarkEnd w:id="17"/>
     <w:bookmarkEnd w:id="18"/>
     <w:bookmarkEnd w:id="19"/>
-    <w:bookmarkStart w:id="46" w:name="Xdf8304cc98c46e7ba29fa90a2df6e3c66112698"/>
+    <w:bookmarkStart w:id="55" w:name="Xdf8304cc98c46e7ba29fa90a2df6e3c66112698"/>
     <w:p>
       <w:pPr>
         <w:pStyle w:val="Heading2"/>
@@ -3193,7 +3193,7 @@
         <w:t xml:space="preserve">5.3 System Testing and Discussion</w:t>
       </w:r>
     </w:p>
-    <w:bookmarkStart w:id="43" w:name="Xb0ff592cf76b56e6bfcd93a7bb3d4b0b056114d"/>
+    <w:bookmarkStart w:id="52" w:name="Xb0ff592cf76b56e6bfcd93a7bb3d4b0b056114d"/>
     <w:p>
       <w:pPr>
         <w:pStyle w:val="Heading3"/>
@@ -11639,7 +11639,7 @@
       </w:r>
     </w:p>
     <w:bookmarkEnd w:id="32"/>
-    <w:bookmarkStart w:id="42" w:name="component-14--data-management"/>
+    <w:bookmarkStart w:id="51" w:name="component-14--data-management"/>
     <w:p>
       <w:pPr>
         <w:pStyle w:val="Heading4"/>
@@ -12885,13 +12885,13 @@
         <w:rPr>
           <w:rStyle w:val="VerbatimChar"/>
         </w:rPr>
-        <w:t xml:space="preserve">evaluate_confidence</w:t>
+        <w:t xml:space="preserve">backend/scripts/evaluate_confidence.py</w:t>
       </w:r>
       <w:r>
         <w:t xml:space="preserve"> </w:t>
       </w:r>
       <w:r>
-        <w:t xml:space="preserve">harness. It achieved a</w:t>
+        <w:t xml:space="preserve">harness. Its console report is shown in Figure 5.5 as evidence that the figures below come from a genuine evaluation run. The engine achieved a</w:t>
       </w:r>
       <w:r>
         <w:t xml:space="preserve"> </w:t>
@@ -12901,10 +12901,13 @@
           <w:b/>
           <w:bCs/>
         </w:rPr>
-        <w:t xml:space="preserve">ROC-AUC of ≈ 0.82</w:t>
-      </w:r>
-      <w:r>
-        <w:t xml:space="preserve">, a</w:t>
+        <w:t xml:space="preserve">ROC-AUC of 0.822</w:t>
+      </w:r>
+      <w:r>
+        <w:t xml:space="preserve"> </w:t>
+      </w:r>
+      <w:r>
+        <w:t xml:space="preserve">(Figure 5.6), driven by a clear separation between the true-positive and false-positive scores — a mean of</w:t>
       </w:r>
       <w:r>
         <w:t xml:space="preserve"> </w:t>
@@ -12914,13 +12917,13 @@
           <w:b/>
           <w:bCs/>
         </w:rPr>
-        <w:t xml:space="preserve">precision of 1.0 for the "Confirmed" classification</w:t>
+        <w:t xml:space="preserve">61.6</w:t>
       </w:r>
       <w:r>
         <w:t xml:space="preserve"> </w:t>
       </w:r>
       <w:r>
-        <w:t xml:space="preserve">(it never wrongly confirmed a false positive), and it</w:t>
+        <w:t xml:space="preserve">for true positives versus</w:t>
       </w:r>
       <w:r>
         <w:t xml:space="preserve"> </w:t>
@@ -12930,13 +12933,267 @@
           <w:b/>
           <w:bCs/>
         </w:rPr>
-        <w:t xml:space="preserve">auto-dismissed ≈ 81% of the false positives while retaining 75% of the true positives</w:t>
+        <w:t xml:space="preserve">32.0</w:t>
       </w:r>
       <w:r>
         <w:t xml:space="preserve"> </w:t>
       </w:r>
       <w:r>
-        <w:t xml:space="preserve">for review.</w:t>
+        <w:t xml:space="preserve">for false positives (Figure 5.7). Treated as a true-positive detector, the "Confirmed" band (score ≥ 70) achieves a</w:t>
+      </w:r>
+      <w:r>
+        <w:t xml:space="preserve"> </w:t>
+      </w:r>
+      <w:r>
+        <w:rPr>
+          <w:b/>
+          <w:bCs/>
+        </w:rPr>
+        <w:t xml:space="preserve">precision of 1.0</w:t>
+      </w:r>
+      <w:r>
+        <w:t xml:space="preserve"> </w:t>
+      </w:r>
+      <w:r>
+        <w:t xml:space="preserve">— it never wrongly confirmed a false positive — and auto-dismissing the "Not Confirmed" band (score &lt; 40)</w:t>
+      </w:r>
+      <w:r>
+        <w:t xml:space="preserve"> </w:t>
+      </w:r>
+      <w:r>
+        <w:rPr>
+          <w:b/>
+          <w:bCs/>
+        </w:rPr>
+        <w:t xml:space="preserve">suppresses 81.2% of the false positives while retaining 75.0% of the true positives</w:t>
+      </w:r>
+      <w:r>
+        <w:t xml:space="preserve"> </w:t>
+      </w:r>
+      <w:r>
+        <w:t xml:space="preserve">for review, reducing the analyst's workload by 53.1%. This demonstrates the engine's core purpose: suppressing scanner noise without discarding real vulnerabilities. (As stated in the harness header, this is a</w:t>
+      </w:r>
+      <w:r>
+        <w:t xml:space="preserve"> </w:t>
+      </w:r>
+      <w:r>
+        <w:rPr>
+          <w:i/>
+          <w:iCs/>
+        </w:rPr>
+        <w:t xml:space="preserve">curated synthetic</w:t>
+      </w:r>
+      <w:r>
+        <w:t xml:space="preserve"> </w:t>
+      </w:r>
+      <w:r>
+        <w:t xml:space="preserve">benchmark, not field-validated data.)</w:t>
+      </w:r>
+    </w:p>
+    <w:p>
+      <w:pPr>
+        <w:pStyle w:val="BodyText"/>
+      </w:pPr>
+      <w:r>
+        <w:drawing>
+          <wp:inline>
+            <wp:extent cx="5334000" cy="4057961"/>
+            <wp:effectExtent b="0" l="0" r="0" t="0"/>
+            <wp:docPr descr="Figure 5.5: Confidence-engine evaluation script output (real run)" title="" id="43" name="Picture"/>
+            <a:graphic>
+              <a:graphicData uri="http://schemas.openxmlformats.org/drawingml/2006/picture">
+                <pic:pic>
+                  <pic:nvPicPr>
+                    <pic:cNvPr descr="images/conf-eval-terminal.png" id="44" name="Picture"/>
+                    <pic:cNvPicPr>
+                      <a:picLocks noChangeArrowheads="1" noChangeAspect="1"/>
+                    </pic:cNvPicPr>
+                  </pic:nvPicPr>
+                  <pic:blipFill>
+                    <a:blip r:embed="rId42"/>
+                    <a:stretch>
+                      <a:fillRect/>
+                    </a:stretch>
+                  </pic:blipFill>
+                  <pic:spPr bwMode="auto">
+                    <a:xfrm>
+                      <a:off x="0" y="0"/>
+                      <a:ext cx="5334000" cy="4057961"/>
+                    </a:xfrm>
+                    <a:prstGeom prst="rect">
+                      <a:avLst/>
+                    </a:prstGeom>
+                    <a:noFill/>
+                    <a:ln w="9525">
+                      <a:noFill/>
+                      <a:headEnd/>
+                      <a:tailEnd/>
+                    </a:ln>
+                  </pic:spPr>
+                </pic:pic>
+              </a:graphicData>
+            </a:graphic>
+          </wp:inline>
+        </w:drawing>
+      </w:r>
+    </w:p>
+    <w:p>
+      <w:pPr>
+        <w:pStyle w:val="BodyText"/>
+      </w:pPr>
+      <w:r>
+        <w:rPr>
+          <w:b/>
+          <w:bCs/>
+        </w:rPr>
+        <w:t xml:space="preserve">Figure 5.5: Evaluation Script Output —</w:t>
+      </w:r>
+      <w:r>
+        <w:rPr>
+          <w:b/>
+          <w:bCs/>
+        </w:rPr>
+        <w:t xml:space="preserve"> </w:t>
+      </w:r>
+      <w:r>
+        <w:rPr>
+          <w:rStyle w:val="VerbatimChar"/>
+          <w:b/>
+          <w:bCs/>
+        </w:rPr>
+        <w:t xml:space="preserve">evaluate_confidence.py</w:t>
+      </w:r>
+      <w:r>
+        <w:rPr>
+          <w:b/>
+          <w:bCs/>
+        </w:rPr>
+        <w:t xml:space="preserve"> </w:t>
+      </w:r>
+      <w:r>
+        <w:rPr>
+          <w:b/>
+          <w:bCs/>
+        </w:rPr>
+        <w:t xml:space="preserve">(ROC-AUC, score separation, 'Confirmed' precision, operational triage, threshold sweep, and weight-sensitivity analysis from the real benchmark run)</w:t>
+      </w:r>
+    </w:p>
+    <w:p>
+      <w:pPr>
+        <w:pStyle w:val="BodyText"/>
+      </w:pPr>
+      <w:r>
+        <w:drawing>
+          <wp:inline>
+            <wp:extent cx="5334000" cy="4795166"/>
+            <wp:effectExtent b="0" l="0" r="0" t="0"/>
+            <wp:docPr descr="Figure 5.6: Confidence-engine ROC curve" title="" id="46" name="Picture"/>
+            <a:graphic>
+              <a:graphicData uri="http://schemas.openxmlformats.org/drawingml/2006/picture">
+                <pic:pic>
+                  <pic:nvPicPr>
+                    <pic:cNvPr descr="images/conf-roc.png" id="47" name="Picture"/>
+                    <pic:cNvPicPr>
+                      <a:picLocks noChangeArrowheads="1" noChangeAspect="1"/>
+                    </pic:cNvPicPr>
+                  </pic:nvPicPr>
+                  <pic:blipFill>
+                    <a:blip r:embed="rId45"/>
+                    <a:stretch>
+                      <a:fillRect/>
+                    </a:stretch>
+                  </pic:blipFill>
+                  <pic:spPr bwMode="auto">
+                    <a:xfrm>
+                      <a:off x="0" y="0"/>
+                      <a:ext cx="5334000" cy="4795166"/>
+                    </a:xfrm>
+                    <a:prstGeom prst="rect">
+                      <a:avLst/>
+                    </a:prstGeom>
+                    <a:noFill/>
+                    <a:ln w="9525">
+                      <a:noFill/>
+                      <a:headEnd/>
+                      <a:tailEnd/>
+                    </a:ln>
+                  </pic:spPr>
+                </pic:pic>
+              </a:graphicData>
+            </a:graphic>
+          </wp:inline>
+        </w:drawing>
+      </w:r>
+    </w:p>
+    <w:p>
+      <w:pPr>
+        <w:pStyle w:val="BodyText"/>
+      </w:pPr>
+      <w:r>
+        <w:rPr>
+          <w:b/>
+          <w:bCs/>
+        </w:rPr>
+        <w:t xml:space="preserve">Figure 5.6: Confidence Engine ROC Curve (AUC = 0.822) — the steep initial rise reflects the perfect-precision 'Confirmed' region at a false-positive rate of zero</w:t>
+      </w:r>
+    </w:p>
+    <w:p>
+      <w:pPr>
+        <w:pStyle w:val="BodyText"/>
+      </w:pPr>
+      <w:r>
+        <w:drawing>
+          <wp:inline>
+            <wp:extent cx="5334000" cy="2903316"/>
+            <wp:effectExtent b="0" l="0" r="0" t="0"/>
+            <wp:docPr descr="Figure 5.7: Confidence score separation between true and false positives" title="" id="49" name="Picture"/>
+            <a:graphic>
+              <a:graphicData uri="http://schemas.openxmlformats.org/drawingml/2006/picture">
+                <pic:pic>
+                  <pic:nvPicPr>
+                    <pic:cNvPr descr="images/conf-separation.png" id="50" name="Picture"/>
+                    <pic:cNvPicPr>
+                      <a:picLocks noChangeArrowheads="1" noChangeAspect="1"/>
+                    </pic:cNvPicPr>
+                  </pic:nvPicPr>
+                  <pic:blipFill>
+                    <a:blip r:embed="rId48"/>
+                    <a:stretch>
+                      <a:fillRect/>
+                    </a:stretch>
+                  </pic:blipFill>
+                  <pic:spPr bwMode="auto">
+                    <a:xfrm>
+                      <a:off x="0" y="0"/>
+                      <a:ext cx="5334000" cy="2903316"/>
+                    </a:xfrm>
+                    <a:prstGeom prst="rect">
+                      <a:avLst/>
+                    </a:prstGeom>
+                    <a:noFill/>
+                    <a:ln w="9525">
+                      <a:noFill/>
+                      <a:headEnd/>
+                      <a:tailEnd/>
+                    </a:ln>
+                  </pic:spPr>
+                </pic:pic>
+              </a:graphicData>
+            </a:graphic>
+          </wp:inline>
+        </w:drawing>
+      </w:r>
+    </w:p>
+    <w:p>
+      <w:pPr>
+        <w:pStyle w:val="BodyText"/>
+      </w:pPr>
+      <w:r>
+        <w:rPr>
+          <w:b/>
+          <w:bCs/>
+        </w:rPr>
+        <w:t xml:space="preserve">Figure 5.7: Confidence Score Separation — true positives (mean 61.6) sit clearly above false positives (mean 32.0), with the three classification bands (Not Confirmed &lt; 40, Needs Verification 40–69, Confirmed ≥ 70) shaded</w:t>
       </w:r>
     </w:p>
     <w:p>
@@ -13392,9 +13649,9 @@
         <w:t xml:space="preserve">Table 5.19: Live Functional / System Verification Results</w:t>
       </w:r>
     </w:p>
-    <w:bookmarkEnd w:id="42"/>
-    <w:bookmarkEnd w:id="43"/>
-    <w:bookmarkStart w:id="44" w:name="X2103990b22303365d04026752791bacc2d669c8"/>
+    <w:bookmarkEnd w:id="51"/>
+    <w:bookmarkEnd w:id="52"/>
+    <w:bookmarkStart w:id="53" w:name="X2103990b22303365d04026752791bacc2d669c8"/>
     <w:p>
       <w:pPr>
         <w:pStyle w:val="Heading3"/>
@@ -14291,8 +14548,8 @@
         <w:t xml:space="preserve">Table 5.23: UAT Acceptance Summary (to be completed)</w:t>
       </w:r>
     </w:p>
-    <w:bookmarkEnd w:id="44"/>
-    <w:bookmarkStart w:id="45" w:name="Xdf6580e43cd4db41cb4f0594ac1084bceb4f354"/>
+    <w:bookmarkEnd w:id="53"/>
+    <w:bookmarkStart w:id="54" w:name="Xdf6580e43cd4db41cb4f0594ac1084bceb4f354"/>
     <w:p>
       <w:pPr>
         <w:pStyle w:val="Heading3"/>
@@ -14378,9 +14635,9 @@
         </w:pict>
       </w:r>
     </w:p>
-    <w:bookmarkEnd w:id="45"/>
-    <w:bookmarkEnd w:id="46"/>
-    <w:bookmarkStart w:id="47" w:name="X32768a294109eb22590a37edaae685c4b9e19bc"/>
+    <w:bookmarkEnd w:id="54"/>
+    <w:bookmarkEnd w:id="55"/>
+    <w:bookmarkStart w:id="56" w:name="X32768a294109eb22590a37edaae685c4b9e19bc"/>
     <w:p>
       <w:pPr>
         <w:pStyle w:val="Heading2"/>
@@ -14498,8 +14755,8 @@
         <w:t xml:space="preserve">Together the two techniques address both correctness and acceptance: the white-box results demonstrate that every component computes trustworthy, evidence-backed output, while the user acceptance testing establishes that the intended users can operate the system and accept it in practice. The following chapter concludes the project, reflecting on the objectives, the limitations noted above, and directions for future work.</w:t>
       </w:r>
     </w:p>
-    <w:bookmarkEnd w:id="47"/>
-    <w:bookmarkEnd w:id="48"/>
+    <w:bookmarkEnd w:id="56"/>
+    <w:bookmarkEnd w:id="57"/>
     <w:sectPr>
       <w:footnotePr>
         <w:numRestart w:val="eachSect"/>

</xml_diff>

<commit_message>
docs: evaluate Confidence Engine on REAL scan data (OWASP Juice Shop)
Replace the synthetic benchmark as the primary confidence evaluation with a
real-target evaluation over an actual ZAP+Nuclei scan of OWASP Juice Shop
(20 real findings):
- Table 5.19: real findings with real confidence scores + classifications +
  objective PoC confirmations
- Figure 5.5: reproducible evaluate_realscan.py output (new script)
- Figure 5.6: real confidence-score distribution by classification band
The 5 PoC-confirmed findings (incl. actively-exploited SQLi, 1'-- -> HTTP 500)
all land Confirmed (mean 79.5); technology-detection noise all Informational
(mean 11.8); clean separation. Synthetic benchmark kept as supplementary
(Figures 5.7-5.8). Transparency note added re: PoC being one scoring factor.
Downstream tables renumbered 5.20-5.24; discussion/summary updated.
</commit_message>
<xml_diff>
--- a/docs/Chapter_5_Result_and_Discussion.docx
+++ b/docs/Chapter_5_Result_and_Discussion.docx
@@ -2,7 +2,7 @@
 <file path=word/document.xml><?xml version="1.0" encoding="utf-8"?>
 <w:document xmlns:w="http://schemas.openxmlformats.org/wordprocessingml/2006/main" xmlns:m="http://schemas.openxmlformats.org/officeDocument/2006/math" xmlns:r="http://schemas.openxmlformats.org/officeDocument/2006/relationships" xmlns:o="urn:schemas-microsoft-com:office:office" xmlns:v="urn:schemas-microsoft-com:vml" xmlns:w10="urn:schemas-microsoft-com:office:word" xmlns:a="http://schemas.openxmlformats.org/drawingml/2006/main" xmlns:pic="http://schemas.openxmlformats.org/drawingml/2006/picture" xmlns:wp="http://schemas.openxmlformats.org/drawingml/2006/wordprocessingDrawing">
   <w:body>
-    <w:bookmarkStart w:id="57" w:name="chapter-5-result-and-discussion"/>
+    <w:bookmarkStart w:id="60" w:name="chapter-5-result-and-discussion"/>
     <w:p>
       <w:pPr>
         <w:pStyle w:val="Heading1"/>
@@ -3184,7 +3184,7 @@
     <w:bookmarkEnd w:id="17"/>
     <w:bookmarkEnd w:id="18"/>
     <w:bookmarkEnd w:id="19"/>
-    <w:bookmarkStart w:id="55" w:name="Xdf8304cc98c46e7ba29fa90a2df6e3c66112698"/>
+    <w:bookmarkStart w:id="58" w:name="Xdf8304cc98c46e7ba29fa90a2df6e3c66112698"/>
     <w:p>
       <w:pPr>
         <w:pStyle w:val="Heading2"/>
@@ -3193,7 +3193,7 @@
         <w:t xml:space="preserve">5.3 System Testing and Discussion</w:t>
       </w:r>
     </w:p>
-    <w:bookmarkStart w:id="52" w:name="Xb0ff592cf76b56e6bfcd93a7bb3d4b0b056114d"/>
+    <w:bookmarkStart w:id="55" w:name="Xb0ff592cf76b56e6bfcd93a7bb3d4b0b056114d"/>
     <w:p>
       <w:pPr>
         <w:pStyle w:val="Heading3"/>
@@ -11639,7 +11639,7 @@
       </w:r>
     </w:p>
     <w:bookmarkEnd w:id="32"/>
-    <w:bookmarkStart w:id="51" w:name="component-14--data-management"/>
+    <w:bookmarkStart w:id="54" w:name="component-14--data-management"/>
     <w:p>
       <w:pPr>
         <w:pStyle w:val="Heading4"/>
@@ -12870,28 +12870,13 @@
           <w:b/>
           <w:bCs/>
         </w:rPr>
-        <w:t xml:space="preserve">Confidence Engine benchmark (real).</w:t>
+        <w:t xml:space="preserve">Confidence Engine evaluation — real target.</w:t>
       </w:r>
       <w:r>
         <w:t xml:space="preserve"> </w:t>
       </w:r>
       <w:r>
-        <w:t xml:space="preserve">The Confidence Engine was additionally evaluated on a curated benchmark of 32 labelled scenarios (16 true positives, 16 false positives) using the</w:t>
-      </w:r>
-      <w:r>
-        <w:t xml:space="preserve"> </w:t>
-      </w:r>
-      <w:r>
-        <w:rPr>
-          <w:rStyle w:val="VerbatimChar"/>
-        </w:rPr>
-        <w:t xml:space="preserve">backend/scripts/evaluate_confidence.py</w:t>
-      </w:r>
-      <w:r>
-        <w:t xml:space="preserve"> </w:t>
-      </w:r>
-      <w:r>
-        <w:t xml:space="preserve">harness. Its console report is shown in Figure 5.5 as evidence that the figures below come from a genuine evaluation run. The engine achieved a</w:t>
+        <w:t xml:space="preserve">To evaluate the Confidence Engine on real data rather than a synthetic benchmark, it was run over an</w:t>
       </w:r>
       <w:r>
         <w:t xml:space="preserve"> </w:t>
@@ -12901,13 +12886,13 @@
           <w:b/>
           <w:bCs/>
         </w:rPr>
-        <w:t xml:space="preserve">ROC-AUC of 0.822</w:t>
+        <w:t xml:space="preserve">actual scan of OWASP Juice Shop</w:t>
       </w:r>
       <w:r>
         <w:t xml:space="preserve"> </w:t>
       </w:r>
       <w:r>
-        <w:t xml:space="preserve">(Figure 5.6), driven by a clear separation between the true-positive and false-positive scores — a mean of</w:t>
+        <w:t xml:space="preserve">(a deliberately-vulnerable application) performed with</w:t>
       </w:r>
       <w:r>
         <w:t xml:space="preserve"> </w:t>
@@ -12917,13 +12902,10 @@
           <w:b/>
           <w:bCs/>
         </w:rPr>
-        <w:t xml:space="preserve">61.6</w:t>
-      </w:r>
-      <w:r>
-        <w:t xml:space="preserve"> </w:t>
-      </w:r>
-      <w:r>
-        <w:t xml:space="preserve">for true positives versus</w:t>
+        <w:t xml:space="preserve">OWASP ZAP and Nuclei</w:t>
+      </w:r>
+      <w:r>
+        <w:t xml:space="preserve">, which produced</w:t>
       </w:r>
       <w:r>
         <w:t xml:space="preserve"> </w:t>
@@ -12933,45 +12915,10 @@
           <w:b/>
           <w:bCs/>
         </w:rPr>
-        <w:t xml:space="preserve">32.0</w:t>
-      </w:r>
-      <w:r>
-        <w:t xml:space="preserve"> </w:t>
-      </w:r>
-      <w:r>
-        <w:t xml:space="preserve">for false positives (Figure 5.7). Treated as a true-positive detector, the "Confirmed" band (score ≥ 70) achieves a</w:t>
-      </w:r>
-      <w:r>
-        <w:t xml:space="preserve"> </w:t>
-      </w:r>
-      <w:r>
-        <w:rPr>
-          <w:b/>
-          <w:bCs/>
-        </w:rPr>
-        <w:t xml:space="preserve">precision of 1.0</w:t>
-      </w:r>
-      <w:r>
-        <w:t xml:space="preserve"> </w:t>
-      </w:r>
-      <w:r>
-        <w:t xml:space="preserve">— it never wrongly confirmed a false positive — and auto-dismissing the "Not Confirmed" band (score &lt; 40)</w:t>
-      </w:r>
-      <w:r>
-        <w:t xml:space="preserve"> </w:t>
-      </w:r>
-      <w:r>
-        <w:rPr>
-          <w:b/>
-          <w:bCs/>
-        </w:rPr>
-        <w:t xml:space="preserve">suppresses 81.2% of the false positives while retaining 75.0% of the true positives</w:t>
-      </w:r>
-      <w:r>
-        <w:t xml:space="preserve"> </w:t>
-      </w:r>
-      <w:r>
-        <w:t xml:space="preserve">for review, reducing the analyst's workload by 53.1%. This demonstrates the engine's core purpose: suppressing scanner noise without discarding real vulnerabilities. (As stated in the harness header, this is a</w:t>
+        <w:t xml:space="preserve">20 real findings</w:t>
+      </w:r>
+      <w:r>
+        <w:t xml:space="preserve">. The engine's real confidence scores and classifications are listed in Table 5.19; the reproducible evaluation output is shown in Figure 5.5 and the score distribution in Figure 5.6. The ground truth here is</w:t>
       </w:r>
       <w:r>
         <w:t xml:space="preserve"> </w:t>
@@ -12981,13 +12928,25 @@
           <w:i/>
           <w:iCs/>
         </w:rPr>
-        <w:t xml:space="preserve">curated synthetic</w:t>
+        <w:t xml:space="preserve">objective</w:t>
+      </w:r>
+      <w:r>
+        <w:t xml:space="preserve">, not hand-labelled: the PoC validator actively probed each candidate against the live application, and the one genuinely exploitable vulnerability — a SQL injection — was confirmed by a real exploit (the payload</w:t>
       </w:r>
       <w:r>
         <w:t xml:space="preserve"> </w:t>
       </w:r>
       <w:r>
-        <w:t xml:space="preserve">benchmark, not field-validated data.)</w:t>
+        <w:rPr>
+          <w:rStyle w:val="VerbatimChar"/>
+        </w:rPr>
+        <w:t xml:space="preserve">1'--</w:t>
+      </w:r>
+      <w:r>
+        <w:t xml:space="preserve"> </w:t>
+      </w:r>
+      <w:r>
+        <w:t xml:space="preserve">returned an HTTP 500 SQL error).</w:t>
       </w:r>
     </w:p>
     <w:p>
@@ -12995,16 +12954,1768 @@
         <w:pStyle w:val="BodyText"/>
       </w:pPr>
       <w:r>
+        <w:t xml:space="preserve">The result is a clean real-world separation. All</w:t>
+      </w:r>
+      <w:r>
+        <w:t xml:space="preserve"> </w:t>
+      </w:r>
+      <w:r>
+        <w:rPr>
+          <w:b/>
+          <w:bCs/>
+        </w:rPr>
+        <w:t xml:space="preserve">5 findings that the PoC validator objectively confirmed</w:t>
+      </w:r>
+      <w:r>
+        <w:t xml:space="preserve"> </w:t>
+      </w:r>
+      <w:r>
+        <w:t xml:space="preserve">landed in the</w:t>
+      </w:r>
+      <w:r>
+        <w:t xml:space="preserve"> </w:t>
+      </w:r>
+      <w:r>
+        <w:rPr>
+          <w:b/>
+          <w:bCs/>
+        </w:rPr>
+        <w:t xml:space="preserve">Confirmed</w:t>
+      </w:r>
+      <w:r>
+        <w:t xml:space="preserve"> </w:t>
+      </w:r>
+      <w:r>
+        <w:t xml:space="preserve">band (mean confidence</w:t>
+      </w:r>
+      <w:r>
+        <w:t xml:space="preserve"> </w:t>
+      </w:r>
+      <w:r>
+        <w:rPr>
+          <w:b/>
+          <w:bCs/>
+        </w:rPr>
+        <w:t xml:space="preserve">79.5</w:t>
+      </w:r>
+      <w:r>
+        <w:t xml:space="preserve">), including the SQL injection at 82.1. The</w:t>
+      </w:r>
+      <w:r>
+        <w:t xml:space="preserve"> </w:t>
+      </w:r>
+      <w:r>
+        <w:rPr>
+          <w:b/>
+          <w:bCs/>
+        </w:rPr>
+        <w:t xml:space="preserve">10 pure technology-detection items</w:t>
+      </w:r>
+      <w:r>
+        <w:t xml:space="preserve"> </w:t>
+      </w:r>
+      <w:r>
+        <w:t xml:space="preserve">the scanners emitted (e.g. "Modern Web Application", "SNMPv3 Fingerprint", "Dameng Database — Detect") — informational noise rather than vulnerabilities — were all pushed down to the</w:t>
+      </w:r>
+      <w:r>
+        <w:t xml:space="preserve"> </w:t>
+      </w:r>
+      <w:r>
+        <w:rPr>
+          <w:b/>
+          <w:bCs/>
+        </w:rPr>
+        <w:t xml:space="preserve">Informational</w:t>
+      </w:r>
+      <w:r>
+        <w:t xml:space="preserve"> </w:t>
+      </w:r>
+      <w:r>
+        <w:t xml:space="preserve">band (mean confidence</w:t>
+      </w:r>
+      <w:r>
+        <w:t xml:space="preserve"> </w:t>
+      </w:r>
+      <w:r>
+        <w:rPr>
+          <w:b/>
+          <w:bCs/>
+        </w:rPr>
+        <w:t xml:space="preserve">11.8</w:t>
+      </w:r>
+      <w:r>
+        <w:t xml:space="preserve">). The lowest-scoring Confirmed finding (74.8) still sat well above the highest non-Confirmed finding (38.3), so the engine did exactly what it is designed to do: it elevated the genuinely actionable findings to the top and demoted the noise, shrinking the analyst's review set from 20 findings to the 5 that matter.</w:t>
+      </w:r>
+    </w:p>
+    <w:p>
+      <w:pPr>
+        <w:pStyle w:val="BodyText"/>
+      </w:pPr>
+      <w:r>
+        <w:rPr>
+          <w:i/>
+          <w:iCs/>
+        </w:rPr>
+        <w:t xml:space="preserve">Transparency:</w:t>
+      </w:r>
+      <w:r>
+        <w:t xml:space="preserve"> </w:t>
+      </w:r>
+      <w:r>
+        <w:t xml:space="preserve">PoC confirmation is one of the engine's six scoring factors, so this measures the</w:t>
+      </w:r>
+      <w:r>
+        <w:t xml:space="preserve"> </w:t>
+      </w:r>
+      <w:r>
+        <w:rPr>
+          <w:b/>
+          <w:bCs/>
+        </w:rPr>
+        <w:t xml:space="preserve">end-to-end triage outcome</w:t>
+      </w:r>
+      <w:r>
+        <w:t xml:space="preserve"> </w:t>
+      </w:r>
+      <w:r>
+        <w:t xml:space="preserve">on a real target — how well the engine</w:t>
+      </w:r>
+      <w:r>
+        <w:t xml:space="preserve"> </w:t>
+      </w:r>
+      <w:r>
+        <w:rPr>
+          <w:i/>
+          <w:iCs/>
+        </w:rPr>
+        <w:t xml:space="preserve">prioritises</w:t>
+      </w:r>
+      <w:r>
+        <w:t xml:space="preserve"> </w:t>
+      </w:r>
+      <w:r>
+        <w:t xml:space="preserve">genuine findings above noise — rather than an independent predictor. Also, a single clean scan of an accurate scanner target contains few outright scanner</w:t>
+      </w:r>
+      <w:r>
+        <w:t xml:space="preserve"> </w:t>
+      </w:r>
+      <w:r>
+        <w:rPr>
+          <w:i/>
+          <w:iCs/>
+        </w:rPr>
+        <w:t xml:space="preserve">false positives</w:t>
+      </w:r>
+      <w:r>
+        <w:t xml:space="preserve">, so it cannot measure false-positive</w:t>
+      </w:r>
+      <w:r>
+        <w:t xml:space="preserve"> </w:t>
+      </w:r>
+      <w:r>
+        <w:rPr>
+          <w:i/>
+          <w:iCs/>
+        </w:rPr>
+        <w:t xml:space="preserve">suppression</w:t>
+      </w:r>
+      <w:r>
+        <w:t xml:space="preserve"> </w:t>
+      </w:r>
+      <w:r>
+        <w:t xml:space="preserve">in isolation; the balanced benchmark below is retained as supplementary evidence for that specific property.</w:t>
+      </w:r>
+    </w:p>
+    <w:tbl>
+      <w:tblPr>
+        <w:tblStyle w:val="Table"/>
+        <w:tblW w:type="auto" w:w="0"/>
+        <w:tblLook w:firstRow="1" w:lastRow="0" w:firstColumn="0" w:lastColumn="0" w:noHBand="0" w:noVBand="0" w:val="0020"/>
+      </w:tblPr>
+      <w:tblGrid>
+        <w:gridCol w:w="1320"/>
+        <w:gridCol w:w="1320"/>
+        <w:gridCol w:w="1320"/>
+        <w:gridCol w:w="1320"/>
+        <w:gridCol w:w="1320"/>
+        <w:gridCol w:w="1320"/>
+      </w:tblGrid>
+      <w:tr>
+        <w:trPr>
+          <w:tblHeader w:val="on"/>
+        </w:trPr>
+        <w:tc>
+          <w:tcPr/>
+          <w:p>
+            <w:pPr>
+              <w:pStyle w:val="Compact"/>
+            </w:pPr>
+            <w:r>
+              <w:t xml:space="preserve">Finding (real scan)</w:t>
+            </w:r>
+          </w:p>
+        </w:tc>
+        <w:tc>
+          <w:tcPr/>
+          <w:p>
+            <w:pPr>
+              <w:pStyle w:val="Compact"/>
+              <w:jc w:val="center"/>
+            </w:pPr>
+            <w:r>
+              <w:t xml:space="preserve">Severity</w:t>
+            </w:r>
+          </w:p>
+        </w:tc>
+        <w:tc>
+          <w:tcPr/>
+          <w:p>
+            <w:pPr>
+              <w:pStyle w:val="Compact"/>
+              <w:jc w:val="center"/>
+            </w:pPr>
+            <w:r>
+              <w:t xml:space="preserve">CWE</w:t>
+            </w:r>
+          </w:p>
+        </w:tc>
+        <w:tc>
+          <w:tcPr/>
+          <w:p>
+            <w:pPr>
+              <w:pStyle w:val="Compact"/>
+              <w:jc w:val="center"/>
+            </w:pPr>
+            <w:r>
+              <w:t xml:space="preserve">Confidence</w:t>
+            </w:r>
+          </w:p>
+        </w:tc>
+        <w:tc>
+          <w:tcPr/>
+          <w:p>
+            <w:pPr>
+              <w:pStyle w:val="Compact"/>
+              <w:jc w:val="center"/>
+            </w:pPr>
+            <w:r>
+              <w:t xml:space="preserve">Classification</w:t>
+            </w:r>
+          </w:p>
+        </w:tc>
+        <w:tc>
+          <w:tcPr/>
+          <w:p>
+            <w:pPr>
+              <w:pStyle w:val="Compact"/>
+              <w:jc w:val="center"/>
+            </w:pPr>
+            <w:r>
+              <w:t xml:space="preserve">PoC</w:t>
+            </w:r>
+          </w:p>
+        </w:tc>
+      </w:tr>
+      <w:tr>
+        <w:tc>
+          <w:tcPr/>
+          <w:p>
+            <w:pPr>
+              <w:pStyle w:val="Compact"/>
+            </w:pPr>
+            <w:r>
+              <w:t xml:space="preserve">Missing Anti-clickjacking Header</w:t>
+            </w:r>
+          </w:p>
+        </w:tc>
+        <w:tc>
+          <w:tcPr/>
+          <w:p>
+            <w:pPr>
+              <w:pStyle w:val="Compact"/>
+              <w:jc w:val="center"/>
+            </w:pPr>
+            <w:r>
+              <w:t xml:space="preserve">Medium</w:t>
+            </w:r>
+          </w:p>
+        </w:tc>
+        <w:tc>
+          <w:tcPr/>
+          <w:p>
+            <w:pPr>
+              <w:pStyle w:val="Compact"/>
+              <w:jc w:val="center"/>
+            </w:pPr>
+            <w:r>
+              <w:t xml:space="preserve">CWE-1021</w:t>
+            </w:r>
+          </w:p>
+        </w:tc>
+        <w:tc>
+          <w:tcPr/>
+          <w:p>
+            <w:pPr>
+              <w:pStyle w:val="Compact"/>
+              <w:jc w:val="center"/>
+            </w:pPr>
+            <w:r>
+              <w:t xml:space="preserve">83.8</w:t>
+            </w:r>
+          </w:p>
+        </w:tc>
+        <w:tc>
+          <w:tcPr/>
+          <w:p>
+            <w:pPr>
+              <w:pStyle w:val="Compact"/>
+              <w:jc w:val="center"/>
+            </w:pPr>
+            <w:r>
+              <w:t xml:space="preserve">Confirmed</w:t>
+            </w:r>
+          </w:p>
+        </w:tc>
+        <w:tc>
+          <w:tcPr/>
+          <w:p>
+            <w:pPr>
+              <w:pStyle w:val="Compact"/>
+              <w:jc w:val="center"/>
+            </w:pPr>
+            <w:r>
+              <w:t xml:space="preserve">✔ confirmed</w:t>
+            </w:r>
+          </w:p>
+        </w:tc>
+      </w:tr>
+      <w:tr>
+        <w:tc>
+          <w:tcPr/>
+          <w:p>
+            <w:pPr>
+              <w:pStyle w:val="Compact"/>
+            </w:pPr>
+            <w:r>
+              <w:t xml:space="preserve">SQL Injection – SQLite</w:t>
+            </w:r>
+          </w:p>
+        </w:tc>
+        <w:tc>
+          <w:tcPr/>
+          <w:p>
+            <w:pPr>
+              <w:pStyle w:val="Compact"/>
+              <w:jc w:val="center"/>
+            </w:pPr>
+            <w:r>
+              <w:t xml:space="preserve">High</w:t>
+            </w:r>
+          </w:p>
+        </w:tc>
+        <w:tc>
+          <w:tcPr/>
+          <w:p>
+            <w:pPr>
+              <w:pStyle w:val="Compact"/>
+              <w:jc w:val="center"/>
+            </w:pPr>
+            <w:r>
+              <w:t xml:space="preserve">CWE-89</w:t>
+            </w:r>
+          </w:p>
+        </w:tc>
+        <w:tc>
+          <w:tcPr/>
+          <w:p>
+            <w:pPr>
+              <w:pStyle w:val="Compact"/>
+              <w:jc w:val="center"/>
+            </w:pPr>
+            <w:r>
+              <w:t xml:space="preserve">82.1</w:t>
+            </w:r>
+          </w:p>
+        </w:tc>
+        <w:tc>
+          <w:tcPr/>
+          <w:p>
+            <w:pPr>
+              <w:pStyle w:val="Compact"/>
+              <w:jc w:val="center"/>
+            </w:pPr>
+            <w:r>
+              <w:t xml:space="preserve">Confirmed</w:t>
+            </w:r>
+          </w:p>
+        </w:tc>
+        <w:tc>
+          <w:tcPr/>
+          <w:p>
+            <w:pPr>
+              <w:pStyle w:val="Compact"/>
+              <w:jc w:val="center"/>
+            </w:pPr>
+            <w:r>
+              <w:t xml:space="preserve">✔ exploited (</w:t>
+            </w:r>
+            <w:r>
+              <w:rPr>
+                <w:rStyle w:val="VerbatimChar"/>
+              </w:rPr>
+              <w:t xml:space="preserve">1'--</w:t>
+            </w:r>
+            <w:r>
+              <w:t xml:space="preserve"> </w:t>
+            </w:r>
+            <w:r>
+              <w:t xml:space="preserve">→ 500)</w:t>
+            </w:r>
+          </w:p>
+        </w:tc>
+      </w:tr>
+      <w:tr>
+        <w:tc>
+          <w:tcPr/>
+          <w:p>
+            <w:pPr>
+              <w:pStyle w:val="Compact"/>
+            </w:pPr>
+            <w:r>
+              <w:t xml:space="preserve">Content Security Policy (CSP) Header Not Set</w:t>
+            </w:r>
+          </w:p>
+        </w:tc>
+        <w:tc>
+          <w:tcPr/>
+          <w:p>
+            <w:pPr>
+              <w:pStyle w:val="Compact"/>
+              <w:jc w:val="center"/>
+            </w:pPr>
+            <w:r>
+              <w:t xml:space="preserve">Medium</w:t>
+            </w:r>
+          </w:p>
+        </w:tc>
+        <w:tc>
+          <w:tcPr/>
+          <w:p>
+            <w:pPr>
+              <w:pStyle w:val="Compact"/>
+              <w:jc w:val="center"/>
+            </w:pPr>
+            <w:r>
+              <w:t xml:space="preserve">CWE-693</w:t>
+            </w:r>
+          </w:p>
+        </w:tc>
+        <w:tc>
+          <w:tcPr/>
+          <w:p>
+            <w:pPr>
+              <w:pStyle w:val="Compact"/>
+              <w:jc w:val="center"/>
+            </w:pPr>
+            <w:r>
+              <w:t xml:space="preserve">79.2</w:t>
+            </w:r>
+          </w:p>
+        </w:tc>
+        <w:tc>
+          <w:tcPr/>
+          <w:p>
+            <w:pPr>
+              <w:pStyle w:val="Compact"/>
+              <w:jc w:val="center"/>
+            </w:pPr>
+            <w:r>
+              <w:t xml:space="preserve">Confirmed</w:t>
+            </w:r>
+          </w:p>
+        </w:tc>
+        <w:tc>
+          <w:tcPr/>
+          <w:p>
+            <w:pPr>
+              <w:pStyle w:val="Compact"/>
+              <w:jc w:val="center"/>
+            </w:pPr>
+            <w:r>
+              <w:t xml:space="preserve">✔ confirmed</w:t>
+            </w:r>
+          </w:p>
+        </w:tc>
+      </w:tr>
+      <w:tr>
+        <w:tc>
+          <w:tcPr/>
+          <w:p>
+            <w:pPr>
+              <w:pStyle w:val="Compact"/>
+            </w:pPr>
+            <w:r>
+              <w:t xml:space="preserve">X-Content-Type-Options Header Missing</w:t>
+            </w:r>
+          </w:p>
+        </w:tc>
+        <w:tc>
+          <w:tcPr/>
+          <w:p>
+            <w:pPr>
+              <w:pStyle w:val="Compact"/>
+              <w:jc w:val="center"/>
+            </w:pPr>
+            <w:r>
+              <w:t xml:space="preserve">Low</w:t>
+            </w:r>
+          </w:p>
+        </w:tc>
+        <w:tc>
+          <w:tcPr/>
+          <w:p>
+            <w:pPr>
+              <w:pStyle w:val="Compact"/>
+              <w:jc w:val="center"/>
+            </w:pPr>
+            <w:r>
+              <w:t xml:space="preserve">CWE-693</w:t>
+            </w:r>
+          </w:p>
+        </w:tc>
+        <w:tc>
+          <w:tcPr/>
+          <w:p>
+            <w:pPr>
+              <w:pStyle w:val="Compact"/>
+              <w:jc w:val="center"/>
+            </w:pPr>
+            <w:r>
+              <w:t xml:space="preserve">77.8</w:t>
+            </w:r>
+          </w:p>
+        </w:tc>
+        <w:tc>
+          <w:tcPr/>
+          <w:p>
+            <w:pPr>
+              <w:pStyle w:val="Compact"/>
+              <w:jc w:val="center"/>
+            </w:pPr>
+            <w:r>
+              <w:t xml:space="preserve">Confirmed</w:t>
+            </w:r>
+          </w:p>
+        </w:tc>
+        <w:tc>
+          <w:tcPr/>
+          <w:p>
+            <w:pPr>
+              <w:pStyle w:val="Compact"/>
+              <w:jc w:val="center"/>
+            </w:pPr>
+            <w:r>
+              <w:t xml:space="preserve">✔ confirmed</w:t>
+            </w:r>
+          </w:p>
+        </w:tc>
+      </w:tr>
+      <w:tr>
+        <w:tc>
+          <w:tcPr/>
+          <w:p>
+            <w:pPr>
+              <w:pStyle w:val="Compact"/>
+            </w:pPr>
+            <w:r>
+              <w:t xml:space="preserve">Deprecated Feature-Policy Header – Detection</w:t>
+            </w:r>
+          </w:p>
+        </w:tc>
+        <w:tc>
+          <w:tcPr/>
+          <w:p>
+            <w:pPr>
+              <w:pStyle w:val="Compact"/>
+              <w:jc w:val="center"/>
+            </w:pPr>
+            <w:r>
+              <w:t xml:space="preserve">Info</w:t>
+            </w:r>
+          </w:p>
+        </w:tc>
+        <w:tc>
+          <w:tcPr/>
+          <w:p>
+            <w:pPr>
+              <w:pStyle w:val="Compact"/>
+              <w:jc w:val="center"/>
+            </w:pPr>
+            <w:r>
+              <w:t xml:space="preserve">—</w:t>
+            </w:r>
+          </w:p>
+        </w:tc>
+        <w:tc>
+          <w:tcPr/>
+          <w:p>
+            <w:pPr>
+              <w:pStyle w:val="Compact"/>
+              <w:jc w:val="center"/>
+            </w:pPr>
+            <w:r>
+              <w:t xml:space="preserve">74.8</w:t>
+            </w:r>
+          </w:p>
+        </w:tc>
+        <w:tc>
+          <w:tcPr/>
+          <w:p>
+            <w:pPr>
+              <w:pStyle w:val="Compact"/>
+              <w:jc w:val="center"/>
+            </w:pPr>
+            <w:r>
+              <w:t xml:space="preserve">Confirmed</w:t>
+            </w:r>
+          </w:p>
+        </w:tc>
+        <w:tc>
+          <w:tcPr/>
+          <w:p>
+            <w:pPr>
+              <w:pStyle w:val="Compact"/>
+              <w:jc w:val="center"/>
+            </w:pPr>
+            <w:r>
+              <w:t xml:space="preserve">✔ confirmed</w:t>
+            </w:r>
+          </w:p>
+        </w:tc>
+      </w:tr>
+      <w:tr>
+        <w:tc>
+          <w:tcPr/>
+          <w:p>
+            <w:pPr>
+              <w:pStyle w:val="Compact"/>
+            </w:pPr>
+            <w:r>
+              <w:t xml:space="preserve">Cross-Domain Misconfiguration</w:t>
+            </w:r>
+          </w:p>
+        </w:tc>
+        <w:tc>
+          <w:tcPr/>
+          <w:p>
+            <w:pPr>
+              <w:pStyle w:val="Compact"/>
+              <w:jc w:val="center"/>
+            </w:pPr>
+            <w:r>
+              <w:t xml:space="preserve">Medium</w:t>
+            </w:r>
+          </w:p>
+        </w:tc>
+        <w:tc>
+          <w:tcPr/>
+          <w:p>
+            <w:pPr>
+              <w:pStyle w:val="Compact"/>
+              <w:jc w:val="center"/>
+            </w:pPr>
+            <w:r>
+              <w:t xml:space="preserve">CWE-264</w:t>
+            </w:r>
+          </w:p>
+        </w:tc>
+        <w:tc>
+          <w:tcPr/>
+          <w:p>
+            <w:pPr>
+              <w:pStyle w:val="Compact"/>
+              <w:jc w:val="center"/>
+            </w:pPr>
+            <w:r>
+              <w:t xml:space="preserve">38.3</w:t>
+            </w:r>
+          </w:p>
+        </w:tc>
+        <w:tc>
+          <w:tcPr/>
+          <w:p>
+            <w:pPr>
+              <w:pStyle w:val="Compact"/>
+              <w:jc w:val="center"/>
+            </w:pPr>
+            <w:r>
+              <w:t xml:space="preserve">Not Confirmed</w:t>
+            </w:r>
+          </w:p>
+        </w:tc>
+        <w:tc>
+          <w:tcPr/>
+          <w:p>
+            <w:pPr>
+              <w:pStyle w:val="Compact"/>
+              <w:jc w:val="center"/>
+            </w:pPr>
+            <w:r>
+              <w:t xml:space="preserve">—</w:t>
+            </w:r>
+          </w:p>
+        </w:tc>
+      </w:tr>
+      <w:tr>
+        <w:tc>
+          <w:tcPr/>
+          <w:p>
+            <w:pPr>
+              <w:pStyle w:val="Compact"/>
+            </w:pPr>
+            <w:r>
+              <w:t xml:space="preserve">Session ID in URL Rewrite</w:t>
+            </w:r>
+          </w:p>
+        </w:tc>
+        <w:tc>
+          <w:tcPr/>
+          <w:p>
+            <w:pPr>
+              <w:pStyle w:val="Compact"/>
+              <w:jc w:val="center"/>
+            </w:pPr>
+            <w:r>
+              <w:t xml:space="preserve">Medium</w:t>
+            </w:r>
+          </w:p>
+        </w:tc>
+        <w:tc>
+          <w:tcPr/>
+          <w:p>
+            <w:pPr>
+              <w:pStyle w:val="Compact"/>
+              <w:jc w:val="center"/>
+            </w:pPr>
+            <w:r>
+              <w:t xml:space="preserve">CWE-598</w:t>
+            </w:r>
+          </w:p>
+        </w:tc>
+        <w:tc>
+          <w:tcPr/>
+          <w:p>
+            <w:pPr>
+              <w:pStyle w:val="Compact"/>
+              <w:jc w:val="center"/>
+            </w:pPr>
+            <w:r>
+              <w:t xml:space="preserve">38.3</w:t>
+            </w:r>
+          </w:p>
+        </w:tc>
+        <w:tc>
+          <w:tcPr/>
+          <w:p>
+            <w:pPr>
+              <w:pStyle w:val="Compact"/>
+              <w:jc w:val="center"/>
+            </w:pPr>
+            <w:r>
+              <w:t xml:space="preserve">Not Confirmed</w:t>
+            </w:r>
+          </w:p>
+        </w:tc>
+        <w:tc>
+          <w:tcPr/>
+          <w:p>
+            <w:pPr>
+              <w:pStyle w:val="Compact"/>
+              <w:jc w:val="center"/>
+            </w:pPr>
+            <w:r>
+              <w:t xml:space="preserve">—</w:t>
+            </w:r>
+          </w:p>
+        </w:tc>
+      </w:tr>
+      <w:tr>
+        <w:tc>
+          <w:tcPr/>
+          <w:p>
+            <w:pPr>
+              <w:pStyle w:val="Compact"/>
+            </w:pPr>
+            <w:r>
+              <w:t xml:space="preserve">Private IP Disclosure</w:t>
+            </w:r>
+          </w:p>
+        </w:tc>
+        <w:tc>
+          <w:tcPr/>
+          <w:p>
+            <w:pPr>
+              <w:pStyle w:val="Compact"/>
+              <w:jc w:val="center"/>
+            </w:pPr>
+            <w:r>
+              <w:t xml:space="preserve">Low</w:t>
+            </w:r>
+          </w:p>
+        </w:tc>
+        <w:tc>
+          <w:tcPr/>
+          <w:p>
+            <w:pPr>
+              <w:pStyle w:val="Compact"/>
+              <w:jc w:val="center"/>
+            </w:pPr>
+            <w:r>
+              <w:t xml:space="preserve">CWE-497</w:t>
+            </w:r>
+          </w:p>
+        </w:tc>
+        <w:tc>
+          <w:tcPr/>
+          <w:p>
+            <w:pPr>
+              <w:pStyle w:val="Compact"/>
+              <w:jc w:val="center"/>
+            </w:pPr>
+            <w:r>
+              <w:t xml:space="preserve">30.3</w:t>
+            </w:r>
+          </w:p>
+        </w:tc>
+        <w:tc>
+          <w:tcPr/>
+          <w:p>
+            <w:pPr>
+              <w:pStyle w:val="Compact"/>
+              <w:jc w:val="center"/>
+            </w:pPr>
+            <w:r>
+              <w:t xml:space="preserve">Not Confirmed</w:t>
+            </w:r>
+          </w:p>
+        </w:tc>
+        <w:tc>
+          <w:tcPr/>
+          <w:p>
+            <w:pPr>
+              <w:pStyle w:val="Compact"/>
+              <w:jc w:val="center"/>
+            </w:pPr>
+            <w:r>
+              <w:t xml:space="preserve">—</w:t>
+            </w:r>
+          </w:p>
+        </w:tc>
+      </w:tr>
+      <w:tr>
+        <w:tc>
+          <w:tcPr/>
+          <w:p>
+            <w:pPr>
+              <w:pStyle w:val="Compact"/>
+            </w:pPr>
+            <w:r>
+              <w:t xml:space="preserve">Timestamp Disclosure – Unix</w:t>
+            </w:r>
+          </w:p>
+        </w:tc>
+        <w:tc>
+          <w:tcPr/>
+          <w:p>
+            <w:pPr>
+              <w:pStyle w:val="Compact"/>
+              <w:jc w:val="center"/>
+            </w:pPr>
+            <w:r>
+              <w:t xml:space="preserve">Low</w:t>
+            </w:r>
+          </w:p>
+        </w:tc>
+        <w:tc>
+          <w:tcPr/>
+          <w:p>
+            <w:pPr>
+              <w:pStyle w:val="Compact"/>
+              <w:jc w:val="center"/>
+            </w:pPr>
+            <w:r>
+              <w:t xml:space="preserve">CWE-497</w:t>
+            </w:r>
+          </w:p>
+        </w:tc>
+        <w:tc>
+          <w:tcPr/>
+          <w:p>
+            <w:pPr>
+              <w:pStyle w:val="Compact"/>
+              <w:jc w:val="center"/>
+            </w:pPr>
+            <w:r>
+              <w:t xml:space="preserve">30.3</w:t>
+            </w:r>
+          </w:p>
+        </w:tc>
+        <w:tc>
+          <w:tcPr/>
+          <w:p>
+            <w:pPr>
+              <w:pStyle w:val="Compact"/>
+              <w:jc w:val="center"/>
+            </w:pPr>
+            <w:r>
+              <w:t xml:space="preserve">Not Confirmed</w:t>
+            </w:r>
+          </w:p>
+        </w:tc>
+        <w:tc>
+          <w:tcPr/>
+          <w:p>
+            <w:pPr>
+              <w:pStyle w:val="Compact"/>
+              <w:jc w:val="center"/>
+            </w:pPr>
+            <w:r>
+              <w:t xml:space="preserve">—</w:t>
+            </w:r>
+          </w:p>
+        </w:tc>
+      </w:tr>
+      <w:tr>
+        <w:tc>
+          <w:tcPr/>
+          <w:p>
+            <w:pPr>
+              <w:pStyle w:val="Compact"/>
+            </w:pPr>
+            <w:r>
+              <w:t xml:space="preserve">Prometheus Metrics – Detect</w:t>
+            </w:r>
+          </w:p>
+        </w:tc>
+        <w:tc>
+          <w:tcPr/>
+          <w:p>
+            <w:pPr>
+              <w:pStyle w:val="Compact"/>
+              <w:jc w:val="center"/>
+            </w:pPr>
+            <w:r>
+              <w:t xml:space="preserve">Medium</w:t>
+            </w:r>
+          </w:p>
+        </w:tc>
+        <w:tc>
+          <w:tcPr/>
+          <w:p>
+            <w:pPr>
+              <w:pStyle w:val="Compact"/>
+              <w:jc w:val="center"/>
+            </w:pPr>
+            <w:r>
+              <w:t xml:space="preserve">CWE-200</w:t>
+            </w:r>
+          </w:p>
+        </w:tc>
+        <w:tc>
+          <w:tcPr/>
+          <w:p>
+            <w:pPr>
+              <w:pStyle w:val="Compact"/>
+              <w:jc w:val="center"/>
+            </w:pPr>
+            <w:r>
+              <w:t xml:space="preserve">30.3</w:t>
+            </w:r>
+          </w:p>
+        </w:tc>
+        <w:tc>
+          <w:tcPr/>
+          <w:p>
+            <w:pPr>
+              <w:pStyle w:val="Compact"/>
+              <w:jc w:val="center"/>
+            </w:pPr>
+            <w:r>
+              <w:t xml:space="preserve">Not Confirmed</w:t>
+            </w:r>
+          </w:p>
+        </w:tc>
+        <w:tc>
+          <w:tcPr/>
+          <w:p>
+            <w:pPr>
+              <w:pStyle w:val="Compact"/>
+              <w:jc w:val="center"/>
+            </w:pPr>
+            <w:r>
+              <w:t xml:space="preserve">—</w:t>
+            </w:r>
+          </w:p>
+        </w:tc>
+      </w:tr>
+      <w:tr>
+        <w:tc>
+          <w:tcPr/>
+          <w:p>
+            <w:pPr>
+              <w:pStyle w:val="Compact"/>
+            </w:pPr>
+            <w:r>
+              <w:t xml:space="preserve">Public Swagger API – Detect</w:t>
+            </w:r>
+          </w:p>
+        </w:tc>
+        <w:tc>
+          <w:tcPr/>
+          <w:p>
+            <w:pPr>
+              <w:pStyle w:val="Compact"/>
+              <w:jc w:val="center"/>
+            </w:pPr>
+            <w:r>
+              <w:t xml:space="preserve">Info</w:t>
+            </w:r>
+          </w:p>
+        </w:tc>
+        <w:tc>
+          <w:tcPr/>
+          <w:p>
+            <w:pPr>
+              <w:pStyle w:val="Compact"/>
+              <w:jc w:val="center"/>
+            </w:pPr>
+            <w:r>
+              <w:t xml:space="preserve">CWE-200</w:t>
+            </w:r>
+          </w:p>
+        </w:tc>
+        <w:tc>
+          <w:tcPr/>
+          <w:p>
+            <w:pPr>
+              <w:pStyle w:val="Compact"/>
+              <w:jc w:val="center"/>
+            </w:pPr>
+            <w:r>
+              <w:t xml:space="preserve">23.3</w:t>
+            </w:r>
+          </w:p>
+        </w:tc>
+        <w:tc>
+          <w:tcPr/>
+          <w:p>
+            <w:pPr>
+              <w:pStyle w:val="Compact"/>
+              <w:jc w:val="center"/>
+            </w:pPr>
+            <w:r>
+              <w:t xml:space="preserve">Informational</w:t>
+            </w:r>
+          </w:p>
+        </w:tc>
+        <w:tc>
+          <w:tcPr/>
+          <w:p>
+            <w:pPr>
+              <w:pStyle w:val="Compact"/>
+              <w:jc w:val="center"/>
+            </w:pPr>
+            <w:r>
+              <w:t xml:space="preserve">—</w:t>
+            </w:r>
+          </w:p>
+        </w:tc>
+      </w:tr>
+      <w:tr>
+        <w:tc>
+          <w:tcPr/>
+          <w:p>
+            <w:pPr>
+              <w:pStyle w:val="Compact"/>
+            </w:pPr>
+            <w:r>
+              <w:t xml:space="preserve">Information Disclosure – Suspicious Comments</w:t>
+            </w:r>
+          </w:p>
+        </w:tc>
+        <w:tc>
+          <w:tcPr/>
+          <w:p>
+            <w:pPr>
+              <w:pStyle w:val="Compact"/>
+              <w:jc w:val="center"/>
+            </w:pPr>
+            <w:r>
+              <w:t xml:space="preserve">Info</w:t>
+            </w:r>
+          </w:p>
+        </w:tc>
+        <w:tc>
+          <w:tcPr/>
+          <w:p>
+            <w:pPr>
+              <w:pStyle w:val="Compact"/>
+              <w:jc w:val="center"/>
+            </w:pPr>
+            <w:r>
+              <w:t xml:space="preserve">CWE-615</w:t>
+            </w:r>
+          </w:p>
+        </w:tc>
+        <w:tc>
+          <w:tcPr/>
+          <w:p>
+            <w:pPr>
+              <w:pStyle w:val="Compact"/>
+              <w:jc w:val="center"/>
+            </w:pPr>
+            <w:r>
+              <w:t xml:space="preserve">18.3</w:t>
+            </w:r>
+          </w:p>
+        </w:tc>
+        <w:tc>
+          <w:tcPr/>
+          <w:p>
+            <w:pPr>
+              <w:pStyle w:val="Compact"/>
+              <w:jc w:val="center"/>
+            </w:pPr>
+            <w:r>
+              <w:t xml:space="preserve">Informational</w:t>
+            </w:r>
+          </w:p>
+        </w:tc>
+        <w:tc>
+          <w:tcPr/>
+          <w:p>
+            <w:pPr>
+              <w:pStyle w:val="Compact"/>
+              <w:jc w:val="center"/>
+            </w:pPr>
+            <w:r>
+              <w:t xml:space="preserve">—</w:t>
+            </w:r>
+          </w:p>
+        </w:tc>
+      </w:tr>
+      <w:tr>
+        <w:tc>
+          <w:tcPr/>
+          <w:p>
+            <w:pPr>
+              <w:pStyle w:val="Compact"/>
+            </w:pPr>
+            <w:r>
+              <w:t xml:space="preserve">User Agent Fuzzer</w:t>
+            </w:r>
+          </w:p>
+        </w:tc>
+        <w:tc>
+          <w:tcPr/>
+          <w:p>
+            <w:pPr>
+              <w:pStyle w:val="Compact"/>
+              <w:jc w:val="center"/>
+            </w:pPr>
+            <w:r>
+              <w:t xml:space="preserve">Info</w:t>
+            </w:r>
+          </w:p>
+        </w:tc>
+        <w:tc>
+          <w:tcPr/>
+          <w:p>
+            <w:pPr>
+              <w:pStyle w:val="Compact"/>
+              <w:jc w:val="center"/>
+            </w:pPr>
+            <w:r>
+              <w:t xml:space="preserve">—</w:t>
+            </w:r>
+          </w:p>
+        </w:tc>
+        <w:tc>
+          <w:tcPr/>
+          <w:p>
+            <w:pPr>
+              <w:pStyle w:val="Compact"/>
+              <w:jc w:val="center"/>
+            </w:pPr>
+            <w:r>
+              <w:t xml:space="preserve">18.3</w:t>
+            </w:r>
+          </w:p>
+        </w:tc>
+        <w:tc>
+          <w:tcPr/>
+          <w:p>
+            <w:pPr>
+              <w:pStyle w:val="Compact"/>
+              <w:jc w:val="center"/>
+            </w:pPr>
+            <w:r>
+              <w:t xml:space="preserve">Informational</w:t>
+            </w:r>
+          </w:p>
+        </w:tc>
+        <w:tc>
+          <w:tcPr/>
+          <w:p>
+            <w:pPr>
+              <w:pStyle w:val="Compact"/>
+              <w:jc w:val="center"/>
+            </w:pPr>
+            <w:r>
+              <w:t xml:space="preserve">—</w:t>
+            </w:r>
+          </w:p>
+        </w:tc>
+      </w:tr>
+      <w:tr>
+        <w:tc>
+          <w:tcPr/>
+          <w:p>
+            <w:pPr>
+              <w:pStyle w:val="Compact"/>
+            </w:pPr>
+            <w:r>
+              <w:t xml:space="preserve">Modern Web Application</w:t>
+            </w:r>
+          </w:p>
+        </w:tc>
+        <w:tc>
+          <w:tcPr/>
+          <w:p>
+            <w:pPr>
+              <w:pStyle w:val="Compact"/>
+              <w:jc w:val="center"/>
+            </w:pPr>
+            <w:r>
+              <w:t xml:space="preserve">Info</w:t>
+            </w:r>
+          </w:p>
+        </w:tc>
+        <w:tc>
+          <w:tcPr/>
+          <w:p>
+            <w:pPr>
+              <w:pStyle w:val="Compact"/>
+              <w:jc w:val="center"/>
+            </w:pPr>
+            <w:r>
+              <w:t xml:space="preserve">—</w:t>
+            </w:r>
+          </w:p>
+        </w:tc>
+        <w:tc>
+          <w:tcPr/>
+          <w:p>
+            <w:pPr>
+              <w:pStyle w:val="Compact"/>
+              <w:jc w:val="center"/>
+            </w:pPr>
+            <w:r>
+              <w:t xml:space="preserve">8.3</w:t>
+            </w:r>
+          </w:p>
+        </w:tc>
+        <w:tc>
+          <w:tcPr/>
+          <w:p>
+            <w:pPr>
+              <w:pStyle w:val="Compact"/>
+              <w:jc w:val="center"/>
+            </w:pPr>
+            <w:r>
+              <w:t xml:space="preserve">Informational</w:t>
+            </w:r>
+          </w:p>
+        </w:tc>
+        <w:tc>
+          <w:tcPr/>
+          <w:p>
+            <w:pPr>
+              <w:pStyle w:val="Compact"/>
+              <w:jc w:val="center"/>
+            </w:pPr>
+            <w:r>
+              <w:t xml:space="preserve">—</w:t>
+            </w:r>
+          </w:p>
+        </w:tc>
+      </w:tr>
+      <w:tr>
+        <w:tc>
+          <w:tcPr/>
+          <w:p>
+            <w:pPr>
+              <w:pStyle w:val="Compact"/>
+            </w:pPr>
+            <w:r>
+              <w:t xml:space="preserve">Session Management Response Identified</w:t>
+            </w:r>
+          </w:p>
+        </w:tc>
+        <w:tc>
+          <w:tcPr/>
+          <w:p>
+            <w:pPr>
+              <w:pStyle w:val="Compact"/>
+              <w:jc w:val="center"/>
+            </w:pPr>
+            <w:r>
+              <w:t xml:space="preserve">Info</w:t>
+            </w:r>
+          </w:p>
+        </w:tc>
+        <w:tc>
+          <w:tcPr/>
+          <w:p>
+            <w:pPr>
+              <w:pStyle w:val="Compact"/>
+              <w:jc w:val="center"/>
+            </w:pPr>
+            <w:r>
+              <w:t xml:space="preserve">—</w:t>
+            </w:r>
+          </w:p>
+        </w:tc>
+        <w:tc>
+          <w:tcPr/>
+          <w:p>
+            <w:pPr>
+              <w:pStyle w:val="Compact"/>
+              <w:jc w:val="center"/>
+            </w:pPr>
+            <w:r>
+              <w:t xml:space="preserve">8.3</w:t>
+            </w:r>
+          </w:p>
+        </w:tc>
+        <w:tc>
+          <w:tcPr/>
+          <w:p>
+            <w:pPr>
+              <w:pStyle w:val="Compact"/>
+              <w:jc w:val="center"/>
+            </w:pPr>
+            <w:r>
+              <w:t xml:space="preserve">Informational</w:t>
+            </w:r>
+          </w:p>
+        </w:tc>
+        <w:tc>
+          <w:tcPr/>
+          <w:p>
+            <w:pPr>
+              <w:pStyle w:val="Compact"/>
+              <w:jc w:val="center"/>
+            </w:pPr>
+            <w:r>
+              <w:t xml:space="preserve">—</w:t>
+            </w:r>
+          </w:p>
+        </w:tc>
+      </w:tr>
+      <w:tr>
+        <w:tc>
+          <w:tcPr/>
+          <w:p>
+            <w:pPr>
+              <w:pStyle w:val="Compact"/>
+            </w:pPr>
+            <w:r>
+              <w:t xml:space="preserve">Dameng Database – Detect</w:t>
+            </w:r>
+          </w:p>
+        </w:tc>
+        <w:tc>
+          <w:tcPr/>
+          <w:p>
+            <w:pPr>
+              <w:pStyle w:val="Compact"/>
+              <w:jc w:val="center"/>
+            </w:pPr>
+            <w:r>
+              <w:t xml:space="preserve">Info</w:t>
+            </w:r>
+          </w:p>
+        </w:tc>
+        <w:tc>
+          <w:tcPr/>
+          <w:p>
+            <w:pPr>
+              <w:pStyle w:val="Compact"/>
+              <w:jc w:val="center"/>
+            </w:pPr>
+            <w:r>
+              <w:t xml:space="preserve">—</w:t>
+            </w:r>
+          </w:p>
+        </w:tc>
+        <w:tc>
+          <w:tcPr/>
+          <w:p>
+            <w:pPr>
+              <w:pStyle w:val="Compact"/>
+              <w:jc w:val="center"/>
+            </w:pPr>
+            <w:r>
+              <w:t xml:space="preserve">8.3</w:t>
+            </w:r>
+          </w:p>
+        </w:tc>
+        <w:tc>
+          <w:tcPr/>
+          <w:p>
+            <w:pPr>
+              <w:pStyle w:val="Compact"/>
+              <w:jc w:val="center"/>
+            </w:pPr>
+            <w:r>
+              <w:t xml:space="preserve">Informational</w:t>
+            </w:r>
+          </w:p>
+        </w:tc>
+        <w:tc>
+          <w:tcPr/>
+          <w:p>
+            <w:pPr>
+              <w:pStyle w:val="Compact"/>
+              <w:jc w:val="center"/>
+            </w:pPr>
+            <w:r>
+              <w:t xml:space="preserve">—</w:t>
+            </w:r>
+          </w:p>
+        </w:tc>
+      </w:tr>
+      <w:tr>
+        <w:tc>
+          <w:tcPr/>
+          <w:p>
+            <w:pPr>
+              <w:pStyle w:val="Compact"/>
+            </w:pPr>
+            <w:r>
+              <w:t xml:space="preserve">LDAP Metadata – Enumeration</w:t>
+            </w:r>
+          </w:p>
+        </w:tc>
+        <w:tc>
+          <w:tcPr/>
+          <w:p>
+            <w:pPr>
+              <w:pStyle w:val="Compact"/>
+              <w:jc w:val="center"/>
+            </w:pPr>
+            <w:r>
+              <w:t xml:space="preserve">Info</w:t>
+            </w:r>
+          </w:p>
+        </w:tc>
+        <w:tc>
+          <w:tcPr/>
+          <w:p>
+            <w:pPr>
+              <w:pStyle w:val="Compact"/>
+              <w:jc w:val="center"/>
+            </w:pPr>
+            <w:r>
+              <w:t xml:space="preserve">—</w:t>
+            </w:r>
+          </w:p>
+        </w:tc>
+        <w:tc>
+          <w:tcPr/>
+          <w:p>
+            <w:pPr>
+              <w:pStyle w:val="Compact"/>
+              <w:jc w:val="center"/>
+            </w:pPr>
+            <w:r>
+              <w:t xml:space="preserve">8.3</w:t>
+            </w:r>
+          </w:p>
+        </w:tc>
+        <w:tc>
+          <w:tcPr/>
+          <w:p>
+            <w:pPr>
+              <w:pStyle w:val="Compact"/>
+              <w:jc w:val="center"/>
+            </w:pPr>
+            <w:r>
+              <w:t xml:space="preserve">Informational</w:t>
+            </w:r>
+          </w:p>
+        </w:tc>
+        <w:tc>
+          <w:tcPr/>
+          <w:p>
+            <w:pPr>
+              <w:pStyle w:val="Compact"/>
+              <w:jc w:val="center"/>
+            </w:pPr>
+            <w:r>
+              <w:t xml:space="preserve">—</w:t>
+            </w:r>
+          </w:p>
+        </w:tc>
+      </w:tr>
+      <w:tr>
+        <w:tc>
+          <w:tcPr/>
+          <w:p>
+            <w:pPr>
+              <w:pStyle w:val="Compact"/>
+            </w:pPr>
+            <w:r>
+              <w:t xml:space="preserve">SNMPv3 Fingerprint – Detect</w:t>
+            </w:r>
+          </w:p>
+        </w:tc>
+        <w:tc>
+          <w:tcPr/>
+          <w:p>
+            <w:pPr>
+              <w:pStyle w:val="Compact"/>
+              <w:jc w:val="center"/>
+            </w:pPr>
+            <w:r>
+              <w:t xml:space="preserve">Info</w:t>
+            </w:r>
+          </w:p>
+        </w:tc>
+        <w:tc>
+          <w:tcPr/>
+          <w:p>
+            <w:pPr>
+              <w:pStyle w:val="Compact"/>
+              <w:jc w:val="center"/>
+            </w:pPr>
+            <w:r>
+              <w:t xml:space="preserve">—</w:t>
+            </w:r>
+          </w:p>
+        </w:tc>
+        <w:tc>
+          <w:tcPr/>
+          <w:p>
+            <w:pPr>
+              <w:pStyle w:val="Compact"/>
+              <w:jc w:val="center"/>
+            </w:pPr>
+            <w:r>
+              <w:t xml:space="preserve">8.3</w:t>
+            </w:r>
+          </w:p>
+        </w:tc>
+        <w:tc>
+          <w:tcPr/>
+          <w:p>
+            <w:pPr>
+              <w:pStyle w:val="Compact"/>
+              <w:jc w:val="center"/>
+            </w:pPr>
+            <w:r>
+              <w:t xml:space="preserve">Informational</w:t>
+            </w:r>
+          </w:p>
+        </w:tc>
+        <w:tc>
+          <w:tcPr/>
+          <w:p>
+            <w:pPr>
+              <w:pStyle w:val="Compact"/>
+              <w:jc w:val="center"/>
+            </w:pPr>
+            <w:r>
+              <w:t xml:space="preserve">—</w:t>
+            </w:r>
+          </w:p>
+        </w:tc>
+      </w:tr>
+      <w:tr>
+        <w:tc>
+          <w:tcPr/>
+          <w:p>
+            <w:pPr>
+              <w:pStyle w:val="Compact"/>
+            </w:pPr>
+            <w:r>
+              <w:t xml:space="preserve">Add DOM EventListener – Detection</w:t>
+            </w:r>
+          </w:p>
+        </w:tc>
+        <w:tc>
+          <w:tcPr/>
+          <w:p>
+            <w:pPr>
+              <w:pStyle w:val="Compact"/>
+              <w:jc w:val="center"/>
+            </w:pPr>
+            <w:r>
+              <w:t xml:space="preserve">Info</w:t>
+            </w:r>
+          </w:p>
+        </w:tc>
+        <w:tc>
+          <w:tcPr/>
+          <w:p>
+            <w:pPr>
+              <w:pStyle w:val="Compact"/>
+              <w:jc w:val="center"/>
+            </w:pPr>
+            <w:r>
+              <w:t xml:space="preserve">—</w:t>
+            </w:r>
+          </w:p>
+        </w:tc>
+        <w:tc>
+          <w:tcPr/>
+          <w:p>
+            <w:pPr>
+              <w:pStyle w:val="Compact"/>
+              <w:jc w:val="center"/>
+            </w:pPr>
+            <w:r>
+              <w:t xml:space="preserve">8.3</w:t>
+            </w:r>
+          </w:p>
+        </w:tc>
+        <w:tc>
+          <w:tcPr/>
+          <w:p>
+            <w:pPr>
+              <w:pStyle w:val="Compact"/>
+              <w:jc w:val="center"/>
+            </w:pPr>
+            <w:r>
+              <w:t xml:space="preserve">Informational</w:t>
+            </w:r>
+          </w:p>
+        </w:tc>
+        <w:tc>
+          <w:tcPr/>
+          <w:p>
+            <w:pPr>
+              <w:pStyle w:val="Compact"/>
+              <w:jc w:val="center"/>
+            </w:pPr>
+            <w:r>
+              <w:t xml:space="preserve">—</w:t>
+            </w:r>
+          </w:p>
+        </w:tc>
+      </w:tr>
+      <w:tr>
+        <w:tc>
+          <w:tcPr/>
+          <w:p>
+            <w:pPr>
+              <w:pStyle w:val="Compact"/>
+            </w:pPr>
+            <w:r>
+              <w:t xml:space="preserve">OWASP Juice Shop (tech detection)</w:t>
+            </w:r>
+          </w:p>
+        </w:tc>
+        <w:tc>
+          <w:tcPr/>
+          <w:p>
+            <w:pPr>
+              <w:pStyle w:val="Compact"/>
+              <w:jc w:val="center"/>
+            </w:pPr>
+            <w:r>
+              <w:t xml:space="preserve">Info</w:t>
+            </w:r>
+          </w:p>
+        </w:tc>
+        <w:tc>
+          <w:tcPr/>
+          <w:p>
+            <w:pPr>
+              <w:pStyle w:val="Compact"/>
+              <w:jc w:val="center"/>
+            </w:pPr>
+            <w:r>
+              <w:t xml:space="preserve">—</w:t>
+            </w:r>
+          </w:p>
+        </w:tc>
+        <w:tc>
+          <w:tcPr/>
+          <w:p>
+            <w:pPr>
+              <w:pStyle w:val="Compact"/>
+              <w:jc w:val="center"/>
+            </w:pPr>
+            <w:r>
+              <w:t xml:space="preserve">8.3</w:t>
+            </w:r>
+          </w:p>
+        </w:tc>
+        <w:tc>
+          <w:tcPr/>
+          <w:p>
+            <w:pPr>
+              <w:pStyle w:val="Compact"/>
+              <w:jc w:val="center"/>
+            </w:pPr>
+            <w:r>
+              <w:t xml:space="preserve">Informational</w:t>
+            </w:r>
+          </w:p>
+        </w:tc>
+        <w:tc>
+          <w:tcPr/>
+          <w:p>
+            <w:pPr>
+              <w:pStyle w:val="Compact"/>
+              <w:jc w:val="center"/>
+            </w:pPr>
+            <w:r>
+              <w:t xml:space="preserve">—</w:t>
+            </w:r>
+          </w:p>
+        </w:tc>
+      </w:tr>
+    </w:tbl>
+    <w:p>
+      <w:pPr>
+        <w:pStyle w:val="BodyText"/>
+      </w:pPr>
+      <w:r>
+        <w:rPr>
+          <w:b/>
+          <w:bCs/>
+        </w:rPr>
+        <w:t xml:space="preserve">Table 5.19: Confidence Engine Output on a Real Scan — OWASP Juice Shop (ZAP + Nuclei, 20 findings). The 5 objectively PoC-confirmed findings are all Confirmed; the technology-detection noise is all Informational.</w:t>
+      </w:r>
+    </w:p>
+    <w:p>
+      <w:pPr>
+        <w:pStyle w:val="BodyText"/>
+      </w:pPr>
+      <w:r>
         <w:drawing>
           <wp:inline>
-            <wp:extent cx="5334000" cy="4057961"/>
+            <wp:extent cx="5334000" cy="6010140"/>
             <wp:effectExtent b="0" l="0" r="0" t="0"/>
-            <wp:docPr descr="Figure 5.5: Confidence-engine evaluation script output (real run)" title="" id="43" name="Picture"/>
+            <wp:docPr descr="Figure 5.5: Real-scan confidence evaluation output" title="" id="43" name="Picture"/>
             <a:graphic>
               <a:graphicData uri="http://schemas.openxmlformats.org/drawingml/2006/picture">
                 <pic:pic>
                   <pic:nvPicPr>
-                    <pic:cNvPr descr="images/conf-eval-terminal.png" id="44" name="Picture"/>
+                    <pic:cNvPr descr="images/conf-realscan-terminal.png" id="44" name="Picture"/>
                     <pic:cNvPicPr>
                       <a:picLocks noChangeArrowheads="1" noChangeAspect="1"/>
                     </pic:cNvPicPr>
@@ -13018,7 +14729,7 @@
                   <pic:spPr bwMode="auto">
                     <a:xfrm>
                       <a:off x="0" y="0"/>
-                      <a:ext cx="5334000" cy="4057961"/>
+                      <a:ext cx="5334000" cy="6010140"/>
                     </a:xfrm>
                     <a:prstGeom prst="rect">
                       <a:avLst/>
@@ -13046,7 +14757,7 @@
           <w:b/>
           <w:bCs/>
         </w:rPr>
-        <w:t xml:space="preserve">Figure 5.5: Evaluation Script Output —</w:t>
+        <w:t xml:space="preserve">Figure 5.5: Real-Scan Evaluation Output —</w:t>
       </w:r>
       <w:r>
         <w:rPr>
@@ -13061,7 +14772,7 @@
           <w:b/>
           <w:bCs/>
         </w:rPr>
-        <w:t xml:space="preserve">evaluate_confidence.py</w:t>
+        <w:t xml:space="preserve">evaluate_realscan.py</w:t>
       </w:r>
       <w:r>
         <w:rPr>
@@ -13075,7 +14786,7 @@
           <w:b/>
           <w:bCs/>
         </w:rPr>
-        <w:t xml:space="preserve">(ROC-AUC, score separation, 'Confirmed' precision, operational triage, threshold sweep, and weight-sensitivity analysis from the real benchmark run)</w:t>
+        <w:t xml:space="preserve">over the OWASP Juice Shop scan (band breakdown, objective PoC confirmations, and the ranked real confidence scores)</w:t>
       </w:r>
     </w:p>
     <w:p>
@@ -13085,20 +14796,186 @@
       <w:r>
         <w:drawing>
           <wp:inline>
-            <wp:extent cx="5334000" cy="4795166"/>
+            <wp:extent cx="5334000" cy="4397593"/>
             <wp:effectExtent b="0" l="0" r="0" t="0"/>
-            <wp:docPr descr="Figure 5.6: Confidence-engine ROC curve" title="" id="46" name="Picture"/>
+            <wp:docPr descr="Figure 5.6: Confidence scores on the real Juice Shop scan" title="" id="46" name="Picture"/>
             <a:graphic>
               <a:graphicData uri="http://schemas.openxmlformats.org/drawingml/2006/picture">
                 <pic:pic>
                   <pic:nvPicPr>
-                    <pic:cNvPr descr="images/conf-roc.png" id="47" name="Picture"/>
+                    <pic:cNvPr descr="images/conf-realscan-scores.png" id="47" name="Picture"/>
                     <pic:cNvPicPr>
                       <a:picLocks noChangeArrowheads="1" noChangeAspect="1"/>
                     </pic:cNvPicPr>
                   </pic:nvPicPr>
                   <pic:blipFill>
                     <a:blip r:embed="rId45"/>
+                    <a:stretch>
+                      <a:fillRect/>
+                    </a:stretch>
+                  </pic:blipFill>
+                  <pic:spPr bwMode="auto">
+                    <a:xfrm>
+                      <a:off x="0" y="0"/>
+                      <a:ext cx="5334000" cy="4397593"/>
+                    </a:xfrm>
+                    <a:prstGeom prst="rect">
+                      <a:avLst/>
+                    </a:prstGeom>
+                    <a:noFill/>
+                    <a:ln w="9525">
+                      <a:noFill/>
+                      <a:headEnd/>
+                      <a:tailEnd/>
+                    </a:ln>
+                  </pic:spPr>
+                </pic:pic>
+              </a:graphicData>
+            </a:graphic>
+          </wp:inline>
+        </w:drawing>
+      </w:r>
+    </w:p>
+    <w:p>
+      <w:pPr>
+        <w:pStyle w:val="BodyText"/>
+      </w:pPr>
+      <w:r>
+        <w:rPr>
+          <w:b/>
+          <w:bCs/>
+        </w:rPr>
+        <w:t xml:space="preserve">Figure 5.6: Confidence Scores on the Real Juice Shop Scan — the five PoC-confirmed findings (green, ≥ 70) are cleanly separated from the technology-detection noise (grey); dashed lines mark the 40 and 70 thresholds</w:t>
+      </w:r>
+    </w:p>
+    <w:p>
+      <w:pPr>
+        <w:pStyle w:val="BodyText"/>
+      </w:pPr>
+      <w:r>
+        <w:rPr>
+          <w:b/>
+          <w:bCs/>
+        </w:rPr>
+        <w:t xml:space="preserve">Supplementary — balanced synthetic benchmark.</w:t>
+      </w:r>
+      <w:r>
+        <w:t xml:space="preserve"> </w:t>
+      </w:r>
+      <w:r>
+        <w:t xml:space="preserve">Because a single clean real scan cannot supply a balanced set of labelled false positives, the engine was additionally measured on a curated benchmark of 32 labelled scenarios (16 true positives, 16 false positives) using</w:t>
+      </w:r>
+      <w:r>
+        <w:t xml:space="preserve"> </w:t>
+      </w:r>
+      <w:r>
+        <w:rPr>
+          <w:rStyle w:val="VerbatimChar"/>
+        </w:rPr>
+        <w:t xml:space="preserve">backend/scripts/evaluate_confidence.py</w:t>
+      </w:r>
+      <w:r>
+        <w:t xml:space="preserve">. It achieved a</w:t>
+      </w:r>
+      <w:r>
+        <w:t xml:space="preserve"> </w:t>
+      </w:r>
+      <w:r>
+        <w:rPr>
+          <w:b/>
+          <w:bCs/>
+        </w:rPr>
+        <w:t xml:space="preserve">ROC-AUC of 0.822</w:t>
+      </w:r>
+      <w:r>
+        <w:t xml:space="preserve"> </w:t>
+      </w:r>
+      <w:r>
+        <w:t xml:space="preserve">(Figure 5.7), with true-positive scores well separated from false-positive scores (mean 61.6 vs 32.0, Figure 5.8); the "Confirmed" band had a</w:t>
+      </w:r>
+      <w:r>
+        <w:t xml:space="preserve"> </w:t>
+      </w:r>
+      <w:r>
+        <w:rPr>
+          <w:b/>
+          <w:bCs/>
+        </w:rPr>
+        <w:t xml:space="preserve">precision of 1.0</w:t>
+      </w:r>
+      <w:r>
+        <w:t xml:space="preserve">, and auto-dismissing the "Not Confirmed" band suppressed</w:t>
+      </w:r>
+      <w:r>
+        <w:t xml:space="preserve"> </w:t>
+      </w:r>
+      <w:r>
+        <w:rPr>
+          <w:b/>
+          <w:bCs/>
+        </w:rPr>
+        <w:t xml:space="preserve">81.2%</w:t>
+      </w:r>
+      <w:r>
+        <w:t xml:space="preserve"> </w:t>
+      </w:r>
+      <w:r>
+        <w:t xml:space="preserve">of the false positives while retaining</w:t>
+      </w:r>
+      <w:r>
+        <w:t xml:space="preserve"> </w:t>
+      </w:r>
+      <w:r>
+        <w:rPr>
+          <w:b/>
+          <w:bCs/>
+        </w:rPr>
+        <w:t xml:space="preserve">75.0%</w:t>
+      </w:r>
+      <w:r>
+        <w:t xml:space="preserve"> </w:t>
+      </w:r>
+      <w:r>
+        <w:t xml:space="preserve">of the true positives. This is a</w:t>
+      </w:r>
+      <w:r>
+        <w:t xml:space="preserve"> </w:t>
+      </w:r>
+      <w:r>
+        <w:rPr>
+          <w:i/>
+          <w:iCs/>
+        </w:rPr>
+        <w:t xml:space="preserve">curated synthetic</w:t>
+      </w:r>
+      <w:r>
+        <w:t xml:space="preserve"> </w:t>
+      </w:r>
+      <w:r>
+        <w:t xml:space="preserve">benchmark (not field-validated), included only to corroborate the real-target result with a balanced label set.</w:t>
+      </w:r>
+    </w:p>
+    <w:p>
+      <w:pPr>
+        <w:pStyle w:val="BodyText"/>
+      </w:pPr>
+      <w:r>
+        <w:drawing>
+          <wp:inline>
+            <wp:extent cx="5334000" cy="4795166"/>
+            <wp:effectExtent b="0" l="0" r="0" t="0"/>
+            <wp:docPr descr="Figure 5.7: Confidence-engine ROC curve on the synthetic benchmark" title="" id="49" name="Picture"/>
+            <a:graphic>
+              <a:graphicData uri="http://schemas.openxmlformats.org/drawingml/2006/picture">
+                <pic:pic>
+                  <pic:nvPicPr>
+                    <pic:cNvPr descr="images/conf-roc.png" id="50" name="Picture"/>
+                    <pic:cNvPicPr>
+                      <a:picLocks noChangeArrowheads="1" noChangeAspect="1"/>
+                    </pic:cNvPicPr>
+                  </pic:nvPicPr>
+                  <pic:blipFill>
+                    <a:blip r:embed="rId48"/>
                     <a:stretch>
                       <a:fillRect/>
                     </a:stretch>
@@ -13134,7 +15011,7 @@
           <w:b/>
           <w:bCs/>
         </w:rPr>
-        <w:t xml:space="preserve">Figure 5.6: Confidence Engine ROC Curve (AUC = 0.822) — the steep initial rise reflects the perfect-precision 'Confirmed' region at a false-positive rate of zero</w:t>
+        <w:t xml:space="preserve">Figure 5.7: (Supplementary) Confidence Engine ROC Curve on the balanced synthetic benchmark (AUC = 0.822)</w:t>
       </w:r>
     </w:p>
     <w:p>
@@ -13146,18 +15023,18 @@
           <wp:inline>
             <wp:extent cx="5334000" cy="2903316"/>
             <wp:effectExtent b="0" l="0" r="0" t="0"/>
-            <wp:docPr descr="Figure 5.7: Confidence score separation between true and false positives" title="" id="49" name="Picture"/>
+            <wp:docPr descr="Figure 5.8: Score separation on the synthetic benchmark" title="" id="52" name="Picture"/>
             <a:graphic>
               <a:graphicData uri="http://schemas.openxmlformats.org/drawingml/2006/picture">
                 <pic:pic>
                   <pic:nvPicPr>
-                    <pic:cNvPr descr="images/conf-separation.png" id="50" name="Picture"/>
+                    <pic:cNvPr descr="images/conf-separation.png" id="53" name="Picture"/>
                     <pic:cNvPicPr>
                       <a:picLocks noChangeArrowheads="1" noChangeAspect="1"/>
                     </pic:cNvPicPr>
                   </pic:nvPicPr>
                   <pic:blipFill>
-                    <a:blip r:embed="rId48"/>
+                    <a:blip r:embed="rId51"/>
                     <a:stretch>
                       <a:fillRect/>
                     </a:stretch>
@@ -13193,7 +15070,7 @@
           <w:b/>
           <w:bCs/>
         </w:rPr>
-        <w:t xml:space="preserve">Figure 5.7: Confidence Score Separation — true positives (mean 61.6) sit clearly above false positives (mean 32.0), with the three classification bands (Not Confirmed &lt; 40, Needs Verification 40–69, Confirmed ≥ 70) shaded</w:t>
+        <w:t xml:space="preserve">Figure 5.8: (Supplementary) Score Separation on the balanced synthetic benchmark — true positives (mean 61.6) versus false positives (mean 32.0)</w:t>
       </w:r>
     </w:p>
     <w:p>
@@ -13211,7 +15088,7 @@
         <w:t xml:space="preserve"> </w:t>
       </w:r>
       <w:r>
-        <w:t xml:space="preserve">Beyond the unit level, the entire pipeline was verified end-to-end against a live, deliberately-vulnerable target (a local OWASP Juice Shop). Table 5.19 records the principal functional/system test cases and their outcomes.</w:t>
+        <w:t xml:space="preserve">Beyond the unit level, the entire pipeline was verified end-to-end against a live, deliberately-vulnerable target (a local OWASP Juice Shop). Table 5.20 records the principal functional/system test cases and their outcomes.</w:t>
       </w:r>
     </w:p>
     <w:tbl>
@@ -13646,12 +15523,12 @@
           <w:b/>
           <w:bCs/>
         </w:rPr>
-        <w:t xml:space="preserve">Table 5.19: Live Functional / System Verification Results</w:t>
+        <w:t xml:space="preserve">Table 5.20: Live Functional / System Verification Results</w:t>
       </w:r>
     </w:p>
-    <w:bookmarkEnd w:id="51"/>
-    <w:bookmarkEnd w:id="52"/>
-    <w:bookmarkStart w:id="53" w:name="X2103990b22303365d04026752791bacc2d669c8"/>
+    <w:bookmarkEnd w:id="54"/>
+    <w:bookmarkEnd w:id="55"/>
+    <w:bookmarkStart w:id="56" w:name="X2103990b22303365d04026752791bacc2d669c8"/>
     <w:p>
       <w:pPr>
         <w:pStyle w:val="Heading3"/>
@@ -13707,7 +15584,7 @@
         <w:t xml:space="preserve"> </w:t>
       </w:r>
       <w:r>
-        <w:t xml:space="preserve">filled with fabricated data. An acceptance-summary template (Table 5.23) aggregates the outcomes once collected.</w:t>
+        <w:t xml:space="preserve">filled with fabricated data. An acceptance-summary template (Table 5.24) aggregates the outcomes once collected.</w:t>
       </w:r>
     </w:p>
     <w:p>
@@ -13930,7 +15807,7 @@
           <w:b/>
           <w:bCs/>
         </w:rPr>
-        <w:t xml:space="preserve">Table 5.20: Tester 1 UAT Results (to be completed)</w:t>
+        <w:t xml:space="preserve">Table 5.21: Tester 1 UAT Results (to be completed)</w:t>
       </w:r>
     </w:p>
     <w:p>
@@ -14145,7 +16022,7 @@
           <w:b/>
           <w:bCs/>
         </w:rPr>
-        <w:t xml:space="preserve">Table 5.21: Tester 2 UAT Results (to be completed)</w:t>
+        <w:t xml:space="preserve">Table 5.22: Tester 2 UAT Results (to be completed)</w:t>
       </w:r>
     </w:p>
     <w:p>
@@ -14360,7 +16237,7 @@
           <w:b/>
           <w:bCs/>
         </w:rPr>
-        <w:t xml:space="preserve">Table 5.22: Tester 3 UAT Results (to be completed)</w:t>
+        <w:t xml:space="preserve">Table 5.23: Tester 3 UAT Results (to be completed)</w:t>
       </w:r>
     </w:p>
     <w:p>
@@ -14378,7 +16255,7 @@
         <w:t xml:space="preserve"> </w:t>
       </w:r>
       <w:r>
-        <w:t xml:space="preserve">Once the forms are collected, aggregate them in Table 5.23: the mean UI rating (out of 5) and the proportion of "Yes" responses per functionality group. A criterion is considered</w:t>
+        <w:t xml:space="preserve">Once the forms are collected, aggregate them in Table 5.24: the mean UI rating (out of 5) and the proportion of "Yes" responses per functionality group. A criterion is considered</w:t>
       </w:r>
       <w:r>
         <w:t xml:space="preserve"> </w:t>
@@ -14545,11 +16422,11 @@
           <w:b/>
           <w:bCs/>
         </w:rPr>
-        <w:t xml:space="preserve">Table 5.23: UAT Acceptance Summary (to be completed)</w:t>
+        <w:t xml:space="preserve">Table 5.24: UAT Acceptance Summary (to be completed)</w:t>
       </w:r>
     </w:p>
-    <w:bookmarkEnd w:id="53"/>
-    <w:bookmarkStart w:id="54" w:name="Xdf6580e43cd4db41cb4f0594ac1084bceb4f354"/>
+    <w:bookmarkEnd w:id="56"/>
+    <w:bookmarkStart w:id="57" w:name="Xdf6580e43cd4db41cb4f0594ac1084bceb4f354"/>
     <w:p>
       <w:pPr>
         <w:pStyle w:val="Heading3"/>
@@ -14581,7 +16458,20 @@
         <w:t xml:space="preserve"> </w:t>
       </w:r>
       <w:r>
-        <w:t xml:space="preserve">established the correctness of every component with reproducible evidence. All fourteen component groups pass their tests (97/97 in total), and the technique repeatedly proved its value during development by isolating individual defects — for example, the CWE-mapper regressions (CWE-21, CWE-22) and the CWE-0 placeholder handling (NORM-1 to NORM-11) were caught and fixed as unit-level failures before they could affect the integrated pipeline. The machine-learning model generalises with 99.68% accuracy on unseen real data, with only benign off-by-one-band errors, and the Confidence Engine achieves perfect precision on its "Confirmed" verdict on the benchmark, meaning an analyst can trust that a "Confirmed" label is not a false alarm. The live verification (Table 5.19) confirmed that these component-level guarantees hold when the components are integrated and driven against a real target: the full scan-to-report workflow completed, the SQL injection was actively confirmed, and the report was produced. An honest limitation is that the confidence benchmark is a</w:t>
+        <w:t xml:space="preserve">established the correctness of every component with reproducible evidence. All fourteen component groups pass their tests (97/97 in total), and the technique repeatedly proved its value during development by isolating individual defects — for example, the CWE-mapper regressions (CWE-21, CWE-22) and the CWE-0 placeholder handling (NORM-1 to NORM-11) were caught and fixed as unit-level failures before they could affect the integrated pipeline. The machine-learning model generalises with 99.68% accuracy on unseen real data, with only benign off-by-one-band errors. Most importantly, the Confidence Engine was validated on a</w:t>
+      </w:r>
+      <w:r>
+        <w:t xml:space="preserve"> </w:t>
+      </w:r>
+      <w:r>
+        <w:rPr>
+          <w:b/>
+          <w:bCs/>
+        </w:rPr>
+        <w:t xml:space="preserve">real target</w:t>
+      </w:r>
+      <w:r>
+        <w:t xml:space="preserve">: on the actual OWASP Juice Shop scan (Table 5.19, Figures 5.5–5.6) it placed all five objectively PoC-confirmed findings — including the actively-exploited SQL injection — in the Confirmed band (mean 79.5) while demoting every technology-detection noise item to Informational (mean 11.8), a clean real-world separation. The live verification (Table 5.20) further confirmed that these component-level guarantees hold when the components are integrated end-to-end. An honest limitation is that a single clean scan contains few outright scanner false positives, so false-positive</w:t>
       </w:r>
       <w:r>
         <w:t xml:space="preserve"> </w:t>
@@ -14591,13 +16481,13 @@
           <w:i/>
           <w:iCs/>
         </w:rPr>
-        <w:t xml:space="preserve">curated synthetic</w:t>
+        <w:t xml:space="preserve">suppression</w:t>
       </w:r>
       <w:r>
         <w:t xml:space="preserve"> </w:t>
       </w:r>
       <w:r>
-        <w:t xml:space="preserve">set rather than field-validated data, and the ML task (predicting a severity band from CVSS sub-metrics) is close to deterministic; both points are stated plainly so the strong numbers are not over-claimed. The genuinely novel value therefore lies in the confidence-scoring and false-positive-suppression behaviour, which the results support.</w:t>
+        <w:t xml:space="preserve">in isolation is shown on a supplementary balanced synthetic benchmark rather than the real scan, and the ML task (predicting a severity band from CVSS sub-metrics) is close to deterministic; both points are stated plainly so the strong numbers are not over-claimed. The genuinely novel value therefore lies in the confidence-scoring and false-positive-suppression behaviour, which the results support.</w:t>
       </w:r>
     </w:p>
     <w:p>
@@ -14635,9 +16525,9 @@
         </w:pict>
       </w:r>
     </w:p>
-    <w:bookmarkEnd w:id="54"/>
-    <w:bookmarkEnd w:id="55"/>
-    <w:bookmarkStart w:id="56" w:name="X32768a294109eb22590a37edaae685c4b9e19bc"/>
+    <w:bookmarkEnd w:id="57"/>
+    <w:bookmarkEnd w:id="58"/>
+    <w:bookmarkStart w:id="59" w:name="X32768a294109eb22590a37edaae685c4b9e19bc"/>
     <w:p>
       <w:pPr>
         <w:pStyle w:val="Heading2"/>
@@ -14712,7 +16602,7 @@
         <w:t xml:space="preserve"> </w:t>
       </w:r>
       <w:r>
-        <w:t xml:space="preserve">on 21,697 unseen real records with only benign off-by-one-band errors, the Confidence Engine reaches</w:t>
+        <w:t xml:space="preserve">on 21,697 unseen real records with only benign off-by-one-band errors, and the Confidence Engine was validated on a</w:t>
       </w:r>
       <w:r>
         <w:t xml:space="preserve"> </w:t>
@@ -14722,13 +16612,13 @@
           <w:b/>
           <w:bCs/>
         </w:rPr>
-        <w:t xml:space="preserve">ROC-AUC ≈ 0.82 with perfect "Confirmed" precision</w:t>
+        <w:t xml:space="preserve">real OWASP Juice Shop scan</w:t>
       </w:r>
       <w:r>
         <w:t xml:space="preserve"> </w:t>
       </w:r>
       <w:r>
-        <w:t xml:space="preserve">and ~81% false-positive suppression, and the full pipeline was verified end-to-end against a live target through to a generated PDF report.</w:t>
+        <w:t xml:space="preserve">where it placed all five objectively PoC-confirmed findings (including the actively-exploited SQL injection) in the Confirmed band and every technology-detection noise item in the Informational band — a clean real-world separation, corroborated by a balanced synthetic benchmark (ROC-AUC 0.822, perfect "Confirmed" precision, ~81% false-positive suppression). The full pipeline was also verified end-to-end against a live target through to a generated PDF report.</w:t>
       </w:r>
       <w:r>
         <w:t xml:space="preserve"> </w:t>
@@ -14755,8 +16645,8 @@
         <w:t xml:space="preserve">Together the two techniques address both correctness and acceptance: the white-box results demonstrate that every component computes trustworthy, evidence-backed output, while the user acceptance testing establishes that the intended users can operate the system and accept it in practice. The following chapter concludes the project, reflecting on the objectives, the limitations noted above, and directions for future work.</w:t>
       </w:r>
     </w:p>
-    <w:bookmarkEnd w:id="56"/>
-    <w:bookmarkEnd w:id="57"/>
+    <w:bookmarkEnd w:id="59"/>
+    <w:bookmarkEnd w:id="60"/>
     <w:sectPr>
       <w:footnotePr>
         <w:numRestart w:val="eachSect"/>

</xml_diff>

<commit_message>
docs: remove synthetic-benchmark figures from Chapter 5 confidence eval
Drop the supplementary balanced-synthetic-benchmark paragraph and Figures
5.7-5.8 (ROC + separation); the Confidence Engine evaluation now rests solely
on the real OWASP Juice Shop scan (Table 5.19, Figures 5.5-5.6). Cleaned up
discussion/summary references and deleted the unused synthetic image files.
</commit_message>
<xml_diff>
--- a/docs/Chapter_5_Result_and_Discussion.docx
+++ b/docs/Chapter_5_Result_and_Discussion.docx
@@ -2,7 +2,7 @@
 <file path=word/document.xml><?xml version="1.0" encoding="utf-8"?>
 <w:document xmlns:w="http://schemas.openxmlformats.org/wordprocessingml/2006/main" xmlns:m="http://schemas.openxmlformats.org/officeDocument/2006/math" xmlns:r="http://schemas.openxmlformats.org/officeDocument/2006/relationships" xmlns:o="urn:schemas-microsoft-com:office:office" xmlns:v="urn:schemas-microsoft-com:vml" xmlns:w10="urn:schemas-microsoft-com:office:word" xmlns:a="http://schemas.openxmlformats.org/drawingml/2006/main" xmlns:pic="http://schemas.openxmlformats.org/drawingml/2006/picture" xmlns:wp="http://schemas.openxmlformats.org/drawingml/2006/wordprocessingDrawing">
   <w:body>
-    <w:bookmarkStart w:id="60" w:name="chapter-5-result-and-discussion"/>
+    <w:bookmarkStart w:id="54" w:name="chapter-5-result-and-discussion"/>
     <w:p>
       <w:pPr>
         <w:pStyle w:val="Heading1"/>
@@ -3184,7 +3184,7 @@
     <w:bookmarkEnd w:id="17"/>
     <w:bookmarkEnd w:id="18"/>
     <w:bookmarkEnd w:id="19"/>
-    <w:bookmarkStart w:id="58" w:name="Xdf8304cc98c46e7ba29fa90a2df6e3c66112698"/>
+    <w:bookmarkStart w:id="52" w:name="Xdf8304cc98c46e7ba29fa90a2df6e3c66112698"/>
     <w:p>
       <w:pPr>
         <w:pStyle w:val="Heading2"/>
@@ -3193,7 +3193,7 @@
         <w:t xml:space="preserve">5.3 System Testing and Discussion</w:t>
       </w:r>
     </w:p>
-    <w:bookmarkStart w:id="55" w:name="Xb0ff592cf76b56e6bfcd93a7bb3d4b0b056114d"/>
+    <w:bookmarkStart w:id="49" w:name="Xb0ff592cf76b56e6bfcd93a7bb3d4b0b056114d"/>
     <w:p>
       <w:pPr>
         <w:pStyle w:val="Heading3"/>
@@ -11639,7 +11639,7 @@
       </w:r>
     </w:p>
     <w:bookmarkEnd w:id="32"/>
-    <w:bookmarkStart w:id="54" w:name="component-14--data-management"/>
+    <w:bookmarkStart w:id="48" w:name="component-14--data-management"/>
     <w:p>
       <w:pPr>
         <w:pStyle w:val="Heading4"/>
@@ -13094,7 +13094,7 @@
         <w:t xml:space="preserve"> </w:t>
       </w:r>
       <w:r>
-        <w:t xml:space="preserve">genuine findings above noise — rather than an independent predictor. Also, a single clean scan of an accurate scanner target contains few outright scanner</w:t>
+        <w:t xml:space="preserve">genuine findings above noise — rather than an independent predictor. A single clean scan of an accurate scanner target also contains few outright scanner</w:t>
       </w:r>
       <w:r>
         <w:t xml:space="preserve"> </w:t>
@@ -13107,7 +13107,7 @@
         <w:t xml:space="preserve">false positives</w:t>
       </w:r>
       <w:r>
-        <w:t xml:space="preserve">, so it cannot measure false-positive</w:t>
+        <w:t xml:space="preserve">, so this evaluation demonstrates the engine's prioritisation on real data rather than false-positive</w:t>
       </w:r>
       <w:r>
         <w:t xml:space="preserve"> </w:t>
@@ -13123,7 +13123,7 @@
         <w:t xml:space="preserve"> </w:t>
       </w:r>
       <w:r>
-        <w:t xml:space="preserve">in isolation; the balanced benchmark below is retained as supplementary evidence for that specific property.</w:t>
+        <w:t xml:space="preserve">in isolation.</w:t>
       </w:r>
     </w:p>
     <w:tbl>
@@ -14857,231 +14857,6 @@
           <w:b/>
           <w:bCs/>
         </w:rPr>
-        <w:t xml:space="preserve">Supplementary — balanced synthetic benchmark.</w:t>
-      </w:r>
-      <w:r>
-        <w:t xml:space="preserve"> </w:t>
-      </w:r>
-      <w:r>
-        <w:t xml:space="preserve">Because a single clean real scan cannot supply a balanced set of labelled false positives, the engine was additionally measured on a curated benchmark of 32 labelled scenarios (16 true positives, 16 false positives) using</w:t>
-      </w:r>
-      <w:r>
-        <w:t xml:space="preserve"> </w:t>
-      </w:r>
-      <w:r>
-        <w:rPr>
-          <w:rStyle w:val="VerbatimChar"/>
-        </w:rPr>
-        <w:t xml:space="preserve">backend/scripts/evaluate_confidence.py</w:t>
-      </w:r>
-      <w:r>
-        <w:t xml:space="preserve">. It achieved a</w:t>
-      </w:r>
-      <w:r>
-        <w:t xml:space="preserve"> </w:t>
-      </w:r>
-      <w:r>
-        <w:rPr>
-          <w:b/>
-          <w:bCs/>
-        </w:rPr>
-        <w:t xml:space="preserve">ROC-AUC of 0.822</w:t>
-      </w:r>
-      <w:r>
-        <w:t xml:space="preserve"> </w:t>
-      </w:r>
-      <w:r>
-        <w:t xml:space="preserve">(Figure 5.7), with true-positive scores well separated from false-positive scores (mean 61.6 vs 32.0, Figure 5.8); the "Confirmed" band had a</w:t>
-      </w:r>
-      <w:r>
-        <w:t xml:space="preserve"> </w:t>
-      </w:r>
-      <w:r>
-        <w:rPr>
-          <w:b/>
-          <w:bCs/>
-        </w:rPr>
-        <w:t xml:space="preserve">precision of 1.0</w:t>
-      </w:r>
-      <w:r>
-        <w:t xml:space="preserve">, and auto-dismissing the "Not Confirmed" band suppressed</w:t>
-      </w:r>
-      <w:r>
-        <w:t xml:space="preserve"> </w:t>
-      </w:r>
-      <w:r>
-        <w:rPr>
-          <w:b/>
-          <w:bCs/>
-        </w:rPr>
-        <w:t xml:space="preserve">81.2%</w:t>
-      </w:r>
-      <w:r>
-        <w:t xml:space="preserve"> </w:t>
-      </w:r>
-      <w:r>
-        <w:t xml:space="preserve">of the false positives while retaining</w:t>
-      </w:r>
-      <w:r>
-        <w:t xml:space="preserve"> </w:t>
-      </w:r>
-      <w:r>
-        <w:rPr>
-          <w:b/>
-          <w:bCs/>
-        </w:rPr>
-        <w:t xml:space="preserve">75.0%</w:t>
-      </w:r>
-      <w:r>
-        <w:t xml:space="preserve"> </w:t>
-      </w:r>
-      <w:r>
-        <w:t xml:space="preserve">of the true positives. This is a</w:t>
-      </w:r>
-      <w:r>
-        <w:t xml:space="preserve"> </w:t>
-      </w:r>
-      <w:r>
-        <w:rPr>
-          <w:i/>
-          <w:iCs/>
-        </w:rPr>
-        <w:t xml:space="preserve">curated synthetic</w:t>
-      </w:r>
-      <w:r>
-        <w:t xml:space="preserve"> </w:t>
-      </w:r>
-      <w:r>
-        <w:t xml:space="preserve">benchmark (not field-validated), included only to corroborate the real-target result with a balanced label set.</w:t>
-      </w:r>
-    </w:p>
-    <w:p>
-      <w:pPr>
-        <w:pStyle w:val="BodyText"/>
-      </w:pPr>
-      <w:r>
-        <w:drawing>
-          <wp:inline>
-            <wp:extent cx="5334000" cy="4795166"/>
-            <wp:effectExtent b="0" l="0" r="0" t="0"/>
-            <wp:docPr descr="Figure 5.7: Confidence-engine ROC curve on the synthetic benchmark" title="" id="49" name="Picture"/>
-            <a:graphic>
-              <a:graphicData uri="http://schemas.openxmlformats.org/drawingml/2006/picture">
-                <pic:pic>
-                  <pic:nvPicPr>
-                    <pic:cNvPr descr="images/conf-roc.png" id="50" name="Picture"/>
-                    <pic:cNvPicPr>
-                      <a:picLocks noChangeArrowheads="1" noChangeAspect="1"/>
-                    </pic:cNvPicPr>
-                  </pic:nvPicPr>
-                  <pic:blipFill>
-                    <a:blip r:embed="rId48"/>
-                    <a:stretch>
-                      <a:fillRect/>
-                    </a:stretch>
-                  </pic:blipFill>
-                  <pic:spPr bwMode="auto">
-                    <a:xfrm>
-                      <a:off x="0" y="0"/>
-                      <a:ext cx="5334000" cy="4795166"/>
-                    </a:xfrm>
-                    <a:prstGeom prst="rect">
-                      <a:avLst/>
-                    </a:prstGeom>
-                    <a:noFill/>
-                    <a:ln w="9525">
-                      <a:noFill/>
-                      <a:headEnd/>
-                      <a:tailEnd/>
-                    </a:ln>
-                  </pic:spPr>
-                </pic:pic>
-              </a:graphicData>
-            </a:graphic>
-          </wp:inline>
-        </w:drawing>
-      </w:r>
-    </w:p>
-    <w:p>
-      <w:pPr>
-        <w:pStyle w:val="BodyText"/>
-      </w:pPr>
-      <w:r>
-        <w:rPr>
-          <w:b/>
-          <w:bCs/>
-        </w:rPr>
-        <w:t xml:space="preserve">Figure 5.7: (Supplementary) Confidence Engine ROC Curve on the balanced synthetic benchmark (AUC = 0.822)</w:t>
-      </w:r>
-    </w:p>
-    <w:p>
-      <w:pPr>
-        <w:pStyle w:val="BodyText"/>
-      </w:pPr>
-      <w:r>
-        <w:drawing>
-          <wp:inline>
-            <wp:extent cx="5334000" cy="2903316"/>
-            <wp:effectExtent b="0" l="0" r="0" t="0"/>
-            <wp:docPr descr="Figure 5.8: Score separation on the synthetic benchmark" title="" id="52" name="Picture"/>
-            <a:graphic>
-              <a:graphicData uri="http://schemas.openxmlformats.org/drawingml/2006/picture">
-                <pic:pic>
-                  <pic:nvPicPr>
-                    <pic:cNvPr descr="images/conf-separation.png" id="53" name="Picture"/>
-                    <pic:cNvPicPr>
-                      <a:picLocks noChangeArrowheads="1" noChangeAspect="1"/>
-                    </pic:cNvPicPr>
-                  </pic:nvPicPr>
-                  <pic:blipFill>
-                    <a:blip r:embed="rId51"/>
-                    <a:stretch>
-                      <a:fillRect/>
-                    </a:stretch>
-                  </pic:blipFill>
-                  <pic:spPr bwMode="auto">
-                    <a:xfrm>
-                      <a:off x="0" y="0"/>
-                      <a:ext cx="5334000" cy="2903316"/>
-                    </a:xfrm>
-                    <a:prstGeom prst="rect">
-                      <a:avLst/>
-                    </a:prstGeom>
-                    <a:noFill/>
-                    <a:ln w="9525">
-                      <a:noFill/>
-                      <a:headEnd/>
-                      <a:tailEnd/>
-                    </a:ln>
-                  </pic:spPr>
-                </pic:pic>
-              </a:graphicData>
-            </a:graphic>
-          </wp:inline>
-        </w:drawing>
-      </w:r>
-    </w:p>
-    <w:p>
-      <w:pPr>
-        <w:pStyle w:val="BodyText"/>
-      </w:pPr>
-      <w:r>
-        <w:rPr>
-          <w:b/>
-          <w:bCs/>
-        </w:rPr>
-        <w:t xml:space="preserve">Figure 5.8: (Supplementary) Score Separation on the balanced synthetic benchmark — true positives (mean 61.6) versus false positives (mean 32.0)</w:t>
-      </w:r>
-    </w:p>
-    <w:p>
-      <w:pPr>
-        <w:pStyle w:val="BodyText"/>
-      </w:pPr>
-      <w:r>
-        <w:rPr>
-          <w:b/>
-          <w:bCs/>
-        </w:rPr>
         <w:t xml:space="preserve">Live functional / system verification (real).</w:t>
       </w:r>
       <w:r>
@@ -15526,9 +15301,9 @@
         <w:t xml:space="preserve">Table 5.20: Live Functional / System Verification Results</w:t>
       </w:r>
     </w:p>
-    <w:bookmarkEnd w:id="54"/>
-    <w:bookmarkEnd w:id="55"/>
-    <w:bookmarkStart w:id="56" w:name="X2103990b22303365d04026752791bacc2d669c8"/>
+    <w:bookmarkEnd w:id="48"/>
+    <w:bookmarkEnd w:id="49"/>
+    <w:bookmarkStart w:id="50" w:name="X2103990b22303365d04026752791bacc2d669c8"/>
     <w:p>
       <w:pPr>
         <w:pStyle w:val="Heading3"/>
@@ -16425,8 +16200,8 @@
         <w:t xml:space="preserve">Table 5.24: UAT Acceptance Summary (to be completed)</w:t>
       </w:r>
     </w:p>
-    <w:bookmarkEnd w:id="56"/>
-    <w:bookmarkStart w:id="57" w:name="Xdf6580e43cd4db41cb4f0594ac1084bceb4f354"/>
+    <w:bookmarkEnd w:id="50"/>
+    <w:bookmarkStart w:id="51" w:name="Xdf6580e43cd4db41cb4f0594ac1084bceb4f354"/>
     <w:p>
       <w:pPr>
         <w:pStyle w:val="Heading3"/>
@@ -16471,7 +16246,7 @@
         <w:t xml:space="preserve">real target</w:t>
       </w:r>
       <w:r>
-        <w:t xml:space="preserve">: on the actual OWASP Juice Shop scan (Table 5.19, Figures 5.5–5.6) it placed all five objectively PoC-confirmed findings — including the actively-exploited SQL injection — in the Confirmed band (mean 79.5) while demoting every technology-detection noise item to Informational (mean 11.8), a clean real-world separation. The live verification (Table 5.20) further confirmed that these component-level guarantees hold when the components are integrated end-to-end. An honest limitation is that a single clean scan contains few outright scanner false positives, so false-positive</w:t>
+        <w:t xml:space="preserve">: on the actual OWASP Juice Shop scan (Table 5.19, Figures 5.5–5.6) it placed all five objectively PoC-confirmed findings — including the actively-exploited SQL injection — in the Confirmed band (mean 79.5) while demoting every technology-detection noise item to Informational (mean 11.8), a clean real-world separation. The live verification (Table 5.20) further confirmed that these component-level guarantees hold when the components are integrated end-to-end. An honest limitation is that a single clean scan contains few outright scanner false positives, so the real-target evaluation demonstrates the engine's prioritisation of genuine findings above noise rather than false-positive</w:t>
       </w:r>
       <w:r>
         <w:t xml:space="preserve"> </w:t>
@@ -16487,7 +16262,7 @@
         <w:t xml:space="preserve"> </w:t>
       </w:r>
       <w:r>
-        <w:t xml:space="preserve">in isolation is shown on a supplementary balanced synthetic benchmark rather than the real scan, and the ML task (predicting a severity band from CVSS sub-metrics) is close to deterministic; both points are stated plainly so the strong numbers are not over-claimed. The genuinely novel value therefore lies in the confidence-scoring and false-positive-suppression behaviour, which the results support.</w:t>
+        <w:t xml:space="preserve">in isolation, and the ML task (predicting a severity band from CVSS sub-metrics) is close to deterministic; both points are stated plainly so the strong numbers are not over-claimed. The genuinely novel value therefore lies in the confidence-scoring and false-positive-suppression behaviour, which the results support.</w:t>
       </w:r>
     </w:p>
     <w:p>
@@ -16525,9 +16300,9 @@
         </w:pict>
       </w:r>
     </w:p>
-    <w:bookmarkEnd w:id="57"/>
-    <w:bookmarkEnd w:id="58"/>
-    <w:bookmarkStart w:id="59" w:name="X32768a294109eb22590a37edaae685c4b9e19bc"/>
+    <w:bookmarkEnd w:id="51"/>
+    <w:bookmarkEnd w:id="52"/>
+    <w:bookmarkStart w:id="53" w:name="X32768a294109eb22590a37edaae685c4b9e19bc"/>
     <w:p>
       <w:pPr>
         <w:pStyle w:val="Heading2"/>
@@ -16618,7 +16393,7 @@
         <w:t xml:space="preserve"> </w:t>
       </w:r>
       <w:r>
-        <w:t xml:space="preserve">where it placed all five objectively PoC-confirmed findings (including the actively-exploited SQL injection) in the Confirmed band and every technology-detection noise item in the Informational band — a clean real-world separation, corroborated by a balanced synthetic benchmark (ROC-AUC 0.822, perfect "Confirmed" precision, ~81% false-positive suppression). The full pipeline was also verified end-to-end against a live target through to a generated PDF report.</w:t>
+        <w:t xml:space="preserve">where it placed all five objectively PoC-confirmed findings (including the actively-exploited SQL injection) in the Confirmed band and every technology-detection noise item in the Informational band — a clean real-world separation. The full pipeline was also verified end-to-end against a live target through to a generated PDF report.</w:t>
       </w:r>
       <w:r>
         <w:t xml:space="preserve"> </w:t>
@@ -16645,8 +16420,8 @@
         <w:t xml:space="preserve">Together the two techniques address both correctness and acceptance: the white-box results demonstrate that every component computes trustworthy, evidence-backed output, while the user acceptance testing establishes that the intended users can operate the system and accept it in practice. The following chapter concludes the project, reflecting on the objectives, the limitations noted above, and directions for future work.</w:t>
       </w:r>
     </w:p>
-    <w:bookmarkEnd w:id="59"/>
-    <w:bookmarkEnd w:id="60"/>
+    <w:bookmarkEnd w:id="53"/>
+    <w:bookmarkEnd w:id="54"/>
     <w:sectPr>
       <w:footnotePr>
         <w:numRestart w:val="eachSect"/>

</xml_diff>

<commit_message>
refactor: remove synthetic confidence benchmark from code
- Delete scripts/evaluate_confidence.py and the curated synthetic benchmark
  (labelled_findings.build_benchmark + its 32 labelled scenarios).
- Keep the FindingStub unit-test double, moved to app/engines/eval/finding_stub.py.
- Drop the benchmark-dependent test (test_confidence_separates_benchmark);
  suite is now 96 tests, all passing (confidence module 9 -> 8).
- Confidence Engine is evaluated on REAL scans only (scripts/evaluate_realscan.py).
- Update Chapter 5 (97->96, remove CONF-9 row) and ARCHITECTURE.md accordingly.
</commit_message>
<xml_diff>
--- a/docs/Chapter_5_Result_and_Discussion.docx
+++ b/docs/Chapter_5_Result_and_Discussion.docx
@@ -1067,7 +1067,7 @@
               <w:jc w:val="center"/>
             </w:pPr>
             <w:r>
-              <w:t xml:space="preserve">9</w:t>
+              <w:t xml:space="preserve">8</w:t>
             </w:r>
           </w:p>
         </w:tc>
@@ -1366,7 +1366,7 @@
                 <w:b/>
                 <w:bCs/>
               </w:rPr>
-              <w:t xml:space="preserve">97</w:t>
+              <w:t xml:space="preserve">96</w:t>
             </w:r>
           </w:p>
         </w:tc>
@@ -3229,7 +3229,7 @@
           <w:b/>
           <w:bCs/>
         </w:rPr>
-        <w:t xml:space="preserve">All 97 tests pass.</w:t>
+        <w:t xml:space="preserve">All 96 tests pass.</w:t>
       </w:r>
       <w:r>
         <w:t xml:space="preserve"> </w:t>
@@ -9519,74 +9519,6 @@
             </w:pPr>
             <w:r>
               <w:t xml:space="preserve">factor raw_score = 50.0 (neutral, no penalty)</w:t>
-            </w:r>
-          </w:p>
-        </w:tc>
-        <w:tc>
-          <w:tcPr/>
-          <w:p>
-            <w:pPr>
-              <w:pStyle w:val="Compact"/>
-            </w:pPr>
-            <w:r>
-              <w:t xml:space="preserve">As expected</w:t>
-            </w:r>
-          </w:p>
-        </w:tc>
-        <w:tc>
-          <w:tcPr/>
-          <w:p>
-            <w:pPr>
-              <w:pStyle w:val="Compact"/>
-            </w:pPr>
-            <w:r>
-              <w:t xml:space="preserve">Pass</w:t>
-            </w:r>
-          </w:p>
-        </w:tc>
-      </w:tr>
-      <w:tr>
-        <w:tc>
-          <w:tcPr/>
-          <w:p>
-            <w:pPr>
-              <w:pStyle w:val="Compact"/>
-            </w:pPr>
-            <w:r>
-              <w:t xml:space="preserve">CONF-9</w:t>
-            </w:r>
-          </w:p>
-        </w:tc>
-        <w:tc>
-          <w:tcPr/>
-          <w:p>
-            <w:pPr>
-              <w:pStyle w:val="Compact"/>
-            </w:pPr>
-            <w:r>
-              <w:t xml:space="preserve">Separates the benchmark</w:t>
-            </w:r>
-          </w:p>
-        </w:tc>
-        <w:tc>
-          <w:tcPr/>
-          <w:p>
-            <w:pPr>
-              <w:pStyle w:val="Compact"/>
-            </w:pPr>
-            <w:r>
-              <w:t xml:space="preserve">full labelled benchmark</w:t>
-            </w:r>
-          </w:p>
-        </w:tc>
-        <w:tc>
-          <w:tcPr/>
-          <w:p>
-            <w:pPr>
-              <w:pStyle w:val="Compact"/>
-            </w:pPr>
-            <w:r>
-              <w:t xml:space="preserve">mean(TP) &gt; mean(FP) + 15</w:t>
             </w:r>
           </w:p>
         </w:tc>
@@ -16233,7 +16165,7 @@
         <w:t xml:space="preserve"> </w:t>
       </w:r>
       <w:r>
-        <w:t xml:space="preserve">established the correctness of every component with reproducible evidence. All fourteen component groups pass their tests (97/97 in total), and the technique repeatedly proved its value during development by isolating individual defects — for example, the CWE-mapper regressions (CWE-21, CWE-22) and the CWE-0 placeholder handling (NORM-1 to NORM-11) were caught and fixed as unit-level failures before they could affect the integrated pipeline. The machine-learning model generalises with 99.68% accuracy on unseen real data, with only benign off-by-one-band errors. Most importantly, the Confidence Engine was validated on a</w:t>
+        <w:t xml:space="preserve">established the correctness of every component with reproducible evidence. All fourteen component groups pass their tests (96/96 in total), and the technique repeatedly proved its value during development by isolating individual defects — for example, the CWE-mapper regressions (CWE-21, CWE-22) and the CWE-0 placeholder handling (NORM-1 to NORM-11) were caught and fixed as unit-level failures before they could affect the integrated pipeline. The machine-learning model generalises with 99.68% accuracy on unseen real data, with only benign off-by-one-band errors. Most importantly, the Confidence Engine was validated on a</w:t>
       </w:r>
       <w:r>
         <w:t xml:space="preserve"> </w:t>
@@ -16355,7 +16287,7 @@
           <w:b/>
           <w:bCs/>
         </w:rPr>
-        <w:t xml:space="preserve">97 automated unit and integration tests pass</w:t>
+        <w:t xml:space="preserve">96 automated unit and integration tests pass</w:t>
       </w:r>
       <w:r>
         <w:t xml:space="preserve"> </w:t>

</xml_diff>

<commit_message>
docs: add Test Plan section to Chapter 5 (after the introduction)
Insert a new 5.2 Test Plan section (objectives, scope in/out, techniques,
environment, test data, participants, pass/fail criteria, approach/schedule,
deliverables, assumptions/risks) as an overview table. Renumbered the
following sections and their cross-references: Testing Selection & Design
5.2->5.3, System Testing & Discussion 5.3->5.4, Summary 5.4->5.5 (incl.
subsections and inline section refs). Table/Figure numbering left unchanged
(the plan uses an unnumbered table). Rebuilt .docx.
</commit_message>
<xml_diff>
--- a/docs/Chapter_5_Result_and_Discussion.docx
+++ b/docs/Chapter_5_Result_and_Discussion.docx
@@ -2,7 +2,7 @@
 <file path=word/document.xml><?xml version="1.0" encoding="utf-8"?>
 <w:document xmlns:w="http://schemas.openxmlformats.org/wordprocessingml/2006/main" xmlns:m="http://schemas.openxmlformats.org/officeDocument/2006/math" xmlns:r="http://schemas.openxmlformats.org/officeDocument/2006/relationships" xmlns:o="urn:schemas-microsoft-com:office:office" xmlns:v="urn:schemas-microsoft-com:vml" xmlns:w10="urn:schemas-microsoft-com:office:word" xmlns:a="http://schemas.openxmlformats.org/drawingml/2006/main" xmlns:pic="http://schemas.openxmlformats.org/drawingml/2006/picture" xmlns:wp="http://schemas.openxmlformats.org/drawingml/2006/wordprocessingDrawing">
   <w:body>
-    <w:bookmarkStart w:id="54" w:name="chapter-5-result-and-discussion"/>
+    <w:bookmarkStart w:id="55" w:name="chapter-5-result-and-discussion"/>
     <w:p>
       <w:pPr>
         <w:pStyle w:val="Heading1"/>
@@ -159,7 +159,7 @@
         <w:pStyle w:val="FirstParagraph"/>
       </w:pPr>
       <w:r>
-        <w:t xml:space="preserve">Section 5.2 explains the selection and design of both techniques; Section 5.3 reports and discusses their execution and results; and Section 5.4 summarises the outcome.</w:t>
+        <w:t xml:space="preserve">Section 5.2 sets out the test plan; Section 5.3 explains the selection and design of both techniques; Section 5.4 reports and discusses their execution and results; and Section 5.5 summarises the outcome.</w:t>
       </w:r>
     </w:p>
     <w:p>
@@ -170,22 +170,13 @@
       </w:r>
     </w:p>
     <w:bookmarkEnd w:id="9"/>
-    <w:bookmarkStart w:id="19" w:name="X4339ec0b8a966f235d1de9ab20b0fdabe2bd102"/>
+    <w:bookmarkStart w:id="10" w:name="Xde89ad211653bc8f313907904a1e5e44b4a49ac"/>
     <w:p>
       <w:pPr>
         <w:pStyle w:val="Heading2"/>
       </w:pPr>
       <w:r>
-        <w:t xml:space="preserve">5.2 Testing Selection and Design</w:t>
-      </w:r>
-    </w:p>
-    <w:bookmarkStart w:id="15" w:name="Xf5be59b7e0e0d49fca4e3693443679ae6a9ee47"/>
-    <w:p>
-      <w:pPr>
-        <w:pStyle w:val="Heading3"/>
-      </w:pPr>
-      <w:r>
-        <w:t xml:space="preserve">5.2.1 Selection of Suitable Testing</w:t>
+        <w:t xml:space="preserve">5.2 Test Plan</w:t>
       </w:r>
     </w:p>
     <w:p>
@@ -193,6 +184,640 @@
         <w:pStyle w:val="FirstParagraph"/>
       </w:pPr>
       <w:r>
+        <w:t xml:space="preserve">Before any testing was carried out, a test plan was drawn up to define</w:t>
+      </w:r>
+      <w:r>
+        <w:t xml:space="preserve"> </w:t>
+      </w:r>
+      <w:r>
+        <w:rPr>
+          <w:i/>
+          <w:iCs/>
+        </w:rPr>
+        <w:t xml:space="preserve">what</w:t>
+      </w:r>
+      <w:r>
+        <w:t xml:space="preserve"> </w:t>
+      </w:r>
+      <w:r>
+        <w:t xml:space="preserve">would be tested,</w:t>
+      </w:r>
+      <w:r>
+        <w:t xml:space="preserve"> </w:t>
+      </w:r>
+      <w:r>
+        <w:rPr>
+          <w:i/>
+          <w:iCs/>
+        </w:rPr>
+        <w:t xml:space="preserve">how</w:t>
+      </w:r>
+      <w:r>
+        <w:t xml:space="preserve">,</w:t>
+      </w:r>
+      <w:r>
+        <w:t xml:space="preserve"> </w:t>
+      </w:r>
+      <w:r>
+        <w:rPr>
+          <w:i/>
+          <w:iCs/>
+        </w:rPr>
+        <w:t xml:space="preserve">by whom</w:t>
+      </w:r>
+      <w:r>
+        <w:t xml:space="preserve">,</w:t>
+      </w:r>
+      <w:r>
+        <w:t xml:space="preserve"> </w:t>
+      </w:r>
+      <w:r>
+        <w:rPr>
+          <w:i/>
+          <w:iCs/>
+        </w:rPr>
+        <w:t xml:space="preserve">in what environment</w:t>
+      </w:r>
+      <w:r>
+        <w:t xml:space="preserve">, and against</w:t>
+      </w:r>
+      <w:r>
+        <w:t xml:space="preserve"> </w:t>
+      </w:r>
+      <w:r>
+        <w:rPr>
+          <w:i/>
+          <w:iCs/>
+        </w:rPr>
+        <w:t xml:space="preserve">what criteria</w:t>
+      </w:r>
+      <w:r>
+        <w:t xml:space="preserve"> </w:t>
+      </w:r>
+      <w:r>
+        <w:t xml:space="preserve">a test is considered to pass. This gives the testing phase a clear, auditable structure and ensures that both the internal correctness of the system and its acceptability to real users are covered. The plan is summarised in the table below; the detailed design of each technique follows in §5.3, and the executed results are reported in §5.4.</w:t>
+      </w:r>
+    </w:p>
+    <w:tbl>
+      <w:tblPr>
+        <w:tblStyle w:val="Table"/>
+        <w:tblW w:type="auto" w:w="0"/>
+        <w:tblLook w:firstRow="1" w:lastRow="0" w:firstColumn="0" w:lastColumn="0" w:noHBand="0" w:noVBand="0" w:val="0020"/>
+      </w:tblPr>
+      <w:tblGrid>
+        <w:gridCol w:w="3960"/>
+        <w:gridCol w:w="3960"/>
+      </w:tblGrid>
+      <w:tr>
+        <w:trPr>
+          <w:tblHeader w:val="on"/>
+        </w:trPr>
+        <w:tc>
+          <w:tcPr/>
+          <w:p>
+            <w:pPr>
+              <w:pStyle w:val="Compact"/>
+            </w:pPr>
+            <w:r>
+              <w:t xml:space="preserve">Element</w:t>
+            </w:r>
+          </w:p>
+        </w:tc>
+        <w:tc>
+          <w:tcPr/>
+          <w:p>
+            <w:pPr>
+              <w:pStyle w:val="Compact"/>
+            </w:pPr>
+            <w:r>
+              <w:t xml:space="preserve">Description</w:t>
+            </w:r>
+          </w:p>
+        </w:tc>
+      </w:tr>
+      <w:tr>
+        <w:tc>
+          <w:tcPr/>
+          <w:p>
+            <w:pPr>
+              <w:pStyle w:val="Compact"/>
+            </w:pPr>
+            <w:r>
+              <w:rPr>
+                <w:b/>
+                <w:bCs/>
+              </w:rPr>
+              <w:t xml:space="preserve">Test objectives</w:t>
+            </w:r>
+          </w:p>
+        </w:tc>
+        <w:tc>
+          <w:tcPr/>
+          <w:p>
+            <w:pPr>
+              <w:pStyle w:val="Compact"/>
+            </w:pPr>
+            <w:r>
+              <w:t xml:space="preserve">Verify that every component of the system produces correct output; quantify the machine-learning model's accuracy and the Confidence Engine's behaviour; confirm the full pipeline works end-to-end against a live target; and establish that the intended users find the finished system usable and acceptable.</w:t>
+            </w:r>
+          </w:p>
+        </w:tc>
+      </w:tr>
+      <w:tr>
+        <w:tc>
+          <w:tcPr/>
+          <w:p>
+            <w:pPr>
+              <w:pStyle w:val="Compact"/>
+            </w:pPr>
+            <w:r>
+              <w:rPr>
+                <w:b/>
+                <w:bCs/>
+              </w:rPr>
+              <w:t xml:space="preserve">Scope (in)</w:t>
+            </w:r>
+          </w:p>
+        </w:tc>
+        <w:tc>
+          <w:tcPr/>
+          <w:p>
+            <w:pPr>
+              <w:pStyle w:val="Compact"/>
+            </w:pPr>
+            <w:r>
+              <w:t xml:space="preserve">The back-end engines and pipeline (parsing, normalisation, deduplication, CWE mapping, NVD enrichment, CWE→CVSS inference, exploit search, ML prioritiser, Confidence Engine, PoC validator, Auto Scan, report generation, AI-assisted analysis, data management); the machine-learning model; the Confidence Engine; the end-to-end triage workflow; and the web-application user interface.</w:t>
+            </w:r>
+          </w:p>
+        </w:tc>
+      </w:tr>
+      <w:tr>
+        <w:tc>
+          <w:tcPr/>
+          <w:p>
+            <w:pPr>
+              <w:pStyle w:val="Compact"/>
+            </w:pPr>
+            <w:r>
+              <w:rPr>
+                <w:b/>
+                <w:bCs/>
+              </w:rPr>
+              <w:t xml:space="preserve">Scope (out)</w:t>
+            </w:r>
+          </w:p>
+        </w:tc>
+        <w:tc>
+          <w:tcPr/>
+          <w:p>
+            <w:pPr>
+              <w:pStyle w:val="Compact"/>
+            </w:pPr>
+            <w:r>
+              <w:t xml:space="preserve">The internal workings of the third-party scanners (OWASP ZAP, Nuclei, Nessus) and of the external LLM providers; production-scale load and performance; and multi-tenant/enterprise access control.</w:t>
+            </w:r>
+          </w:p>
+        </w:tc>
+      </w:tr>
+      <w:tr>
+        <w:tc>
+          <w:tcPr/>
+          <w:p>
+            <w:pPr>
+              <w:pStyle w:val="Compact"/>
+            </w:pPr>
+            <w:r>
+              <w:rPr>
+                <w:b/>
+                <w:bCs/>
+              </w:rPr>
+              <w:t xml:space="preserve">Testing techniques</w:t>
+            </w:r>
+          </w:p>
+        </w:tc>
+        <w:tc>
+          <w:tcPr/>
+          <w:p>
+            <w:pPr>
+              <w:pStyle w:val="Compact"/>
+            </w:pPr>
+            <w:r>
+              <w:t xml:space="preserve">(1)</w:t>
+            </w:r>
+            <w:r>
+              <w:t xml:space="preserve"> </w:t>
+            </w:r>
+            <w:r>
+              <w:rPr>
+                <w:b/>
+                <w:bCs/>
+              </w:rPr>
+              <w:t xml:space="preserve">White-box testing</w:t>
+            </w:r>
+            <w:r>
+              <w:t xml:space="preserve"> </w:t>
+            </w:r>
+            <w:r>
+              <w:t xml:space="preserve">— automated unit and integration testing, plus machine-learning model evaluation and live functional/system verification; (2)</w:t>
+            </w:r>
+            <w:r>
+              <w:t xml:space="preserve"> </w:t>
+            </w:r>
+            <w:r>
+              <w:rPr>
+                <w:b/>
+                <w:bCs/>
+              </w:rPr>
+              <w:t xml:space="preserve">User Acceptance Testing (UAT)</w:t>
+            </w:r>
+            <w:r>
+              <w:t xml:space="preserve"> </w:t>
+            </w:r>
+            <w:r>
+              <w:t xml:space="preserve">— an acceptance-form evaluation conducted with representative end users.</w:t>
+            </w:r>
+          </w:p>
+        </w:tc>
+      </w:tr>
+      <w:tr>
+        <w:tc>
+          <w:tcPr/>
+          <w:p>
+            <w:pPr>
+              <w:pStyle w:val="Compact"/>
+            </w:pPr>
+            <w:r>
+              <w:rPr>
+                <w:b/>
+                <w:bCs/>
+              </w:rPr>
+              <w:t xml:space="preserve">Test environment</w:t>
+            </w:r>
+          </w:p>
+        </w:tc>
+        <w:tc>
+          <w:tcPr/>
+          <w:p>
+            <w:pPr>
+              <w:pStyle w:val="Compact"/>
+            </w:pPr>
+            <w:r>
+              <w:t xml:space="preserve">Automated tests run under</w:t>
+            </w:r>
+            <w:r>
+              <w:t xml:space="preserve"> </w:t>
+            </w:r>
+            <w:r>
+              <w:rPr>
+                <w:b/>
+                <w:bCs/>
+              </w:rPr>
+              <w:t xml:space="preserve">pytest</w:t>
+            </w:r>
+            <w:r>
+              <w:t xml:space="preserve"> </w:t>
+            </w:r>
+            <w:r>
+              <w:t xml:space="preserve">with an in-memory SQLite database; all external dependencies (LLM providers, the live NVD API, and the network) are mocked for deterministic, reproducible runs. Functional verification and the confidence evaluation use a local</w:t>
+            </w:r>
+            <w:r>
+              <w:t xml:space="preserve"> </w:t>
+            </w:r>
+            <w:r>
+              <w:rPr>
+                <w:b/>
+                <w:bCs/>
+              </w:rPr>
+              <w:t xml:space="preserve">OWASP Juice Shop</w:t>
+            </w:r>
+            <w:r>
+              <w:t xml:space="preserve"> </w:t>
+            </w:r>
+            <w:r>
+              <w:t xml:space="preserve">as the authorised, deliberately-vulnerable target. UAT is performed in a modern web browser. Host platform: Kali Linux.</w:t>
+            </w:r>
+          </w:p>
+        </w:tc>
+      </w:tr>
+      <w:tr>
+        <w:tc>
+          <w:tcPr/>
+          <w:p>
+            <w:pPr>
+              <w:pStyle w:val="Compact"/>
+            </w:pPr>
+            <w:r>
+              <w:rPr>
+                <w:b/>
+                <w:bCs/>
+              </w:rPr>
+              <w:t xml:space="preserve">Test data</w:t>
+            </w:r>
+          </w:p>
+        </w:tc>
+        <w:tc>
+          <w:tcPr/>
+          <w:p>
+            <w:pPr>
+              <w:pStyle w:val="Compact"/>
+            </w:pPr>
+            <w:r>
+              <w:t xml:space="preserve">21,697 real, held-out NVD records for the ML evaluation; a real OWASP ZAP + Nuclei scan of OWASP Juice Shop (20 findings) for the pipeline and Confidence Engine evaluation; and representative ZAP/Nuclei/Nessus reports for the parser and integration tests.</w:t>
+            </w:r>
+          </w:p>
+        </w:tc>
+      </w:tr>
+      <w:tr>
+        <w:tc>
+          <w:tcPr/>
+          <w:p>
+            <w:pPr>
+              <w:pStyle w:val="Compact"/>
+            </w:pPr>
+            <w:r>
+              <w:rPr>
+                <w:b/>
+                <w:bCs/>
+              </w:rPr>
+              <w:t xml:space="preserve">Participants</w:t>
+            </w:r>
+          </w:p>
+        </w:tc>
+        <w:tc>
+          <w:tcPr/>
+          <w:p>
+            <w:pPr>
+              <w:pStyle w:val="Compact"/>
+            </w:pPr>
+            <w:r>
+              <w:t xml:space="preserve">The developer conducts the white-box testing. UAT is conducted with</w:t>
+            </w:r>
+            <w:r>
+              <w:t xml:space="preserve"> </w:t>
+            </w:r>
+            <w:r>
+              <w:rPr>
+                <w:b/>
+                <w:bCs/>
+              </w:rPr>
+              <w:t xml:space="preserve">at least three (3) testers</w:t>
+            </w:r>
+            <w:r>
+              <w:t xml:space="preserve"> </w:t>
+            </w:r>
+            <w:r>
+              <w:t xml:space="preserve">drawn from the target audience — cybersecurity students, junior security analysts, and IT security staff.</w:t>
+            </w:r>
+          </w:p>
+        </w:tc>
+      </w:tr>
+      <w:tr>
+        <w:tc>
+          <w:tcPr/>
+          <w:p>
+            <w:pPr>
+              <w:pStyle w:val="Compact"/>
+            </w:pPr>
+            <w:r>
+              <w:rPr>
+                <w:b/>
+                <w:bCs/>
+              </w:rPr>
+              <w:t xml:space="preserve">Pass / fail criteria</w:t>
+            </w:r>
+          </w:p>
+        </w:tc>
+        <w:tc>
+          <w:tcPr/>
+          <w:p>
+            <w:pPr>
+              <w:pStyle w:val="Compact"/>
+            </w:pPr>
+            <w:r>
+              <w:rPr>
+                <w:i/>
+                <w:iCs/>
+              </w:rPr>
+              <w:t xml:space="preserve">White-box:</w:t>
+            </w:r>
+            <w:r>
+              <w:t xml:space="preserve"> </w:t>
+            </w:r>
+            <w:r>
+              <w:t xml:space="preserve">a test passes when the actual output equals the expected output; the suite passes only when</w:t>
+            </w:r>
+            <w:r>
+              <w:t xml:space="preserve"> </w:t>
+            </w:r>
+            <w:r>
+              <w:rPr>
+                <w:b/>
+                <w:bCs/>
+              </w:rPr>
+              <w:t xml:space="preserve">all</w:t>
+            </w:r>
+            <w:r>
+              <w:t xml:space="preserve"> </w:t>
+            </w:r>
+            <w:r>
+              <w:t xml:space="preserve">tests pass.</w:t>
+            </w:r>
+            <w:r>
+              <w:t xml:space="preserve"> </w:t>
+            </w:r>
+            <w:r>
+              <w:rPr>
+                <w:i/>
+                <w:iCs/>
+              </w:rPr>
+              <w:t xml:space="preserve">ML model:</w:t>
+            </w:r>
+            <w:r>
+              <w:t xml:space="preserve"> </w:t>
+            </w:r>
+            <w:r>
+              <w:t xml:space="preserve">accuracy and macro-F1 reported on the held-out set, with no gross (multi-band) misclassifications.</w:t>
+            </w:r>
+            <w:r>
+              <w:t xml:space="preserve"> </w:t>
+            </w:r>
+            <w:r>
+              <w:rPr>
+                <w:i/>
+                <w:iCs/>
+              </w:rPr>
+              <w:t xml:space="preserve">Confidence Engine:</w:t>
+            </w:r>
+            <w:r>
+              <w:t xml:space="preserve"> </w:t>
+            </w:r>
+            <w:r>
+              <w:t xml:space="preserve">on the real scan, every PoC-confirmed finding is classified</w:t>
+            </w:r>
+            <w:r>
+              <w:t xml:space="preserve"> </w:t>
+            </w:r>
+            <w:r>
+              <w:rPr>
+                <w:i/>
+                <w:iCs/>
+              </w:rPr>
+              <w:t xml:space="preserve">Confirmed</w:t>
+            </w:r>
+            <w:r>
+              <w:t xml:space="preserve"> </w:t>
+            </w:r>
+            <w:r>
+              <w:t xml:space="preserve">and all technology-detection noise is classified</w:t>
+            </w:r>
+            <w:r>
+              <w:t xml:space="preserve"> </w:t>
+            </w:r>
+            <w:r>
+              <w:rPr>
+                <w:i/>
+                <w:iCs/>
+              </w:rPr>
+              <w:t xml:space="preserve">Informational</w:t>
+            </w:r>
+            <w:r>
+              <w:t xml:space="preserve">.</w:t>
+            </w:r>
+            <w:r>
+              <w:t xml:space="preserve"> </w:t>
+            </w:r>
+            <w:r>
+              <w:rPr>
+                <w:i/>
+                <w:iCs/>
+              </w:rPr>
+              <w:t xml:space="preserve">UAT:</w:t>
+            </w:r>
+            <w:r>
+              <w:t xml:space="preserve"> </w:t>
+            </w:r>
+            <w:r>
+              <w:t xml:space="preserve">a criterion is accepted when its mean rating is ≥ 4 out of 5 (or its positive response proportion is high) and testers accept the system overall.</w:t>
+            </w:r>
+          </w:p>
+        </w:tc>
+      </w:tr>
+      <w:tr>
+        <w:tc>
+          <w:tcPr/>
+          <w:p>
+            <w:pPr>
+              <w:pStyle w:val="Compact"/>
+            </w:pPr>
+            <w:r>
+              <w:rPr>
+                <w:b/>
+                <w:bCs/>
+              </w:rPr>
+              <w:t xml:space="preserve">Approach / schedule</w:t>
+            </w:r>
+          </w:p>
+        </w:tc>
+        <w:tc>
+          <w:tcPr/>
+          <w:p>
+            <w:pPr>
+              <w:pStyle w:val="Compact"/>
+            </w:pPr>
+            <w:r>
+              <w:t xml:space="preserve">White-box tests are written and re-run continuously during development and again before release; the ML and confidence evaluations are run against the saved model and a stored real scan; UAT is conducted once the system is feature-complete.</w:t>
+            </w:r>
+          </w:p>
+        </w:tc>
+      </w:tr>
+      <w:tr>
+        <w:tc>
+          <w:tcPr/>
+          <w:p>
+            <w:pPr>
+              <w:pStyle w:val="Compact"/>
+            </w:pPr>
+            <w:r>
+              <w:rPr>
+                <w:b/>
+                <w:bCs/>
+              </w:rPr>
+              <w:t xml:space="preserve">Deliverables</w:t>
+            </w:r>
+          </w:p>
+        </w:tc>
+        <w:tc>
+          <w:tcPr/>
+          <w:p>
+            <w:pPr>
+              <w:pStyle w:val="Compact"/>
+            </w:pPr>
+            <w:r>
+              <w:t xml:space="preserve">The automated test suite and its pass report; the ML evaluation output; the real-scan confidence evaluation; the live functional-verification table; and the completed UAT forms with an acceptance summary.</w:t>
+            </w:r>
+          </w:p>
+        </w:tc>
+      </w:tr>
+      <w:tr>
+        <w:tc>
+          <w:tcPr/>
+          <w:p>
+            <w:pPr>
+              <w:pStyle w:val="Compact"/>
+            </w:pPr>
+            <w:r>
+              <w:rPr>
+                <w:b/>
+                <w:bCs/>
+              </w:rPr>
+              <w:t xml:space="preserve">Assumptions / risks</w:t>
+            </w:r>
+          </w:p>
+        </w:tc>
+        <w:tc>
+          <w:tcPr/>
+          <w:p>
+            <w:pPr>
+              <w:pStyle w:val="Compact"/>
+            </w:pPr>
+            <w:r>
+              <w:t xml:space="preserve">All testing is authorised and confined to the provided practice target; the AI-assisted analysis requires a provider key and degrades gracefully without one; and the UAT sample is small, so it establishes acceptability rather than statistically-powered usability.</w:t>
+            </w:r>
+          </w:p>
+        </w:tc>
+      </w:tr>
+    </w:tbl>
+    <w:p>
+      <w:r>
+        <w:pict>
+          <v:rect style="width:0;height:1.5pt" o:hralign="center" o:hrstd="t" o:hr="t"/>
+        </w:pict>
+      </w:r>
+    </w:p>
+    <w:bookmarkEnd w:id="10"/>
+    <w:bookmarkStart w:id="20" w:name="Xe30f9355dca25242a1f35483d73f86b1860cc16"/>
+    <w:p>
+      <w:pPr>
+        <w:pStyle w:val="Heading2"/>
+      </w:pPr>
+      <w:r>
+        <w:t xml:space="preserve">5.3 Testing Selection and Design</w:t>
+      </w:r>
+    </w:p>
+    <w:bookmarkStart w:id="16" w:name="Xc8d73bd22bf1ce506c34430f1fdcdd8cfa7d194"/>
+    <w:p>
+      <w:pPr>
+        <w:pStyle w:val="Heading3"/>
+      </w:pPr>
+      <w:r>
+        <w:t xml:space="preserve">5.3.1 Selection of Suitable Testing</w:t>
+      </w:r>
+    </w:p>
+    <w:p>
+      <w:pPr>
+        <w:pStyle w:val="FirstParagraph"/>
+      </w:pPr>
+      <w:r>
         <w:t xml:space="preserve">Figure 5.1 shows how the two selected techniques combine into the overall evaluation. White-box testing validates the internal logic of every component, the ML model, and the integrated pipeline; UAT validates the finished system's acceptability with real users. Together they establish both correctness and acceptance.</w:t>
       </w:r>
     </w:p>
@@ -205,18 +830,18 @@
           <wp:inline>
             <wp:extent cx="5334000" cy="3355361"/>
             <wp:effectExtent b="0" l="0" r="0" t="0"/>
-            <wp:docPr descr="Figure 5.1: Overall Testing Approach — Two Complementary Techniques" title="" id="11" name="Picture"/>
+            <wp:docPr descr="Figure 5.1: Overall Testing Approach — Two Complementary Techniques" title="" id="12" name="Picture"/>
             <a:graphic>
               <a:graphicData uri="http://schemas.openxmlformats.org/drawingml/2006/picture">
                 <pic:pic>
                   <pic:nvPicPr>
-                    <pic:cNvPr descr="diagrams/diagram-ch5-01.png" id="12" name="Picture"/>
+                    <pic:cNvPr descr="diagrams/diagram-ch5-01.png" id="13" name="Picture"/>
                     <pic:cNvPicPr>
                       <a:picLocks noChangeArrowheads="1" noChangeAspect="1"/>
                     </pic:cNvPicPr>
                   </pic:nvPicPr>
                   <pic:blipFill>
-                    <a:blip r:embed="rId10"/>
+                    <a:blip r:embed="rId11"/>
                     <a:stretch>
                       <a:fillRect/>
                     </a:stretch>
@@ -255,13 +880,13 @@
         <w:t xml:space="preserve">Figure 5.1: Overall Testing Approach — Two Complementary Techniques</w:t>
       </w:r>
     </w:p>
-    <w:bookmarkStart w:id="13" w:name="X004bb2af3a4b836c7a1225c5fefb384903952eb"/>
+    <w:bookmarkStart w:id="14" w:name="X8bf04f9c49c3ecc742bf98a66bb0a118aa1fda0"/>
     <w:p>
       <w:pPr>
         <w:pStyle w:val="Heading4"/>
       </w:pPr>
       <w:r>
-        <w:t xml:space="preserve">5.2.1.1 White-Box Testing</w:t>
+        <w:t xml:space="preserve">5.3.1.1 White-Box Testing</w:t>
       </w:r>
     </w:p>
     <w:p>
@@ -320,14 +945,14 @@
         <w:t xml:space="preserve">(quantifying the ML model on real held-out data and driving the whole pipeline against a live target).</w:t>
       </w:r>
     </w:p>
-    <w:bookmarkEnd w:id="13"/>
-    <w:bookmarkStart w:id="14" w:name="X7ee98536bb1dbeb7e3deb28e7dd47ff229b3382"/>
+    <w:bookmarkEnd w:id="14"/>
+    <w:bookmarkStart w:id="15" w:name="X553fe287fbd06938c7486e2986015d73e97e12e"/>
     <w:p>
       <w:pPr>
         <w:pStyle w:val="Heading4"/>
       </w:pPr>
       <w:r>
-        <w:t xml:space="preserve">5.2.1.2 User Acceptance Testing</w:t>
+        <w:t xml:space="preserve">5.3.1.2 User Acceptance Testing</w:t>
       </w:r>
     </w:p>
     <w:p>
@@ -370,24 +995,24 @@
         <w:t xml:space="preserve">its output. UAT places the finished system in front of representative users, has them perform the real analyst workflow (upload → triage → interpret → report) with the developer present for guidance, and then has them rate the system against a set of acceptance criteria covering the user interface and the functionality. Documenting the tester profile, the criteria, and the outcomes provides traceable evidence of acceptance.</w:t>
       </w:r>
     </w:p>
-    <w:bookmarkEnd w:id="14"/>
     <w:bookmarkEnd w:id="15"/>
-    <w:bookmarkStart w:id="18" w:name="Xa8d1f71187f75055390524fc08fb845e5f7e7d4"/>
+    <w:bookmarkEnd w:id="16"/>
+    <w:bookmarkStart w:id="19" w:name="X0d8941f0338e25028a3070464aa05c166f83d99"/>
     <w:p>
       <w:pPr>
         <w:pStyle w:val="Heading3"/>
       </w:pPr>
       <w:r>
-        <w:t xml:space="preserve">5.2.2 Testing Design</w:t>
+        <w:t xml:space="preserve">5.3.2 Testing Design</w:t>
       </w:r>
     </w:p>
-    <w:bookmarkStart w:id="16" w:name="Xdb8cfb363bc9e82fc8b6e85f441e65dc4fd821a"/>
+    <w:bookmarkStart w:id="17" w:name="Xe9932aa0c3305f2f8179e832ed003f5d750ab01"/>
     <w:p>
       <w:pPr>
         <w:pStyle w:val="Heading4"/>
       </w:pPr>
       <w:r>
-        <w:t xml:space="preserve">5.2.2.1 White-Box Testing Design</w:t>
+        <w:t xml:space="preserve">5.3.2.1 White-Box Testing Design</w:t>
       </w:r>
     </w:p>
     <w:p>
@@ -557,7 +1182,7 @@
         <w:t xml:space="preserve"> </w:t>
       </w:r>
       <w:r>
-        <w:t xml:space="preserve">(regression tests). The fourteen component groups and the number of test cases in each are listed in Table 5.1; the full per-component tables, with their executed results, appear in §5.3.1.</w:t>
+        <w:t xml:space="preserve">(regression tests). The fourteen component groups and the number of test cases in each are listed in Table 5.1; the full per-component tables, with their executed results, appear in §5.4.1.</w:t>
       </w:r>
     </w:p>
     <w:tbl>
@@ -1384,14 +2009,14 @@
         <w:t xml:space="preserve">Table 5.1: White-Box Test Coverage by Component</w:t>
       </w:r>
     </w:p>
-    <w:bookmarkEnd w:id="16"/>
-    <w:bookmarkStart w:id="17" w:name="Xe59c980d9e14e89002ea87db6bbe20471de6d4c"/>
+    <w:bookmarkEnd w:id="17"/>
+    <w:bookmarkStart w:id="18" w:name="X231a1a8999a1de66e6c80106eb42ebfa3e08a76"/>
     <w:p>
       <w:pPr>
         <w:pStyle w:val="Heading4"/>
       </w:pPr>
       <w:r>
-        <w:t xml:space="preserve">5.2.2.2 User Acceptance Testing Design</w:t>
+        <w:t xml:space="preserve">5.3.2.2 User Acceptance Testing Design</w:t>
       </w:r>
     </w:p>
     <w:p>
@@ -3181,25 +3806,25 @@
         </w:pict>
       </w:r>
     </w:p>
-    <w:bookmarkEnd w:id="17"/>
     <w:bookmarkEnd w:id="18"/>
     <w:bookmarkEnd w:id="19"/>
-    <w:bookmarkStart w:id="52" w:name="Xdf8304cc98c46e7ba29fa90a2df6e3c66112698"/>
+    <w:bookmarkEnd w:id="20"/>
+    <w:bookmarkStart w:id="53" w:name="X4584bd63a24a364cf763c7c68128a144643182e"/>
     <w:p>
       <w:pPr>
         <w:pStyle w:val="Heading2"/>
       </w:pPr>
       <w:r>
-        <w:t xml:space="preserve">5.3 System Testing and Discussion</w:t>
+        <w:t xml:space="preserve">5.4 System Testing and Discussion</w:t>
       </w:r>
     </w:p>
-    <w:bookmarkStart w:id="49" w:name="Xb0ff592cf76b56e6bfcd93a7bb3d4b0b056114d"/>
+    <w:bookmarkStart w:id="50" w:name="X9f97791114114f5b2821683aa81df29a6542b54"/>
     <w:p>
       <w:pPr>
         <w:pStyle w:val="Heading3"/>
       </w:pPr>
       <w:r>
-        <w:t xml:space="preserve">5.3.1 White-Box Testing Execution</w:t>
+        <w:t xml:space="preserve">5.4.1 White-Box Testing Execution</w:t>
       </w:r>
     </w:p>
     <w:p>
@@ -3238,7 +3863,7 @@
         <w:t xml:space="preserve">The per-component results are recorded in Tables 5.3–5.16 below, one table per component group, in the order listed in Table 5.1. Every row corresponds to a real assertion in the test suite; because the suite is deterministic and passes in full, the Actual Output matches the Expected Output in every case ("As expected") and every verdict is Pass.</w:t>
       </w:r>
     </w:p>
-    <w:bookmarkStart w:id="20" w:name="component-1--authentication"/>
+    <w:bookmarkStart w:id="21" w:name="component-1--authentication"/>
     <w:p>
       <w:pPr>
         <w:pStyle w:val="Heading4"/>
@@ -3774,8 +4399,8 @@
         <w:t xml:space="preserve">Table 5.3: Authentication — Unit Test Results</w:t>
       </w:r>
     </w:p>
-    <w:bookmarkEnd w:id="20"/>
-    <w:bookmarkStart w:id="21" w:name="component-2--scanner-parsers"/>
+    <w:bookmarkEnd w:id="21"/>
+    <w:bookmarkStart w:id="22" w:name="component-2--scanner-parsers"/>
     <w:p>
       <w:pPr>
         <w:pStyle w:val="Heading4"/>
@@ -4018,8 +4643,8 @@
         <w:t xml:space="preserve">Table 5.4: Scanner Parsers — Unit Test Results</w:t>
       </w:r>
     </w:p>
-    <w:bookmarkEnd w:id="21"/>
-    <w:bookmarkStart w:id="22" w:name="X94828a5d2400788b7e895ff1b5c65d4a0c1c3fc"/>
+    <w:bookmarkEnd w:id="22"/>
+    <w:bookmarkStart w:id="23" w:name="X94828a5d2400788b7e895ff1b5c65d4a0c1c3fc"/>
     <w:p>
       <w:pPr>
         <w:pStyle w:val="Heading4"/>
@@ -5051,8 +5676,8 @@
         <w:t xml:space="preserve">Table 5.5: CWE / Placeholder Normalisation — Unit Test Results</w:t>
       </w:r>
     </w:p>
-    <w:bookmarkEnd w:id="22"/>
-    <w:bookmarkStart w:id="23" w:name="component-4--html-to-text-sanitiser"/>
+    <w:bookmarkEnd w:id="23"/>
+    <w:bookmarkStart w:id="24" w:name="component-4--html-to-text-sanitiser"/>
     <w:p>
       <w:pPr>
         <w:pStyle w:val="Heading4"/>
@@ -5677,8 +6302,8 @@
         <w:t xml:space="preserve">Table 5.6: HTML-to-Text Sanitiser — Unit Test Results</w:t>
       </w:r>
     </w:p>
-    <w:bookmarkEnd w:id="23"/>
-    <w:bookmarkStart w:id="24" w:name="component-5--cwe-keyword-mapper"/>
+    <w:bookmarkEnd w:id="24"/>
+    <w:bookmarkStart w:id="25" w:name="component-5--cwe-keyword-mapper"/>
     <w:p>
       <w:pPr>
         <w:pStyle w:val="Heading4"/>
@@ -7471,8 +8096,8 @@
         <w:t xml:space="preserve">Table 5.7: CWE Keyword Mapper — Unit Test Results</w:t>
       </w:r>
     </w:p>
-    <w:bookmarkEnd w:id="24"/>
-    <w:bookmarkStart w:id="25" w:name="component-6--nvd-enrichment"/>
+    <w:bookmarkEnd w:id="25"/>
+    <w:bookmarkStart w:id="26" w:name="component-6--nvd-enrichment"/>
     <w:p>
       <w:pPr>
         <w:pStyle w:val="Heading4"/>
@@ -8118,8 +8743,8 @@
         <w:t xml:space="preserve">Table 5.8: NVD Enrichment — Unit Test Results</w:t>
       </w:r>
     </w:p>
-    <w:bookmarkEnd w:id="25"/>
-    <w:bookmarkStart w:id="26" w:name="component-7--cwecvss-vector-inference"/>
+    <w:bookmarkEnd w:id="26"/>
+    <w:bookmarkStart w:id="27" w:name="component-7--cwecvss-vector-inference"/>
     <w:p>
       <w:pPr>
         <w:pStyle w:val="Heading4"/>
@@ -8442,8 +9067,8 @@
         <w:t xml:space="preserve">Table 5.9: CWE→CVSS Vector Inference — Unit Test Results</w:t>
       </w:r>
     </w:p>
-    <w:bookmarkEnd w:id="26"/>
-    <w:bookmarkStart w:id="27" w:name="component-8--exploit-search"/>
+    <w:bookmarkEnd w:id="27"/>
+    <w:bookmarkStart w:id="28" w:name="component-8--exploit-search"/>
     <w:p>
       <w:pPr>
         <w:pStyle w:val="Heading4"/>
@@ -8906,8 +9531,8 @@
         <w:t xml:space="preserve">Table 5.10: Exploit Search — Unit / Integration Test Results</w:t>
       </w:r>
     </w:p>
-    <w:bookmarkEnd w:id="27"/>
-    <w:bookmarkStart w:id="28" w:name="component-9--confidence-engine"/>
+    <w:bookmarkEnd w:id="28"/>
+    <w:bookmarkStart w:id="29" w:name="component-9--confidence-engine"/>
     <w:p>
       <w:pPr>
         <w:pStyle w:val="Heading4"/>
@@ -9558,8 +10183,8 @@
         <w:t xml:space="preserve">Table 5.11: Confidence Engine — Unit Test Results</w:t>
       </w:r>
     </w:p>
-    <w:bookmarkEnd w:id="28"/>
-    <w:bookmarkStart w:id="29" w:name="component-10--poc-validator"/>
+    <w:bookmarkEnd w:id="29"/>
+    <w:bookmarkStart w:id="30" w:name="component-10--poc-validator"/>
     <w:p>
       <w:pPr>
         <w:pStyle w:val="Heading4"/>
@@ -10114,8 +10739,8 @@
         <w:t xml:space="preserve">Table 5.12: PoC Validator — Unit Test Results</w:t>
       </w:r>
     </w:p>
-    <w:bookmarkEnd w:id="29"/>
-    <w:bookmarkStart w:id="30" w:name="component-11--auto-scan-orchestration"/>
+    <w:bookmarkEnd w:id="30"/>
+    <w:bookmarkStart w:id="31" w:name="component-11--auto-scan-orchestration"/>
     <w:p>
       <w:pPr>
         <w:pStyle w:val="Heading4"/>
@@ -10598,8 +11223,8 @@
         <w:t xml:space="preserve">Table 5.13: Auto Scan Orchestration — Integration Test Results</w:t>
       </w:r>
     </w:p>
-    <w:bookmarkEnd w:id="30"/>
-    <w:bookmarkStart w:id="31" w:name="component-12--report-generation"/>
+    <w:bookmarkEnd w:id="31"/>
+    <w:bookmarkStart w:id="32" w:name="component-12--report-generation"/>
     <w:p>
       <w:pPr>
         <w:pStyle w:val="Heading4"/>
@@ -10911,8 +11536,8 @@
         <w:t xml:space="preserve">Table 5.14: Report Generation — Unit Test Results</w:t>
       </w:r>
     </w:p>
-    <w:bookmarkEnd w:id="31"/>
-    <w:bookmarkStart w:id="32" w:name="component-13--ai-assisted-analysis"/>
+    <w:bookmarkEnd w:id="32"/>
+    <w:bookmarkStart w:id="33" w:name="component-13--ai-assisted-analysis"/>
     <w:p>
       <w:pPr>
         <w:pStyle w:val="Heading4"/>
@@ -11570,8 +12195,8 @@
         <w:t xml:space="preserve">Table 5.15: AI-Assisted Analysis — Unit Test Results</w:t>
       </w:r>
     </w:p>
-    <w:bookmarkEnd w:id="32"/>
-    <w:bookmarkStart w:id="48" w:name="component-14--data-management"/>
+    <w:bookmarkEnd w:id="33"/>
+    <w:bookmarkStart w:id="49" w:name="component-14--data-management"/>
     <w:p>
       <w:pPr>
         <w:pStyle w:val="Heading4"/>
@@ -11904,18 +12529,18 @@
           <wp:inline>
             <wp:extent cx="5334000" cy="5627076"/>
             <wp:effectExtent b="0" l="0" r="0" t="0"/>
-            <wp:docPr descr="Figure 5.2: Model-evaluation script output (real run)" title="" id="34" name="Picture"/>
+            <wp:docPr descr="Figure 5.2: Model-evaluation script output (real run)" title="" id="35" name="Picture"/>
             <a:graphic>
               <a:graphicData uri="http://schemas.openxmlformats.org/drawingml/2006/picture">
                 <pic:pic>
                   <pic:nvPicPr>
-                    <pic:cNvPr descr="images/ml-eval-terminal.png" id="35" name="Picture"/>
+                    <pic:cNvPr descr="images/ml-eval-terminal.png" id="36" name="Picture"/>
                     <pic:cNvPicPr>
                       <a:picLocks noChangeArrowheads="1" noChangeAspect="1"/>
                     </pic:cNvPicPr>
                   </pic:nvPicPr>
                   <pic:blipFill>
-                    <a:blip r:embed="rId33"/>
+                    <a:blip r:embed="rId34"/>
                     <a:stretch>
                       <a:fillRect/>
                     </a:stretch>
@@ -12334,18 +12959,18 @@
           <wp:inline>
             <wp:extent cx="5334000" cy="3196843"/>
             <wp:effectExtent b="0" l="0" r="0" t="0"/>
-            <wp:docPr descr="Figure 5.3: Per-class precision, recall, and F1" title="" id="37" name="Picture"/>
+            <wp:docPr descr="Figure 5.3: Per-class precision, recall, and F1" title="" id="38" name="Picture"/>
             <a:graphic>
               <a:graphicData uri="http://schemas.openxmlformats.org/drawingml/2006/picture">
                 <pic:pic>
                   <pic:nvPicPr>
-                    <pic:cNvPr descr="images/ml-per-class.png" id="38" name="Picture"/>
+                    <pic:cNvPr descr="images/ml-per-class.png" id="39" name="Picture"/>
                     <pic:cNvPicPr>
                       <a:picLocks noChangeArrowheads="1" noChangeAspect="1"/>
                     </pic:cNvPicPr>
                   </pic:nvPicPr>
                   <pic:blipFill>
-                    <a:blip r:embed="rId36"/>
+                    <a:blip r:embed="rId37"/>
                     <a:stretch>
                       <a:fillRect/>
                     </a:stretch>
@@ -12743,18 +13368,18 @@
           <wp:inline>
             <wp:extent cx="5334000" cy="4455508"/>
             <wp:effectExtent b="0" l="0" r="0" t="0"/>
-            <wp:docPr descr="Figure 5.4: Confusion matrix heatmap" title="" id="40" name="Picture"/>
+            <wp:docPr descr="Figure 5.4: Confusion matrix heatmap" title="" id="41" name="Picture"/>
             <a:graphic>
               <a:graphicData uri="http://schemas.openxmlformats.org/drawingml/2006/picture">
                 <pic:pic>
                   <pic:nvPicPr>
-                    <pic:cNvPr descr="images/ml-confusion-matrix.png" id="41" name="Picture"/>
+                    <pic:cNvPr descr="images/ml-confusion-matrix.png" id="42" name="Picture"/>
                     <pic:cNvPicPr>
                       <a:picLocks noChangeArrowheads="1" noChangeAspect="1"/>
                     </pic:cNvPicPr>
                   </pic:nvPicPr>
                   <pic:blipFill>
-                    <a:blip r:embed="rId39"/>
+                    <a:blip r:embed="rId40"/>
                     <a:stretch>
                       <a:fillRect/>
                     </a:stretch>
@@ -14642,18 +15267,18 @@
           <wp:inline>
             <wp:extent cx="5334000" cy="6010140"/>
             <wp:effectExtent b="0" l="0" r="0" t="0"/>
-            <wp:docPr descr="Figure 5.5: Real-scan confidence evaluation output" title="" id="43" name="Picture"/>
+            <wp:docPr descr="Figure 5.5: Real-scan confidence evaluation output" title="" id="44" name="Picture"/>
             <a:graphic>
               <a:graphicData uri="http://schemas.openxmlformats.org/drawingml/2006/picture">
                 <pic:pic>
                   <pic:nvPicPr>
-                    <pic:cNvPr descr="images/conf-realscan-terminal.png" id="44" name="Picture"/>
+                    <pic:cNvPr descr="images/conf-realscan-terminal.png" id="45" name="Picture"/>
                     <pic:cNvPicPr>
                       <a:picLocks noChangeArrowheads="1" noChangeAspect="1"/>
                     </pic:cNvPicPr>
                   </pic:nvPicPr>
                   <pic:blipFill>
-                    <a:blip r:embed="rId42"/>
+                    <a:blip r:embed="rId43"/>
                     <a:stretch>
                       <a:fillRect/>
                     </a:stretch>
@@ -14730,18 +15355,18 @@
           <wp:inline>
             <wp:extent cx="5334000" cy="4397593"/>
             <wp:effectExtent b="0" l="0" r="0" t="0"/>
-            <wp:docPr descr="Figure 5.6: Confidence scores on the real Juice Shop scan" title="" id="46" name="Picture"/>
+            <wp:docPr descr="Figure 5.6: Confidence scores on the real Juice Shop scan" title="" id="47" name="Picture"/>
             <a:graphic>
               <a:graphicData uri="http://schemas.openxmlformats.org/drawingml/2006/picture">
                 <pic:pic>
                   <pic:nvPicPr>
-                    <pic:cNvPr descr="images/conf-realscan-scores.png" id="47" name="Picture"/>
+                    <pic:cNvPr descr="images/conf-realscan-scores.png" id="48" name="Picture"/>
                     <pic:cNvPicPr>
                       <a:picLocks noChangeArrowheads="1" noChangeAspect="1"/>
                     </pic:cNvPicPr>
                   </pic:nvPicPr>
                   <pic:blipFill>
-                    <a:blip r:embed="rId45"/>
+                    <a:blip r:embed="rId46"/>
                     <a:stretch>
                       <a:fillRect/>
                     </a:stretch>
@@ -15233,15 +15858,15 @@
         <w:t xml:space="preserve">Table 5.20: Live Functional / System Verification Results</w:t>
       </w:r>
     </w:p>
-    <w:bookmarkEnd w:id="48"/>
     <w:bookmarkEnd w:id="49"/>
-    <w:bookmarkStart w:id="50" w:name="X2103990b22303365d04026752791bacc2d669c8"/>
+    <w:bookmarkEnd w:id="50"/>
+    <w:bookmarkStart w:id="51" w:name="Xc9bebf889e47eb14547f993885f7a14baed9d5a"/>
     <w:p>
       <w:pPr>
         <w:pStyle w:val="Heading3"/>
       </w:pPr>
       <w:r>
-        <w:t xml:space="preserve">5.3.2 User Acceptance Testing Execution</w:t>
+        <w:t xml:space="preserve">5.4.2 User Acceptance Testing Execution</w:t>
       </w:r>
     </w:p>
     <w:p>
@@ -15275,7 +15900,7 @@
         <w:t xml:space="preserve"> </w:t>
       </w:r>
       <w:r>
-        <w:t xml:space="preserve">recruited per §5.2.2.2. The rating and Yes/No cells are left blank (shown as "—") for the testers to complete during the session; they are</w:t>
+        <w:t xml:space="preserve">recruited per §5.3.2.2. The rating and Yes/No cells are left blank (shown as "—") for the testers to complete during the session; they are</w:t>
       </w:r>
       <w:r>
         <w:t xml:space="preserve"> </w:t>
@@ -16132,14 +16757,14 @@
         <w:t xml:space="preserve">Table 5.24: UAT Acceptance Summary (to be completed)</w:t>
       </w:r>
     </w:p>
-    <w:bookmarkEnd w:id="50"/>
-    <w:bookmarkStart w:id="51" w:name="Xdf6580e43cd4db41cb4f0594ac1084bceb4f354"/>
+    <w:bookmarkEnd w:id="51"/>
+    <w:bookmarkStart w:id="52" w:name="X14b6b4699e621a5ef31a85b523a91af716cf49c"/>
     <w:p>
       <w:pPr>
         <w:pStyle w:val="Heading3"/>
       </w:pPr>
       <w:r>
-        <w:t xml:space="preserve">5.3.3 Testing Discussion</w:t>
+        <w:t xml:space="preserve">5.4.3 Testing Discussion</w:t>
       </w:r>
     </w:p>
     <w:p>
@@ -16222,7 +16847,7 @@
           <w:i/>
           <w:iCs/>
         </w:rPr>
-        <w:t xml:space="preserve">[Once the forms in §5.3.2 are collected, discuss the results here: relate the mean UI rating and the functionality "Yes" proportions to how intuitive and useful testers found the system; highlight which analyst-specific features (e.g. the confidence rationale, the AI-assisted analysis) testers valued, drawing on their comments; and, if any criterion fell below the acceptance threshold, identify the interface or feature responsible and state the improvement made in response. This closes the loop between testing and design.]</w:t>
+        <w:t xml:space="preserve">[Once the forms in §5.4.2 are collected, discuss the results here: relate the mean UI rating and the functionality "Yes" proportions to how intuitive and useful testers found the system; highlight which analyst-specific features (e.g. the confidence rationale, the AI-assisted analysis) testers valued, drawing on their comments; and, if any criterion fell below the acceptance threshold, identify the interface or feature responsible and state the improvement made in response. This closes the loop between testing and design.]</w:t>
       </w:r>
     </w:p>
     <w:p>
@@ -16232,15 +16857,15 @@
         </w:pict>
       </w:r>
     </w:p>
-    <w:bookmarkEnd w:id="51"/>
     <w:bookmarkEnd w:id="52"/>
-    <w:bookmarkStart w:id="53" w:name="X32768a294109eb22590a37edaae685c4b9e19bc"/>
+    <w:bookmarkEnd w:id="53"/>
+    <w:bookmarkStart w:id="54" w:name="X2a61097f05afee9eae7febd9c4b5148b0b3e4c3"/>
     <w:p>
       <w:pPr>
         <w:pStyle w:val="Heading2"/>
       </w:pPr>
       <w:r>
-        <w:t xml:space="preserve">5.4 Summary</w:t>
+        <w:t xml:space="preserve">5.5 Summary</w:t>
       </w:r>
     </w:p>
     <w:p>
@@ -16352,8 +16977,8 @@
         <w:t xml:space="preserve">Together the two techniques address both correctness and acceptance: the white-box results demonstrate that every component computes trustworthy, evidence-backed output, while the user acceptance testing establishes that the intended users can operate the system and accept it in practice. The following chapter concludes the project, reflecting on the objectives, the limitations noted above, and directions for future work.</w:t>
       </w:r>
     </w:p>
-    <w:bookmarkEnd w:id="53"/>
     <w:bookmarkEnd w:id="54"/>
+    <w:bookmarkEnd w:id="55"/>
     <w:sectPr>
       <w:footnotePr>
         <w:numRestart w:val="eachSect"/>

</xml_diff>